<commit_message>
Assignment 3: Part 3 Use Case Support in Design added by İpek Atak
</commit_message>
<xml_diff>
--- a/Assignment3/Design Document.docx
+++ b/Assignment3/Design Document.docx
@@ -1,6 +1,6 @@
 
 <file path=word/document.xml><?xml version="1.0" encoding="utf-8"?>
-<w:document xmlns:wpc="http://schemas.microsoft.com/office/word/2010/wordprocessingCanvas" xmlns:cx="http://schemas.microsoft.com/office/drawing/2014/chartex" xmlns:mc="http://schemas.openxmlformats.org/markup-compatibility/2006" xmlns:o="urn:schemas-microsoft-com:office:office" xmlns:r="http://schemas.openxmlformats.org/officeDocument/2006/relationships" xmlns:m="http://schemas.openxmlformats.org/officeDocument/2006/math" xmlns:v="urn:schemas-microsoft-com:vml" xmlns:wp14="http://schemas.microsoft.com/office/word/2010/wordprocessingDrawing" xmlns:wp="http://schemas.openxmlformats.org/drawingml/2006/wordprocessingDrawing" xmlns:w10="urn:schemas-microsoft-com:office:word" xmlns:w="http://schemas.openxmlformats.org/wordprocessingml/2006/main" xmlns:w14="http://schemas.microsoft.com/office/word/2010/wordml" xmlns:w15="http://schemas.microsoft.com/office/word/2012/wordml" xmlns:w16se="http://schemas.microsoft.com/office/word/2015/wordml/symex" xmlns:wpg="http://schemas.microsoft.com/office/word/2010/wordprocessingGroup" xmlns:wpi="http://schemas.microsoft.com/office/word/2010/wordprocessingInk" xmlns:wne="http://schemas.microsoft.com/office/word/2006/wordml" xmlns:wps="http://schemas.microsoft.com/office/word/2010/wordprocessingShape" mc:Ignorable="w14 w15 w16se wp14">
+<w:document xmlns:wpc="http://schemas.microsoft.com/office/word/2010/wordprocessingCanvas" xmlns:cx="http://schemas.microsoft.com/office/drawing/2014/chartex" xmlns:cx1="http://schemas.microsoft.com/office/drawing/2015/9/8/chartex" xmlns:cx2="http://schemas.microsoft.com/office/drawing/2015/10/21/chartex" xmlns:cx3="http://schemas.microsoft.com/office/drawing/2016/5/9/chartex" xmlns:cx4="http://schemas.microsoft.com/office/drawing/2016/5/10/chartex" xmlns:cx5="http://schemas.microsoft.com/office/drawing/2016/5/11/chartex" xmlns:cx6="http://schemas.microsoft.com/office/drawing/2016/5/12/chartex" xmlns:cx7="http://schemas.microsoft.com/office/drawing/2016/5/13/chartex" xmlns:cx8="http://schemas.microsoft.com/office/drawing/2016/5/14/chartex" xmlns:mc="http://schemas.openxmlformats.org/markup-compatibility/2006" xmlns:aink="http://schemas.microsoft.com/office/drawing/2016/ink" xmlns:am3d="http://schemas.microsoft.com/office/drawing/2017/model3d" xmlns:o="urn:schemas-microsoft-com:office:office" xmlns:oel="http://schemas.microsoft.com/office/2019/extlst" xmlns:r="http://schemas.openxmlformats.org/officeDocument/2006/relationships" xmlns:m="http://schemas.openxmlformats.org/officeDocument/2006/math" xmlns:v="urn:schemas-microsoft-com:vml" xmlns:wp14="http://schemas.microsoft.com/office/word/2010/wordprocessingDrawing" xmlns:wp="http://schemas.openxmlformats.org/drawingml/2006/wordprocessingDrawing" xmlns:w10="urn:schemas-microsoft-com:office:word" xmlns:w="http://schemas.openxmlformats.org/wordprocessingml/2006/main" xmlns:w14="http://schemas.microsoft.com/office/word/2010/wordml" xmlns:w15="http://schemas.microsoft.com/office/word/2012/wordml" xmlns:w16cex="http://schemas.microsoft.com/office/word/2018/wordml/cex" xmlns:w16cid="http://schemas.microsoft.com/office/word/2016/wordml/cid" xmlns:w16="http://schemas.microsoft.com/office/word/2018/wordml" xmlns:w16du="http://schemas.microsoft.com/office/word/2023/wordml/word16du" xmlns:w16sdtdh="http://schemas.microsoft.com/office/word/2020/wordml/sdtdatahash" xmlns:w16sdtfl="http://schemas.microsoft.com/office/word/2024/wordml/sdtformatlock" xmlns:w16se="http://schemas.microsoft.com/office/word/2015/wordml/symex" xmlns:wpg="http://schemas.microsoft.com/office/word/2010/wordprocessingGroup" xmlns:wpi="http://schemas.microsoft.com/office/word/2010/wordprocessingInk" xmlns:wne="http://schemas.microsoft.com/office/word/2006/wordml" xmlns:wps="http://schemas.microsoft.com/office/word/2010/wordprocessingShape" mc:Ignorable="w14 w15 w16se w16cid w16 w16cex w16sdtdh w16sdtfl w16du wp14">
   <w:body>
     <w:p>
       <w:pPr>
@@ -88,7 +88,7 @@
     </w:p>
     <w:p>
       <w:pPr>
-        <w:pStyle w:val="ListeParagraf"/>
+        <w:pStyle w:val="ListParagraph"/>
         <w:numPr>
           <w:ilvl w:val="0"/>
           <w:numId w:val="1"/>
@@ -100,7 +100,7 @@
     </w:p>
     <w:p>
       <w:pPr>
-        <w:pStyle w:val="ListeParagraf"/>
+        <w:pStyle w:val="ListParagraph"/>
         <w:numPr>
           <w:ilvl w:val="0"/>
           <w:numId w:val="1"/>
@@ -112,7 +112,7 @@
     </w:p>
     <w:p>
       <w:pPr>
-        <w:pStyle w:val="ListeParagraf"/>
+        <w:pStyle w:val="ListParagraph"/>
         <w:numPr>
           <w:ilvl w:val="0"/>
           <w:numId w:val="1"/>
@@ -124,7 +124,7 @@
     </w:p>
     <w:p>
       <w:pPr>
-        <w:pStyle w:val="ListeParagraf"/>
+        <w:pStyle w:val="ListParagraph"/>
         <w:numPr>
           <w:ilvl w:val="0"/>
           <w:numId w:val="1"/>
@@ -136,13 +136,13 @@
     </w:p>
     <w:p>
       <w:pPr>
-        <w:pStyle w:val="ListeParagraf"/>
+        <w:pStyle w:val="ListParagraph"/>
         <w:ind w:left="3552"/>
       </w:pPr>
     </w:p>
     <w:p>
       <w:pPr>
-        <w:pStyle w:val="ListeParagraf"/>
+        <w:pStyle w:val="ListParagraph"/>
         <w:ind w:left="3552"/>
       </w:pPr>
     </w:p>
@@ -168,7 +168,7 @@
     </w:p>
     <w:p>
       <w:pPr>
-        <w:pStyle w:val="ListeParagraf"/>
+        <w:pStyle w:val="ListParagraph"/>
         <w:numPr>
           <w:ilvl w:val="0"/>
           <w:numId w:val="1"/>
@@ -180,7 +180,7 @@
     </w:p>
     <w:p>
       <w:pPr>
-        <w:pStyle w:val="ListeParagraf"/>
+        <w:pStyle w:val="ListParagraph"/>
         <w:numPr>
           <w:ilvl w:val="0"/>
           <w:numId w:val="1"/>
@@ -192,29 +192,24 @@
     </w:p>
     <w:p>
       <w:pPr>
-        <w:pStyle w:val="ListeParagraf"/>
+        <w:pStyle w:val="ListParagraph"/>
         <w:numPr>
           <w:ilvl w:val="0"/>
           <w:numId w:val="1"/>
         </w:numPr>
       </w:pPr>
+      <w:r>
+        <w:t xml:space="preserve">Defne </w:t>
+      </w:r>
       <w:proofErr w:type="spellStart"/>
       <w:r>
-        <w:t>Defne</w:t>
+        <w:t>Saracel</w:t>
       </w:r>
       <w:proofErr w:type="spellEnd"/>
-      <w:r>
-        <w:t xml:space="preserve"> </w:t>
-      </w:r>
-      <w:proofErr w:type="spellStart"/>
-      <w:r>
-        <w:t>Saracel</w:t>
-      </w:r>
-      <w:proofErr w:type="spellEnd"/>
-    </w:p>
-    <w:p>
-      <w:pPr>
-        <w:pStyle w:val="ListeParagraf"/>
+    </w:p>
+    <w:p>
+      <w:pPr>
+        <w:pStyle w:val="ListParagraph"/>
         <w:numPr>
           <w:ilvl w:val="0"/>
           <w:numId w:val="1"/>
@@ -226,7 +221,7 @@
     </w:p>
     <w:p>
       <w:pPr>
-        <w:pStyle w:val="ListeParagraf"/>
+        <w:pStyle w:val="ListParagraph"/>
         <w:ind w:left="3552"/>
       </w:pPr>
     </w:p>
@@ -237,7 +232,7 @@
     </w:p>
     <w:p>
       <w:pPr>
-        <w:pStyle w:val="ListeParagraf"/>
+        <w:pStyle w:val="ListParagraph"/>
         <w:numPr>
           <w:ilvl w:val="0"/>
           <w:numId w:val="5"/>
@@ -274,7 +269,7 @@
     </w:p>
     <w:p>
       <w:pPr>
-        <w:pStyle w:val="ListeParagraf"/>
+        <w:pStyle w:val="ListParagraph"/>
         <w:rPr>
           <w:b/>
           <w:bCs/>
@@ -303,7 +298,7 @@
     </w:p>
     <w:p>
       <w:pPr>
-        <w:pStyle w:val="ListeParagraf"/>
+        <w:pStyle w:val="ListParagraph"/>
         <w:rPr>
           <w:sz w:val="24"/>
           <w:szCs w:val="24"/>
@@ -424,16 +419,16 @@
     </w:p>
     <w:p>
       <w:pPr>
-        <w:pStyle w:val="ListeParagraf"/>
-        <w:rPr>
-          <w:sz w:val="24"/>
-          <w:szCs w:val="24"/>
-        </w:rPr>
-      </w:pPr>
-    </w:p>
-    <w:p>
-      <w:pPr>
-        <w:pStyle w:val="ListeParagraf"/>
+        <w:pStyle w:val="ListParagraph"/>
+        <w:rPr>
+          <w:sz w:val="24"/>
+          <w:szCs w:val="24"/>
+        </w:rPr>
+      </w:pPr>
+    </w:p>
+    <w:p>
+      <w:pPr>
+        <w:pStyle w:val="ListParagraph"/>
         <w:rPr>
           <w:sz w:val="24"/>
           <w:szCs w:val="24"/>
@@ -456,7 +451,7 @@
     </w:p>
     <w:p>
       <w:pPr>
-        <w:pStyle w:val="ListeParagraf"/>
+        <w:pStyle w:val="ListParagraph"/>
         <w:rPr>
           <w:sz w:val="24"/>
           <w:szCs w:val="24"/>
@@ -493,16 +488,16 @@
     </w:p>
     <w:p>
       <w:pPr>
-        <w:pStyle w:val="ListeParagraf"/>
-        <w:rPr>
-          <w:sz w:val="24"/>
-          <w:szCs w:val="24"/>
-        </w:rPr>
-      </w:pPr>
-    </w:p>
-    <w:p>
-      <w:pPr>
-        <w:pStyle w:val="ListeParagraf"/>
+        <w:pStyle w:val="ListParagraph"/>
+        <w:rPr>
+          <w:sz w:val="24"/>
+          <w:szCs w:val="24"/>
+        </w:rPr>
+      </w:pPr>
+    </w:p>
+    <w:p>
+      <w:pPr>
+        <w:pStyle w:val="ListParagraph"/>
         <w:rPr>
           <w:b/>
           <w:bCs/>
@@ -522,7 +517,7 @@
     </w:p>
     <w:p>
       <w:pPr>
-        <w:pStyle w:val="ListeParagraf"/>
+        <w:pStyle w:val="ListParagraph"/>
         <w:rPr>
           <w:sz w:val="24"/>
           <w:szCs w:val="24"/>
@@ -608,7 +603,7 @@
     </w:p>
     <w:p>
       <w:pPr>
-        <w:pStyle w:val="ListeParagraf"/>
+        <w:pStyle w:val="ListParagraph"/>
         <w:numPr>
           <w:ilvl w:val="0"/>
           <w:numId w:val="7"/>
@@ -628,7 +623,7 @@
     </w:p>
     <w:p>
       <w:pPr>
-        <w:pStyle w:val="ListeParagraf"/>
+        <w:pStyle w:val="ListParagraph"/>
         <w:ind w:left="1080"/>
         <w:rPr>
           <w:sz w:val="24"/>
@@ -666,7 +661,7 @@
     </w:p>
     <w:p>
       <w:pPr>
-        <w:pStyle w:val="ListeParagraf"/>
+        <w:pStyle w:val="ListParagraph"/>
         <w:numPr>
           <w:ilvl w:val="0"/>
           <w:numId w:val="7"/>
@@ -686,7 +681,7 @@
     </w:p>
     <w:p>
       <w:pPr>
-        <w:pStyle w:val="ListeParagraf"/>
+        <w:pStyle w:val="ListParagraph"/>
         <w:ind w:left="1080"/>
         <w:rPr>
           <w:sz w:val="24"/>
@@ -745,7 +740,7 @@
     </w:p>
     <w:p>
       <w:pPr>
-        <w:pStyle w:val="ListeParagraf"/>
+        <w:pStyle w:val="ListParagraph"/>
         <w:ind w:left="1080"/>
         <w:rPr>
           <w:sz w:val="24"/>
@@ -755,7 +750,7 @@
     </w:p>
     <w:p>
       <w:pPr>
-        <w:pStyle w:val="ListeParagraf"/>
+        <w:pStyle w:val="ListParagraph"/>
         <w:numPr>
           <w:ilvl w:val="0"/>
           <w:numId w:val="7"/>
@@ -775,7 +770,7 @@
     </w:p>
     <w:p>
       <w:pPr>
-        <w:pStyle w:val="ListeParagraf"/>
+        <w:pStyle w:val="ListParagraph"/>
         <w:ind w:left="1080"/>
         <w:rPr>
           <w:sz w:val="24"/>
@@ -845,115 +840,116 @@
     </w:p>
     <w:p>
       <w:pPr>
-        <w:pStyle w:val="ListeParagraf"/>
-        <w:rPr>
-          <w:b/>
-          <w:bCs/>
-          <w:sz w:val="24"/>
-          <w:szCs w:val="24"/>
-        </w:rPr>
-      </w:pPr>
-    </w:p>
-    <w:p>
-      <w:pPr>
-        <w:pStyle w:val="ListeParagraf"/>
-        <w:rPr>
-          <w:b/>
-          <w:bCs/>
-          <w:sz w:val="24"/>
-          <w:szCs w:val="24"/>
-        </w:rPr>
-      </w:pPr>
-    </w:p>
-    <w:p>
-      <w:pPr>
-        <w:pStyle w:val="ListeParagraf"/>
-        <w:rPr>
-          <w:b/>
-          <w:bCs/>
-          <w:sz w:val="24"/>
-          <w:szCs w:val="24"/>
-        </w:rPr>
-      </w:pPr>
-    </w:p>
-    <w:p>
-      <w:pPr>
-        <w:pStyle w:val="ListeParagraf"/>
-        <w:rPr>
-          <w:b/>
-          <w:bCs/>
-          <w:sz w:val="24"/>
-          <w:szCs w:val="24"/>
-        </w:rPr>
-      </w:pPr>
-    </w:p>
-    <w:p>
-      <w:pPr>
-        <w:pStyle w:val="ListeParagraf"/>
-        <w:rPr>
-          <w:b/>
-          <w:bCs/>
-          <w:sz w:val="24"/>
-          <w:szCs w:val="24"/>
-        </w:rPr>
-      </w:pPr>
-    </w:p>
-    <w:p>
-      <w:pPr>
-        <w:pStyle w:val="ListeParagraf"/>
-        <w:rPr>
-          <w:b/>
-          <w:bCs/>
-          <w:sz w:val="24"/>
-          <w:szCs w:val="24"/>
-        </w:rPr>
-      </w:pPr>
-    </w:p>
-    <w:p>
-      <w:pPr>
-        <w:pStyle w:val="ListeParagraf"/>
-        <w:rPr>
-          <w:b/>
-          <w:bCs/>
-          <w:sz w:val="24"/>
-          <w:szCs w:val="24"/>
-        </w:rPr>
-      </w:pPr>
-    </w:p>
-    <w:p>
-      <w:pPr>
-        <w:pStyle w:val="ListeParagraf"/>
-        <w:rPr>
-          <w:b/>
-          <w:bCs/>
-          <w:sz w:val="24"/>
-          <w:szCs w:val="24"/>
-        </w:rPr>
-      </w:pPr>
-    </w:p>
-    <w:p>
-      <w:pPr>
-        <w:pStyle w:val="ListeParagraf"/>
-        <w:rPr>
-          <w:b/>
-          <w:bCs/>
-          <w:sz w:val="24"/>
-          <w:szCs w:val="24"/>
-        </w:rPr>
-      </w:pPr>
-      <w:r>
-        <w:rPr>
-          <w:b/>
-          <w:bCs/>
-          <w:sz w:val="24"/>
-          <w:szCs w:val="24"/>
-        </w:rPr>
+        <w:pStyle w:val="ListParagraph"/>
+        <w:rPr>
+          <w:b/>
+          <w:bCs/>
+          <w:sz w:val="24"/>
+          <w:szCs w:val="24"/>
+        </w:rPr>
+      </w:pPr>
+    </w:p>
+    <w:p>
+      <w:pPr>
+        <w:pStyle w:val="ListParagraph"/>
+        <w:rPr>
+          <w:b/>
+          <w:bCs/>
+          <w:sz w:val="24"/>
+          <w:szCs w:val="24"/>
+        </w:rPr>
+      </w:pPr>
+    </w:p>
+    <w:p>
+      <w:pPr>
+        <w:pStyle w:val="ListParagraph"/>
+        <w:rPr>
+          <w:b/>
+          <w:bCs/>
+          <w:sz w:val="24"/>
+          <w:szCs w:val="24"/>
+        </w:rPr>
+      </w:pPr>
+    </w:p>
+    <w:p>
+      <w:pPr>
+        <w:pStyle w:val="ListParagraph"/>
+        <w:rPr>
+          <w:b/>
+          <w:bCs/>
+          <w:sz w:val="24"/>
+          <w:szCs w:val="24"/>
+        </w:rPr>
+      </w:pPr>
+    </w:p>
+    <w:p>
+      <w:pPr>
+        <w:pStyle w:val="ListParagraph"/>
+        <w:rPr>
+          <w:b/>
+          <w:bCs/>
+          <w:sz w:val="24"/>
+          <w:szCs w:val="24"/>
+        </w:rPr>
+      </w:pPr>
+    </w:p>
+    <w:p>
+      <w:pPr>
+        <w:pStyle w:val="ListParagraph"/>
+        <w:rPr>
+          <w:b/>
+          <w:bCs/>
+          <w:sz w:val="24"/>
+          <w:szCs w:val="24"/>
+        </w:rPr>
+      </w:pPr>
+    </w:p>
+    <w:p>
+      <w:pPr>
+        <w:pStyle w:val="ListParagraph"/>
+        <w:rPr>
+          <w:b/>
+          <w:bCs/>
+          <w:sz w:val="24"/>
+          <w:szCs w:val="24"/>
+        </w:rPr>
+      </w:pPr>
+    </w:p>
+    <w:p>
+      <w:pPr>
+        <w:pStyle w:val="ListParagraph"/>
+        <w:rPr>
+          <w:b/>
+          <w:bCs/>
+          <w:sz w:val="24"/>
+          <w:szCs w:val="24"/>
+        </w:rPr>
+      </w:pPr>
+    </w:p>
+    <w:p>
+      <w:pPr>
+        <w:pStyle w:val="ListParagraph"/>
+        <w:rPr>
+          <w:b/>
+          <w:bCs/>
+          <w:sz w:val="24"/>
+          <w:szCs w:val="24"/>
+        </w:rPr>
+      </w:pPr>
+      <w:r>
+        <w:rPr>
+          <w:b/>
+          <w:bCs/>
+          <w:sz w:val="24"/>
+          <w:szCs w:val="24"/>
+        </w:rPr>
+        <w:lastRenderedPageBreak/>
         <w:t>Component Diagram:</w:t>
       </w:r>
     </w:p>
     <w:p>
       <w:pPr>
-        <w:pStyle w:val="ListeParagraf"/>
+        <w:pStyle w:val="ListParagraph"/>
         <w:rPr>
           <w:b/>
           <w:bCs/>
@@ -970,7 +966,6 @@
           <w:szCs w:val="24"/>
           <w:lang w:val="en-GB" w:eastAsia="en-GB"/>
         </w:rPr>
-        <w:lastRenderedPageBreak/>
         <w:drawing>
           <wp:inline distT="0" distB="0" distL="0" distR="0" wp14:anchorId="3589A780" wp14:editId="77187B9F">
             <wp:extent cx="1371600" cy="4133850"/>
@@ -1016,18 +1011,18 @@
     </w:p>
     <w:p>
       <w:pPr>
-        <w:pStyle w:val="ListeParagraf"/>
-        <w:rPr>
-          <w:b/>
-          <w:bCs/>
-          <w:sz w:val="24"/>
-          <w:szCs w:val="24"/>
-        </w:rPr>
-      </w:pPr>
-    </w:p>
-    <w:p>
-      <w:pPr>
-        <w:pStyle w:val="ListeParagraf"/>
+        <w:pStyle w:val="ListParagraph"/>
+        <w:rPr>
+          <w:b/>
+          <w:bCs/>
+          <w:sz w:val="24"/>
+          <w:szCs w:val="24"/>
+        </w:rPr>
+      </w:pPr>
+    </w:p>
+    <w:p>
+      <w:pPr>
+        <w:pStyle w:val="ListParagraph"/>
         <w:rPr>
           <w:b/>
           <w:bCs/>
@@ -1047,7 +1042,7 @@
     </w:p>
     <w:p>
       <w:pPr>
-        <w:pStyle w:val="ListeParagraf"/>
+        <w:pStyle w:val="ListParagraph"/>
         <w:rPr>
           <w:b/>
           <w:bCs/>
@@ -1109,18 +1104,18 @@
     </w:p>
     <w:p>
       <w:pPr>
-        <w:pStyle w:val="ListeParagraf"/>
-        <w:rPr>
-          <w:b/>
-          <w:bCs/>
-          <w:sz w:val="24"/>
-          <w:szCs w:val="24"/>
-        </w:rPr>
-      </w:pPr>
-    </w:p>
-    <w:p>
-      <w:pPr>
-        <w:pStyle w:val="ListeParagraf"/>
+        <w:pStyle w:val="ListParagraph"/>
+        <w:rPr>
+          <w:b/>
+          <w:bCs/>
+          <w:sz w:val="24"/>
+          <w:szCs w:val="24"/>
+        </w:rPr>
+      </w:pPr>
+    </w:p>
+    <w:p>
+      <w:pPr>
+        <w:pStyle w:val="ListParagraph"/>
         <w:rPr>
           <w:b/>
           <w:bCs/>
@@ -1140,7 +1135,7 @@
     </w:p>
     <w:p>
       <w:pPr>
-        <w:pStyle w:val="ListeParagraf"/>
+        <w:pStyle w:val="ListParagraph"/>
         <w:numPr>
           <w:ilvl w:val="0"/>
           <w:numId w:val="6"/>
@@ -1160,7 +1155,7 @@
     </w:p>
     <w:p>
       <w:pPr>
-        <w:pStyle w:val="ListeParagraf"/>
+        <w:pStyle w:val="ListParagraph"/>
         <w:numPr>
           <w:ilvl w:val="0"/>
           <w:numId w:val="6"/>
@@ -1180,7 +1175,7 @@
     </w:p>
     <w:p>
       <w:pPr>
-        <w:pStyle w:val="ListeParagraf"/>
+        <w:pStyle w:val="ListParagraph"/>
         <w:numPr>
           <w:ilvl w:val="0"/>
           <w:numId w:val="6"/>
@@ -1209,7 +1204,7 @@
     </w:p>
     <w:p>
       <w:pPr>
-        <w:pStyle w:val="ListeParagraf"/>
+        <w:pStyle w:val="ListParagraph"/>
         <w:numPr>
           <w:ilvl w:val="0"/>
           <w:numId w:val="6"/>
@@ -1229,7 +1224,7 @@
     </w:p>
     <w:p>
       <w:pPr>
-        <w:pStyle w:val="ListeParagraf"/>
+        <w:pStyle w:val="ListParagraph"/>
         <w:numPr>
           <w:ilvl w:val="0"/>
           <w:numId w:val="6"/>
@@ -1270,7 +1265,7 @@
     </w:p>
     <w:p>
       <w:pPr>
-        <w:pStyle w:val="ListeParagraf"/>
+        <w:pStyle w:val="ListParagraph"/>
         <w:numPr>
           <w:ilvl w:val="0"/>
           <w:numId w:val="6"/>
@@ -1290,36 +1285,36 @@
     </w:p>
     <w:p>
       <w:pPr>
-        <w:pStyle w:val="ListeParagraf"/>
-        <w:rPr>
-          <w:sz w:val="24"/>
-          <w:szCs w:val="24"/>
-        </w:rPr>
-      </w:pPr>
-    </w:p>
-    <w:p>
-      <w:pPr>
-        <w:rPr>
-          <w:b/>
-          <w:bCs/>
-          <w:sz w:val="24"/>
-          <w:szCs w:val="24"/>
-        </w:rPr>
-      </w:pPr>
-    </w:p>
-    <w:p>
-      <w:pPr>
-        <w:rPr>
-          <w:b/>
-          <w:bCs/>
-          <w:sz w:val="24"/>
-          <w:szCs w:val="24"/>
-        </w:rPr>
-      </w:pPr>
-    </w:p>
-    <w:p>
-      <w:pPr>
-        <w:pStyle w:val="ListeParagraf"/>
+        <w:pStyle w:val="ListParagraph"/>
+        <w:rPr>
+          <w:sz w:val="24"/>
+          <w:szCs w:val="24"/>
+        </w:rPr>
+      </w:pPr>
+    </w:p>
+    <w:p>
+      <w:pPr>
+        <w:rPr>
+          <w:b/>
+          <w:bCs/>
+          <w:sz w:val="24"/>
+          <w:szCs w:val="24"/>
+        </w:rPr>
+      </w:pPr>
+    </w:p>
+    <w:p>
+      <w:pPr>
+        <w:rPr>
+          <w:b/>
+          <w:bCs/>
+          <w:sz w:val="24"/>
+          <w:szCs w:val="24"/>
+        </w:rPr>
+      </w:pPr>
+    </w:p>
+    <w:p>
+      <w:pPr>
+        <w:pStyle w:val="ListParagraph"/>
         <w:numPr>
           <w:ilvl w:val="0"/>
           <w:numId w:val="5"/>
@@ -1340,13 +1335,12 @@
           <w:szCs w:val="28"/>
           <w:u w:val="single"/>
         </w:rPr>
-        <w:lastRenderedPageBreak/>
         <w:t>Implementation Details</w:t>
       </w:r>
     </w:p>
     <w:p>
       <w:pPr>
-        <w:pStyle w:val="Balk3"/>
+        <w:pStyle w:val="Heading3"/>
         <w:keepNext w:val="0"/>
         <w:keepLines w:val="0"/>
         <w:spacing w:before="280" w:after="0"/>
@@ -1386,23 +1380,7 @@
           <w:sz w:val="20"/>
           <w:lang w:val="en-GB"/>
         </w:rPr>
-        <w:t>“</w:t>
-      </w:r>
-      <w:proofErr w:type="spellStart"/>
-      <w:r>
-        <w:rPr>
-          <w:sz w:val="20"/>
-          <w:lang w:val="en-GB"/>
-        </w:rPr>
-        <w:t>Planeta</w:t>
-      </w:r>
-      <w:proofErr w:type="spellEnd"/>
-      <w:r>
-        <w:rPr>
-          <w:sz w:val="20"/>
-          <w:lang w:val="en-GB"/>
-        </w:rPr>
-        <w:t>” will have three layers (Presentation, Service and Database Layer). The codebase structure:</w:t>
+        <w:t>“Planeta” will have three layers (Presentation, Service and Database Layer). The codebase structure:</w:t>
       </w:r>
     </w:p>
     <w:p>
@@ -1895,25 +1873,7 @@
           <w:sz w:val="20"/>
           <w:lang w:val="en-GB"/>
         </w:rPr>
-        <w:t xml:space="preserve">│   ├── </w:t>
-      </w:r>
-      <w:proofErr w:type="spellStart"/>
-      <w:r>
-        <w:rPr>
-          <w:bCs/>
-          <w:sz w:val="20"/>
-          <w:lang w:val="en-GB"/>
-        </w:rPr>
-        <w:t>auth</w:t>
-      </w:r>
-      <w:proofErr w:type="spellEnd"/>
-      <w:r>
-        <w:rPr>
-          <w:bCs/>
-          <w:sz w:val="20"/>
-          <w:lang w:val="en-GB"/>
-        </w:rPr>
-        <w:t xml:space="preserve">/                      </w:t>
+        <w:t xml:space="preserve">│   ├── auth/                      </w:t>
       </w:r>
     </w:p>
     <w:p>
@@ -2307,25 +2267,7 @@
           <w:sz w:val="20"/>
           <w:lang w:val="en-GB"/>
         </w:rPr>
-        <w:t xml:space="preserve">│   ├── </w:t>
-      </w:r>
-      <w:proofErr w:type="spellStart"/>
-      <w:r>
-        <w:rPr>
-          <w:bCs/>
-          <w:sz w:val="20"/>
-          <w:lang w:val="en-GB"/>
-        </w:rPr>
-        <w:t>auth</w:t>
-      </w:r>
-      <w:proofErr w:type="spellEnd"/>
-      <w:r>
-        <w:rPr>
-          <w:bCs/>
-          <w:sz w:val="20"/>
-          <w:lang w:val="en-GB"/>
-        </w:rPr>
-        <w:t>/</w:t>
+        <w:t>│   ├── auth/</w:t>
       </w:r>
     </w:p>
     <w:p>
@@ -2854,6 +2796,7 @@
           <w:sz w:val="20"/>
           <w:lang w:val="en-GB"/>
         </w:rPr>
+        <w:lastRenderedPageBreak/>
         <w:t>│   │   └──</w:t>
       </w:r>
       <w:r>
@@ -2900,25 +2843,7 @@
           <w:sz w:val="20"/>
           <w:lang w:val="en-GB"/>
         </w:rPr>
-        <w:t xml:space="preserve">└── </w:t>
-      </w:r>
-      <w:proofErr w:type="spellStart"/>
-      <w:r>
-        <w:rPr>
-          <w:bCs/>
-          <w:sz w:val="20"/>
-          <w:lang w:val="en-GB"/>
-        </w:rPr>
-        <w:t>utils</w:t>
-      </w:r>
-      <w:proofErr w:type="spellEnd"/>
-      <w:r>
-        <w:rPr>
-          <w:bCs/>
-          <w:sz w:val="20"/>
-          <w:lang w:val="en-GB"/>
-        </w:rPr>
-        <w:t xml:space="preserve">/         </w:t>
+        <w:t xml:space="preserve">└── utils/         </w:t>
       </w:r>
       <w:r>
         <w:rPr>
@@ -3025,7 +2950,7 @@
     </w:p>
     <w:p>
       <w:pPr>
-        <w:pStyle w:val="ListeParagraf"/>
+        <w:pStyle w:val="ListParagraph"/>
         <w:rPr>
           <w:b/>
           <w:bCs/>
@@ -3039,7 +2964,6 @@
           <w:noProof/>
           <w:lang w:val="en-GB"/>
         </w:rPr>
-        <w:lastRenderedPageBreak/>
         <w:drawing>
           <wp:anchor distT="0" distB="0" distL="114300" distR="114300" simplePos="0" relativeHeight="251659264" behindDoc="1" locked="0" layoutInCell="1" allowOverlap="1" wp14:anchorId="7A04D647" wp14:editId="11512AB2">
             <wp:simplePos x="0" y="0"/>
@@ -3106,7 +3030,7 @@
     </w:p>
     <w:p>
       <w:pPr>
-        <w:pStyle w:val="ListeParagraf"/>
+        <w:pStyle w:val="ListParagraph"/>
         <w:rPr>
           <w:b/>
           <w:bCs/>
@@ -3118,7 +3042,7 @@
     </w:p>
     <w:p>
       <w:pPr>
-        <w:pStyle w:val="ListeParagraf"/>
+        <w:pStyle w:val="ListParagraph"/>
         <w:rPr>
           <w:b/>
           <w:bCs/>
@@ -3130,7 +3054,7 @@
     </w:p>
     <w:p>
       <w:pPr>
-        <w:pStyle w:val="ListeParagraf"/>
+        <w:pStyle w:val="ListParagraph"/>
         <w:rPr>
           <w:b/>
           <w:bCs/>
@@ -3142,7 +3066,7 @@
     </w:p>
     <w:p>
       <w:pPr>
-        <w:pStyle w:val="ListeParagraf"/>
+        <w:pStyle w:val="ListParagraph"/>
         <w:rPr>
           <w:b/>
           <w:bCs/>
@@ -3154,7 +3078,7 @@
     </w:p>
     <w:p>
       <w:pPr>
-        <w:pStyle w:val="ListeParagraf"/>
+        <w:pStyle w:val="ListParagraph"/>
         <w:rPr>
           <w:b/>
           <w:bCs/>
@@ -3166,7 +3090,7 @@
     </w:p>
     <w:p>
       <w:pPr>
-        <w:pStyle w:val="ListeParagraf"/>
+        <w:pStyle w:val="ListParagraph"/>
         <w:rPr>
           <w:b/>
           <w:bCs/>
@@ -3178,7 +3102,7 @@
     </w:p>
     <w:p>
       <w:pPr>
-        <w:pStyle w:val="ListeParagraf"/>
+        <w:pStyle w:val="ListParagraph"/>
         <w:rPr>
           <w:b/>
           <w:bCs/>
@@ -3190,7 +3114,7 @@
     </w:p>
     <w:p>
       <w:pPr>
-        <w:pStyle w:val="ListeParagraf"/>
+        <w:pStyle w:val="ListParagraph"/>
         <w:rPr>
           <w:b/>
           <w:bCs/>
@@ -3202,7 +3126,7 @@
     </w:p>
     <w:p>
       <w:pPr>
-        <w:pStyle w:val="ListeParagraf"/>
+        <w:pStyle w:val="ListParagraph"/>
         <w:rPr>
           <w:b/>
           <w:bCs/>
@@ -3214,7 +3138,7 @@
     </w:p>
     <w:p>
       <w:pPr>
-        <w:pStyle w:val="ListeParagraf"/>
+        <w:pStyle w:val="ListParagraph"/>
         <w:rPr>
           <w:b/>
           <w:bCs/>
@@ -3226,7 +3150,7 @@
     </w:p>
     <w:p>
       <w:pPr>
-        <w:pStyle w:val="ListeParagraf"/>
+        <w:pStyle w:val="ListParagraph"/>
         <w:rPr>
           <w:b/>
           <w:bCs/>
@@ -3238,7 +3162,7 @@
     </w:p>
     <w:p>
       <w:pPr>
-        <w:pStyle w:val="ListeParagraf"/>
+        <w:pStyle w:val="ListParagraph"/>
         <w:rPr>
           <w:b/>
           <w:bCs/>
@@ -3250,7 +3174,7 @@
     </w:p>
     <w:p>
       <w:pPr>
-        <w:pStyle w:val="ListeParagraf"/>
+        <w:pStyle w:val="ListParagraph"/>
         <w:rPr>
           <w:b/>
           <w:bCs/>
@@ -3262,7 +3186,7 @@
     </w:p>
     <w:p>
       <w:pPr>
-        <w:pStyle w:val="ListeParagraf"/>
+        <w:pStyle w:val="ListParagraph"/>
         <w:rPr>
           <w:b/>
           <w:bCs/>
@@ -3274,7 +3198,7 @@
     </w:p>
     <w:p>
       <w:pPr>
-        <w:pStyle w:val="ListeParagraf"/>
+        <w:pStyle w:val="ListParagraph"/>
         <w:rPr>
           <w:b/>
           <w:bCs/>
@@ -3286,7 +3210,7 @@
     </w:p>
     <w:p>
       <w:pPr>
-        <w:pStyle w:val="ListeParagraf"/>
+        <w:pStyle w:val="ListParagraph"/>
         <w:rPr>
           <w:b/>
           <w:bCs/>
@@ -3298,7 +3222,7 @@
     </w:p>
     <w:p>
       <w:pPr>
-        <w:pStyle w:val="ListeParagraf"/>
+        <w:pStyle w:val="ListParagraph"/>
         <w:rPr>
           <w:b/>
           <w:bCs/>
@@ -3310,7 +3234,7 @@
     </w:p>
     <w:p>
       <w:pPr>
-        <w:pStyle w:val="ListeParagraf"/>
+        <w:pStyle w:val="ListParagraph"/>
         <w:rPr>
           <w:b/>
           <w:bCs/>
@@ -3322,7 +3246,7 @@
     </w:p>
     <w:p>
       <w:pPr>
-        <w:pStyle w:val="ListeParagraf"/>
+        <w:pStyle w:val="ListParagraph"/>
         <w:rPr>
           <w:b/>
           <w:bCs/>
@@ -3334,7 +3258,7 @@
     </w:p>
     <w:p>
       <w:pPr>
-        <w:pStyle w:val="ListeParagraf"/>
+        <w:pStyle w:val="ListParagraph"/>
         <w:rPr>
           <w:b/>
           <w:bCs/>
@@ -3346,7 +3270,7 @@
     </w:p>
     <w:p>
       <w:pPr>
-        <w:pStyle w:val="ListeParagraf"/>
+        <w:pStyle w:val="ListParagraph"/>
         <w:rPr>
           <w:b/>
           <w:bCs/>
@@ -3358,7 +3282,7 @@
     </w:p>
     <w:p>
       <w:pPr>
-        <w:pStyle w:val="ListeParagraf"/>
+        <w:pStyle w:val="ListParagraph"/>
         <w:rPr>
           <w:b/>
           <w:bCs/>
@@ -3370,7 +3294,7 @@
     </w:p>
     <w:p>
       <w:pPr>
-        <w:pStyle w:val="ListeParagraf"/>
+        <w:pStyle w:val="ListParagraph"/>
         <w:rPr>
           <w:b/>
           <w:bCs/>
@@ -3382,7 +3306,7 @@
     </w:p>
     <w:p>
       <w:pPr>
-        <w:pStyle w:val="ListeParagraf"/>
+        <w:pStyle w:val="ListParagraph"/>
         <w:rPr>
           <w:b/>
           <w:bCs/>
@@ -3394,7 +3318,7 @@
     </w:p>
     <w:p>
       <w:pPr>
-        <w:pStyle w:val="ListeParagraf"/>
+        <w:pStyle w:val="ListParagraph"/>
         <w:rPr>
           <w:b/>
           <w:bCs/>
@@ -3406,7 +3330,7 @@
     </w:p>
     <w:p>
       <w:pPr>
-        <w:pStyle w:val="ListeParagraf"/>
+        <w:pStyle w:val="ListParagraph"/>
         <w:rPr>
           <w:b/>
           <w:bCs/>
@@ -3418,7 +3342,7 @@
     </w:p>
     <w:p>
       <w:pPr>
-        <w:pStyle w:val="ListeParagraf"/>
+        <w:pStyle w:val="ListParagraph"/>
         <w:rPr>
           <w:b/>
           <w:bCs/>
@@ -3841,38 +3765,17 @@
         </w:rPr>
         <w:br w:type="page"/>
       </w:r>
-    </w:p>
-    <w:p>
-      <w:pPr>
-        <w:rPr>
-          <w:b/>
-        </w:rPr>
-      </w:pPr>
-    </w:p>
-    <w:p>
-      <w:pPr>
-        <w:rPr>
-          <w:b/>
-        </w:rPr>
-      </w:pPr>
-    </w:p>
-    <w:p>
-      <w:pPr>
-        <w:rPr>
-          <w:b/>
-        </w:rPr>
-      </w:pPr>
-    </w:p>
-    <w:p>
-      <w:pPr>
-        <w:rPr>
-          <w:b/>
-        </w:rPr>
-      </w:pPr>
-    </w:p>
-    <w:p>
-      <w:pPr>
-        <w:ind w:left="360"/>
+      <w:r>
+        <w:rPr>
+          <w:b/>
+          <w:bCs/>
+          <w:sz w:val="28"/>
+          <w:szCs w:val="28"/>
+        </w:rPr>
+        <w:lastRenderedPageBreak/>
+        <w:t>3)</w:t>
+      </w:r>
+      <w:r>
         <w:rPr>
           <w:b/>
           <w:bCs/>
@@ -3880,17 +3783,1618 @@
           <w:szCs w:val="28"/>
           <w:u w:val="single"/>
         </w:rPr>
-      </w:pPr>
-      <w:r>
-        <w:rPr>
-          <w:b/>
-          <w:bCs/>
-          <w:sz w:val="28"/>
-          <w:szCs w:val="28"/>
-        </w:rPr>
-        <w:t>3)</w:t>
-      </w:r>
-      <w:r>
+        <w:t>Use Case Support in Design</w:t>
+      </w:r>
+    </w:p>
+    <w:p>
+      <w:r>
+        <w:t xml:space="preserve">3.1 Use Case Selection: </w:t>
+      </w:r>
+    </w:p>
+    <w:p>
+      <w:pPr>
+        <w:pStyle w:val="ListParagraph"/>
+        <w:numPr>
+          <w:ilvl w:val="0"/>
+          <w:numId w:val="9"/>
+        </w:numPr>
+        <w:spacing w:line="278" w:lineRule="auto"/>
+      </w:pPr>
+      <w:r>
+        <w:t xml:space="preserve">UC1 - User </w:t>
+      </w:r>
+      <w:proofErr w:type="gramStart"/>
+      <w:r>
+        <w:t>Registration(</w:t>
+      </w:r>
+      <w:proofErr w:type="gramEnd"/>
+      <w:r>
+        <w:t>Sign Up)</w:t>
+      </w:r>
+    </w:p>
+    <w:p>
+      <w:pPr>
+        <w:pStyle w:val="ListParagraph"/>
+        <w:numPr>
+          <w:ilvl w:val="0"/>
+          <w:numId w:val="9"/>
+        </w:numPr>
+        <w:spacing w:line="278" w:lineRule="auto"/>
+      </w:pPr>
+      <w:r>
+        <w:t xml:space="preserve">UC2 - User </w:t>
+      </w:r>
+      <w:proofErr w:type="gramStart"/>
+      <w:r>
+        <w:t>Login(</w:t>
+      </w:r>
+      <w:proofErr w:type="gramEnd"/>
+      <w:r>
+        <w:t>User Authentication)</w:t>
+      </w:r>
+    </w:p>
+    <w:p>
+      <w:pPr>
+        <w:pStyle w:val="ListParagraph"/>
+        <w:numPr>
+          <w:ilvl w:val="0"/>
+          <w:numId w:val="9"/>
+        </w:numPr>
+        <w:spacing w:line="278" w:lineRule="auto"/>
+      </w:pPr>
+      <w:r>
+        <w:t>UC3 - Daily Survey Submission + Providing Feedback</w:t>
+      </w:r>
+    </w:p>
+    <w:p>
+      <w:pPr>
+        <w:pStyle w:val="ListParagraph"/>
+        <w:numPr>
+          <w:ilvl w:val="0"/>
+          <w:numId w:val="9"/>
+        </w:numPr>
+        <w:spacing w:line="278" w:lineRule="auto"/>
+      </w:pPr>
+      <w:r>
+        <w:t>UC4 - Survey History</w:t>
+      </w:r>
+    </w:p>
+    <w:p>
+      <w:r>
+        <w:t>3.2 Requirement Mapping:</w:t>
+      </w:r>
+    </w:p>
+    <w:tbl>
+      <w:tblPr>
+        <w:tblStyle w:val="TableGrid"/>
+        <w:tblW w:w="0" w:type="auto"/>
+        <w:tblLook w:val="04A0" w:firstRow="1" w:lastRow="0" w:firstColumn="1" w:lastColumn="0" w:noHBand="0" w:noVBand="1"/>
+      </w:tblPr>
+      <w:tblGrid>
+        <w:gridCol w:w="2974"/>
+        <w:gridCol w:w="3016"/>
+        <w:gridCol w:w="3072"/>
+      </w:tblGrid>
+      <w:tr>
+        <w:tc>
+          <w:tcPr>
+            <w:tcW w:w="3116" w:type="dxa"/>
+          </w:tcPr>
+          <w:p/>
+        </w:tc>
+        <w:tc>
+          <w:tcPr>
+            <w:tcW w:w="3117" w:type="dxa"/>
+          </w:tcPr>
+          <w:p>
+            <w:pPr>
+              <w:rPr>
+                <w:b/>
+                <w:bCs/>
+              </w:rPr>
+            </w:pPr>
+            <w:r>
+              <w:rPr>
+                <w:b/>
+                <w:bCs/>
+              </w:rPr>
+              <w:t>Use Case</w:t>
+            </w:r>
+          </w:p>
+        </w:tc>
+        <w:tc>
+          <w:tcPr>
+            <w:tcW w:w="3117" w:type="dxa"/>
+          </w:tcPr>
+          <w:p>
+            <w:pPr>
+              <w:rPr>
+                <w:b/>
+                <w:bCs/>
+              </w:rPr>
+            </w:pPr>
+            <w:r>
+              <w:rPr>
+                <w:b/>
+                <w:bCs/>
+              </w:rPr>
+              <w:t>Requirements</w:t>
+            </w:r>
+          </w:p>
+        </w:tc>
+      </w:tr>
+      <w:tr>
+        <w:tc>
+          <w:tcPr>
+            <w:tcW w:w="3116" w:type="dxa"/>
+          </w:tcPr>
+          <w:p>
+            <w:r>
+              <w:t>UC1</w:t>
+            </w:r>
+          </w:p>
+        </w:tc>
+        <w:tc>
+          <w:tcPr>
+            <w:tcW w:w="3117" w:type="dxa"/>
+          </w:tcPr>
+          <w:p>
+            <w:r>
+              <w:t>User Registration</w:t>
+            </w:r>
+          </w:p>
+        </w:tc>
+        <w:tc>
+          <w:tcPr>
+            <w:tcW w:w="3117" w:type="dxa"/>
+          </w:tcPr>
+          <w:p>
+            <w:pPr>
+              <w:pStyle w:val="ListParagraph"/>
+              <w:numPr>
+                <w:ilvl w:val="0"/>
+                <w:numId w:val="10"/>
+              </w:numPr>
+            </w:pPr>
+            <w:r>
+              <w:t xml:space="preserve">User Account </w:t>
+            </w:r>
+          </w:p>
+          <w:p/>
+        </w:tc>
+      </w:tr>
+      <w:tr>
+        <w:tc>
+          <w:tcPr>
+            <w:tcW w:w="3116" w:type="dxa"/>
+          </w:tcPr>
+          <w:p>
+            <w:r>
+              <w:t>UC2</w:t>
+            </w:r>
+          </w:p>
+        </w:tc>
+        <w:tc>
+          <w:tcPr>
+            <w:tcW w:w="3117" w:type="dxa"/>
+          </w:tcPr>
+          <w:p>
+            <w:r>
+              <w:t>User Login</w:t>
+            </w:r>
+          </w:p>
+        </w:tc>
+        <w:tc>
+          <w:tcPr>
+            <w:tcW w:w="3117" w:type="dxa"/>
+          </w:tcPr>
+          <w:p>
+            <w:pPr>
+              <w:pStyle w:val="ListParagraph"/>
+              <w:numPr>
+                <w:ilvl w:val="0"/>
+                <w:numId w:val="10"/>
+              </w:numPr>
+            </w:pPr>
+            <w:r>
+              <w:t>User Authentication</w:t>
+            </w:r>
+          </w:p>
+          <w:p/>
+        </w:tc>
+      </w:tr>
+      <w:tr>
+        <w:tc>
+          <w:tcPr>
+            <w:tcW w:w="3116" w:type="dxa"/>
+          </w:tcPr>
+          <w:p>
+            <w:r>
+              <w:t>UC3</w:t>
+            </w:r>
+          </w:p>
+        </w:tc>
+        <w:tc>
+          <w:tcPr>
+            <w:tcW w:w="3117" w:type="dxa"/>
+          </w:tcPr>
+          <w:p>
+            <w:r>
+              <w:t>Daily Survey Submission + Providing Feedback</w:t>
+            </w:r>
+          </w:p>
+        </w:tc>
+        <w:tc>
+          <w:tcPr>
+            <w:tcW w:w="3117" w:type="dxa"/>
+          </w:tcPr>
+          <w:p>
+            <w:pPr>
+              <w:pStyle w:val="ListParagraph"/>
+              <w:numPr>
+                <w:ilvl w:val="0"/>
+                <w:numId w:val="10"/>
+              </w:numPr>
+            </w:pPr>
+            <w:r>
+              <w:t>Daily Survey</w:t>
+            </w:r>
+          </w:p>
+          <w:p>
+            <w:pPr>
+              <w:pStyle w:val="ListParagraph"/>
+              <w:numPr>
+                <w:ilvl w:val="0"/>
+                <w:numId w:val="10"/>
+              </w:numPr>
+            </w:pPr>
+            <w:r>
+              <w:t>Feedback System</w:t>
+            </w:r>
+          </w:p>
+        </w:tc>
+      </w:tr>
+      <w:tr>
+        <w:tc>
+          <w:tcPr>
+            <w:tcW w:w="3116" w:type="dxa"/>
+          </w:tcPr>
+          <w:p>
+            <w:r>
+              <w:t>UC4</w:t>
+            </w:r>
+          </w:p>
+        </w:tc>
+        <w:tc>
+          <w:tcPr>
+            <w:tcW w:w="3117" w:type="dxa"/>
+          </w:tcPr>
+          <w:p>
+            <w:r>
+              <w:t>Survey History</w:t>
+            </w:r>
+          </w:p>
+          <w:p/>
+        </w:tc>
+        <w:tc>
+          <w:tcPr>
+            <w:tcW w:w="3117" w:type="dxa"/>
+          </w:tcPr>
+          <w:p>
+            <w:pPr>
+              <w:pStyle w:val="ListParagraph"/>
+              <w:numPr>
+                <w:ilvl w:val="0"/>
+                <w:numId w:val="11"/>
+              </w:numPr>
+            </w:pPr>
+            <w:r>
+              <w:t>Survey History</w:t>
+            </w:r>
+          </w:p>
+        </w:tc>
+      </w:tr>
+    </w:tbl>
+    <w:p>
+      <w:pPr>
+        <w:tabs>
+          <w:tab w:val="left" w:pos="1183"/>
+        </w:tabs>
+      </w:pPr>
+    </w:p>
+    <w:p>
+      <w:r>
+        <w:t>3.3 Use Case Desing:</w:t>
+      </w:r>
+    </w:p>
+    <w:p>
+      <w:r>
+        <w:t xml:space="preserve">The interaction pattern is consistent </w:t>
+      </w:r>
+      <w:proofErr w:type="spellStart"/>
+      <w:r>
+        <w:t>through out</w:t>
+      </w:r>
+      <w:proofErr w:type="spellEnd"/>
+      <w:r>
+        <w:t xml:space="preserve"> all the use cases, </w:t>
+      </w:r>
+    </w:p>
+    <w:p>
+      <w:r>
+        <w:t xml:space="preserve">Flutter UI -&gt; </w:t>
+      </w:r>
+      <w:proofErr w:type="gramStart"/>
+      <w:r>
+        <w:t>Provider(</w:t>
+      </w:r>
+      <w:proofErr w:type="gramEnd"/>
+      <w:r>
+        <w:t>Service Layer</w:t>
+      </w:r>
+      <w:r>
+        <w:t>) -&gt; Firebase Auth/</w:t>
+      </w:r>
+      <w:proofErr w:type="spellStart"/>
+      <w:r>
+        <w:t>Firestore</w:t>
+      </w:r>
+      <w:proofErr w:type="spellEnd"/>
+      <w:r>
+        <w:t xml:space="preserve"> -&gt; Provider updates state -&gt; UI refreshes</w:t>
+      </w:r>
+    </w:p>
+    <w:p>
+      <w:r>
+        <w:rPr>
+          <w:b/>
+          <w:bCs/>
+        </w:rPr>
+        <w:t xml:space="preserve">UC1 - User </w:t>
+      </w:r>
+      <w:proofErr w:type="gramStart"/>
+      <w:r>
+        <w:rPr>
+          <w:b/>
+          <w:bCs/>
+        </w:rPr>
+        <w:t>Registration(</w:t>
+      </w:r>
+      <w:proofErr w:type="gramEnd"/>
+      <w:r>
+        <w:rPr>
+          <w:b/>
+          <w:bCs/>
+        </w:rPr>
+        <w:t xml:space="preserve">Sign Up): </w:t>
+      </w:r>
+      <w:r>
+        <w:t>Create a new user account</w:t>
+      </w:r>
+    </w:p>
+    <w:p>
+      <w:r>
+        <w:t xml:space="preserve">System Architecture Support: </w:t>
+      </w:r>
+    </w:p>
+    <w:p>
+      <w:pPr>
+        <w:pStyle w:val="NormalWeb"/>
+        <w:numPr>
+          <w:ilvl w:val="0"/>
+          <w:numId w:val="11"/>
+        </w:numPr>
+        <w:rPr>
+          <w:rFonts w:asciiTheme="minorHAnsi" w:hAnsiTheme="minorHAnsi"/>
+          <w:lang w:val="en-US"/>
+        </w:rPr>
+      </w:pPr>
+      <w:r>
+        <w:rPr>
+          <w:rStyle w:val="Strong"/>
+          <w:rFonts w:asciiTheme="minorHAnsi" w:eastAsiaTheme="majorEastAsia" w:hAnsiTheme="minorHAnsi"/>
+          <w:lang w:val="en-US"/>
+        </w:rPr>
+        <w:t>Flutter UI (Register Screen)</w:t>
+      </w:r>
+      <w:r>
+        <w:rPr>
+          <w:rStyle w:val="apple-converted-space"/>
+          <w:rFonts w:asciiTheme="minorHAnsi" w:eastAsiaTheme="majorEastAsia" w:hAnsiTheme="minorHAnsi"/>
+          <w:lang w:val="en-US"/>
+        </w:rPr>
+        <w:t> </w:t>
+      </w:r>
+      <w:r>
+        <w:rPr>
+          <w:rFonts w:asciiTheme="minorHAnsi" w:hAnsiTheme="minorHAnsi"/>
+          <w:lang w:val="en-US"/>
+        </w:rPr>
+        <w:t>takes email/username/password.</w:t>
+      </w:r>
+    </w:p>
+    <w:p>
+      <w:pPr>
+        <w:pStyle w:val="NormalWeb"/>
+        <w:numPr>
+          <w:ilvl w:val="0"/>
+          <w:numId w:val="11"/>
+        </w:numPr>
+        <w:rPr>
+          <w:rFonts w:asciiTheme="minorHAnsi" w:hAnsiTheme="minorHAnsi"/>
+          <w:lang w:val="en-US"/>
+        </w:rPr>
+      </w:pPr>
+      <w:r>
+        <w:rPr>
+          <w:rStyle w:val="Strong"/>
+          <w:rFonts w:asciiTheme="minorHAnsi" w:eastAsiaTheme="majorEastAsia" w:hAnsiTheme="minorHAnsi"/>
+          <w:lang w:val="en-US"/>
+        </w:rPr>
+        <w:t>Auth layer (Firebase Auth)</w:t>
+      </w:r>
+      <w:r>
+        <w:rPr>
+          <w:rStyle w:val="apple-converted-space"/>
+          <w:rFonts w:asciiTheme="minorHAnsi" w:eastAsiaTheme="majorEastAsia" w:hAnsiTheme="minorHAnsi"/>
+          <w:lang w:val="en-US"/>
+        </w:rPr>
+        <w:t> </w:t>
+      </w:r>
+      <w:r>
+        <w:rPr>
+          <w:rFonts w:asciiTheme="minorHAnsi" w:hAnsiTheme="minorHAnsi"/>
+          <w:lang w:val="en-US"/>
+        </w:rPr>
+        <w:t>creates the user credentials.</w:t>
+      </w:r>
+    </w:p>
+    <w:p>
+      <w:pPr>
+        <w:pStyle w:val="NormalWeb"/>
+        <w:numPr>
+          <w:ilvl w:val="0"/>
+          <w:numId w:val="11"/>
+        </w:numPr>
+        <w:rPr>
+          <w:rFonts w:asciiTheme="minorHAnsi" w:hAnsiTheme="minorHAnsi"/>
+          <w:lang w:val="en-US"/>
+        </w:rPr>
+      </w:pPr>
+      <w:r>
+        <w:rPr>
+          <w:rStyle w:val="Strong"/>
+          <w:rFonts w:asciiTheme="minorHAnsi" w:eastAsiaTheme="majorEastAsia" w:hAnsiTheme="minorHAnsi"/>
+          <w:lang w:val="en-US"/>
+        </w:rPr>
+        <w:t>Data layer (</w:t>
+      </w:r>
+      <w:proofErr w:type="spellStart"/>
+      <w:r>
+        <w:rPr>
+          <w:rStyle w:val="Strong"/>
+          <w:rFonts w:asciiTheme="minorHAnsi" w:eastAsiaTheme="majorEastAsia" w:hAnsiTheme="minorHAnsi"/>
+          <w:lang w:val="en-US"/>
+        </w:rPr>
+        <w:t>Firestore</w:t>
+      </w:r>
+      <w:proofErr w:type="spellEnd"/>
+      <w:r>
+        <w:rPr>
+          <w:rStyle w:val="Strong"/>
+          <w:rFonts w:asciiTheme="minorHAnsi" w:eastAsiaTheme="majorEastAsia" w:hAnsiTheme="minorHAnsi"/>
+          <w:lang w:val="en-US"/>
+        </w:rPr>
+        <w:t>)</w:t>
+      </w:r>
+      <w:r>
+        <w:rPr>
+          <w:rStyle w:val="apple-converted-space"/>
+          <w:rFonts w:asciiTheme="minorHAnsi" w:eastAsiaTheme="majorEastAsia" w:hAnsiTheme="minorHAnsi"/>
+          <w:lang w:val="en-US"/>
+        </w:rPr>
+        <w:t> </w:t>
+      </w:r>
+      <w:r>
+        <w:rPr>
+          <w:rFonts w:asciiTheme="minorHAnsi" w:hAnsiTheme="minorHAnsi"/>
+          <w:lang w:val="en-US"/>
+        </w:rPr>
+        <w:t xml:space="preserve">stores user profile document (username, email, </w:t>
+      </w:r>
+      <w:proofErr w:type="spellStart"/>
+      <w:r>
+        <w:rPr>
+          <w:rFonts w:asciiTheme="minorHAnsi" w:hAnsiTheme="minorHAnsi"/>
+          <w:lang w:val="en-US"/>
+        </w:rPr>
+        <w:t>createdAt</w:t>
+      </w:r>
+      <w:proofErr w:type="spellEnd"/>
+      <w:r>
+        <w:rPr>
+          <w:rFonts w:asciiTheme="minorHAnsi" w:hAnsiTheme="minorHAnsi"/>
+          <w:lang w:val="en-US"/>
+        </w:rPr>
+        <w:t>).</w:t>
+      </w:r>
+    </w:p>
+    <w:p>
+      <w:pPr>
+        <w:pStyle w:val="NormalWeb"/>
+        <w:rPr>
+          <w:rFonts w:asciiTheme="minorHAnsi" w:hAnsiTheme="minorHAnsi"/>
+          <w:lang w:val="en-US"/>
+        </w:rPr>
+      </w:pPr>
+      <w:r>
+        <w:rPr>
+          <w:rFonts w:asciiTheme="minorHAnsi" w:hAnsiTheme="minorHAnsi"/>
+          <w:lang w:val="en-US"/>
+        </w:rPr>
+        <w:t>Data Flow / Interactions:</w:t>
+      </w:r>
+      <w:r>
+        <w:rPr>
+          <w:rFonts w:asciiTheme="minorHAnsi" w:hAnsiTheme="minorHAnsi"/>
+          <w:noProof/>
+          <w:lang w:val="en-US"/>
+          <w14:ligatures w14:val="standardContextual"/>
+        </w:rPr>
+        <w:t xml:space="preserve"> </w:t>
+      </w:r>
+      <w:r>
+        <w:rPr>
+          <w:rFonts w:asciiTheme="minorHAnsi" w:hAnsiTheme="minorHAnsi"/>
+          <w:noProof/>
+          <w:lang w:val="en-US"/>
+          <w14:ligatures w14:val="standardContextual"/>
+        </w:rPr>
+        <w:drawing>
+          <wp:inline distT="0" distB="0" distL="0" distR="0" wp14:anchorId="3A4919E2" wp14:editId="09B1FE74">
+            <wp:extent cx="5760720" cy="1219229"/>
+            <wp:effectExtent l="0" t="0" r="5080" b="0"/>
+            <wp:docPr id="1607334612" name="Picture 1"/>
+            <wp:cNvGraphicFramePr>
+              <a:graphicFrameLocks xmlns:a="http://schemas.openxmlformats.org/drawingml/2006/main" noChangeAspect="1"/>
+            </wp:cNvGraphicFramePr>
+            <a:graphic xmlns:a="http://schemas.openxmlformats.org/drawingml/2006/main">
+              <a:graphicData uri="http://schemas.openxmlformats.org/drawingml/2006/picture">
+                <pic:pic xmlns:pic="http://schemas.openxmlformats.org/drawingml/2006/picture">
+                  <pic:nvPicPr>
+                    <pic:cNvPr id="1607334612" name="Picture 1607334612"/>
+                    <pic:cNvPicPr/>
+                  </pic:nvPicPr>
+                  <pic:blipFill>
+                    <a:blip r:embed="rId13"/>
+                    <a:stretch>
+                      <a:fillRect/>
+                    </a:stretch>
+                  </pic:blipFill>
+                  <pic:spPr>
+                    <a:xfrm>
+                      <a:off x="0" y="0"/>
+                      <a:ext cx="5760720" cy="1219229"/>
+                    </a:xfrm>
+                    <a:prstGeom prst="rect">
+                      <a:avLst/>
+                    </a:prstGeom>
+                  </pic:spPr>
+                </pic:pic>
+              </a:graphicData>
+            </a:graphic>
+          </wp:inline>
+        </w:drawing>
+      </w:r>
+      <w:r>
+        <w:rPr>
+          <w:rFonts w:asciiTheme="minorHAnsi" w:hAnsiTheme="minorHAnsi"/>
+          <w:lang w:val="en-US"/>
+        </w:rPr>
+        <w:t xml:space="preserve"> </w:t>
+      </w:r>
+      <w:r>
+        <w:rPr>
+          <w:rFonts w:asciiTheme="minorHAnsi" w:hAnsiTheme="minorHAnsi"/>
+          <w:lang w:val="en-US"/>
+        </w:rPr>
+        <w:t>State Changes:</w:t>
+      </w:r>
+    </w:p>
+    <w:p>
+      <w:pPr>
+        <w:pStyle w:val="NormalWeb"/>
+        <w:numPr>
+          <w:ilvl w:val="0"/>
+          <w:numId w:val="12"/>
+        </w:numPr>
+        <w:rPr>
+          <w:rFonts w:asciiTheme="minorHAnsi" w:hAnsiTheme="minorHAnsi"/>
+          <w:lang w:val="en-US"/>
+        </w:rPr>
+      </w:pPr>
+      <w:r>
+        <w:rPr>
+          <w:rFonts w:asciiTheme="minorHAnsi" w:hAnsiTheme="minorHAnsi"/>
+          <w:lang w:val="en-US"/>
+        </w:rPr>
+        <w:t xml:space="preserve">App State: unauthenticated -&gt; authenticated </w:t>
+      </w:r>
+    </w:p>
+    <w:p>
+      <w:pPr>
+        <w:pStyle w:val="NormalWeb"/>
+        <w:numPr>
+          <w:ilvl w:val="0"/>
+          <w:numId w:val="12"/>
+        </w:numPr>
+        <w:rPr>
+          <w:rFonts w:asciiTheme="minorHAnsi" w:hAnsiTheme="minorHAnsi"/>
+          <w:lang w:val="en-US"/>
+        </w:rPr>
+      </w:pPr>
+      <w:r>
+        <w:rPr>
+          <w:rFonts w:asciiTheme="minorHAnsi" w:hAnsiTheme="minorHAnsi"/>
+          <w:lang w:val="en-US"/>
+        </w:rPr>
+        <w:t>Database State</w:t>
+      </w:r>
+      <w:r>
+        <w:rPr>
+          <w:rFonts w:asciiTheme="minorHAnsi" w:hAnsiTheme="minorHAnsi"/>
+          <w:lang w:val="en-US"/>
+        </w:rPr>
+        <w:t xml:space="preserve">: new document created in </w:t>
+      </w:r>
+      <w:proofErr w:type="gramStart"/>
+      <w:r>
+        <w:rPr>
+          <w:rFonts w:asciiTheme="minorHAnsi" w:hAnsiTheme="minorHAnsi"/>
+          <w:lang w:val="en-US"/>
+        </w:rPr>
+        <w:t>users</w:t>
+      </w:r>
+      <w:proofErr w:type="gramEnd"/>
+      <w:r>
+        <w:rPr>
+          <w:rFonts w:asciiTheme="minorHAnsi" w:hAnsiTheme="minorHAnsi"/>
+          <w:lang w:val="en-US"/>
+        </w:rPr>
+        <w:t xml:space="preserve"> collection for that </w:t>
+      </w:r>
+      <w:proofErr w:type="spellStart"/>
+      <w:r>
+        <w:rPr>
+          <w:rFonts w:asciiTheme="minorHAnsi" w:hAnsiTheme="minorHAnsi"/>
+          <w:lang w:val="en-US"/>
+        </w:rPr>
+        <w:t>uid</w:t>
+      </w:r>
+      <w:proofErr w:type="spellEnd"/>
+      <w:r>
+        <w:rPr>
+          <w:rFonts w:asciiTheme="minorHAnsi" w:hAnsiTheme="minorHAnsi"/>
+          <w:lang w:val="en-US"/>
+        </w:rPr>
+        <w:t>.</w:t>
+      </w:r>
+    </w:p>
+    <w:p>
+      <w:r>
+        <w:rPr>
+          <w:b/>
+          <w:bCs/>
+        </w:rPr>
+        <w:t xml:space="preserve">UC2 - User </w:t>
+      </w:r>
+      <w:proofErr w:type="gramStart"/>
+      <w:r>
+        <w:rPr>
+          <w:b/>
+          <w:bCs/>
+        </w:rPr>
+        <w:t>Login(</w:t>
+      </w:r>
+      <w:proofErr w:type="gramEnd"/>
+      <w:r>
+        <w:rPr>
+          <w:b/>
+          <w:bCs/>
+        </w:rPr>
+        <w:t xml:space="preserve">User Authentication): </w:t>
+      </w:r>
+      <w:r>
+        <w:t>Login with existing credentials</w:t>
+      </w:r>
+    </w:p>
+    <w:p>
+      <w:r>
+        <w:lastRenderedPageBreak/>
+        <w:t xml:space="preserve">System Architecture Support: </w:t>
+      </w:r>
+    </w:p>
+    <w:p>
+      <w:pPr>
+        <w:pStyle w:val="NormalWeb"/>
+        <w:numPr>
+          <w:ilvl w:val="0"/>
+          <w:numId w:val="11"/>
+        </w:numPr>
+        <w:rPr>
+          <w:rFonts w:asciiTheme="minorHAnsi" w:hAnsiTheme="minorHAnsi"/>
+          <w:lang w:val="en-US"/>
+        </w:rPr>
+      </w:pPr>
+      <w:r>
+        <w:rPr>
+          <w:rStyle w:val="Strong"/>
+          <w:rFonts w:asciiTheme="minorHAnsi" w:eastAsiaTheme="majorEastAsia" w:hAnsiTheme="minorHAnsi"/>
+          <w:lang w:val="en-US"/>
+        </w:rPr>
+        <w:t>Flutter UI (Login Screen)</w:t>
+      </w:r>
+      <w:r>
+        <w:rPr>
+          <w:rStyle w:val="apple-converted-space"/>
+          <w:rFonts w:asciiTheme="minorHAnsi" w:eastAsiaTheme="majorEastAsia" w:hAnsiTheme="minorHAnsi"/>
+          <w:lang w:val="en-US"/>
+        </w:rPr>
+        <w:t> </w:t>
+      </w:r>
+      <w:r>
+        <w:rPr>
+          <w:rFonts w:asciiTheme="minorHAnsi" w:hAnsiTheme="minorHAnsi"/>
+          <w:lang w:val="en-US"/>
+        </w:rPr>
+        <w:t>takes credentials.</w:t>
+      </w:r>
+    </w:p>
+    <w:p>
+      <w:pPr>
+        <w:pStyle w:val="NormalWeb"/>
+        <w:numPr>
+          <w:ilvl w:val="0"/>
+          <w:numId w:val="11"/>
+        </w:numPr>
+        <w:rPr>
+          <w:rFonts w:asciiTheme="minorHAnsi" w:hAnsiTheme="minorHAnsi"/>
+          <w:lang w:val="en-US"/>
+        </w:rPr>
+      </w:pPr>
+      <w:r>
+        <w:rPr>
+          <w:rStyle w:val="Strong"/>
+          <w:rFonts w:asciiTheme="minorHAnsi" w:eastAsiaTheme="majorEastAsia" w:hAnsiTheme="minorHAnsi"/>
+          <w:lang w:val="en-US"/>
+        </w:rPr>
+        <w:t>Firebase Auth</w:t>
+      </w:r>
+      <w:r>
+        <w:rPr>
+          <w:rStyle w:val="apple-converted-space"/>
+          <w:rFonts w:asciiTheme="minorHAnsi" w:eastAsiaTheme="majorEastAsia" w:hAnsiTheme="minorHAnsi"/>
+          <w:lang w:val="en-US"/>
+        </w:rPr>
+        <w:t> </w:t>
+      </w:r>
+      <w:r>
+        <w:rPr>
+          <w:rFonts w:asciiTheme="minorHAnsi" w:hAnsiTheme="minorHAnsi"/>
+          <w:lang w:val="en-US"/>
+        </w:rPr>
+        <w:t xml:space="preserve">verifies username/email and </w:t>
+      </w:r>
+      <w:proofErr w:type="spellStart"/>
+      <w:r>
+        <w:rPr>
+          <w:rFonts w:asciiTheme="minorHAnsi" w:hAnsiTheme="minorHAnsi"/>
+          <w:lang w:val="en-US"/>
+        </w:rPr>
+        <w:t>pasword</w:t>
+      </w:r>
+      <w:proofErr w:type="spellEnd"/>
+      <w:r>
+        <w:rPr>
+          <w:rFonts w:asciiTheme="minorHAnsi" w:hAnsiTheme="minorHAnsi"/>
+          <w:lang w:val="en-US"/>
+        </w:rPr>
+        <w:t>.</w:t>
+      </w:r>
+    </w:p>
+    <w:p>
+      <w:pPr>
+        <w:pStyle w:val="NormalWeb"/>
+        <w:numPr>
+          <w:ilvl w:val="0"/>
+          <w:numId w:val="11"/>
+        </w:numPr>
+        <w:rPr>
+          <w:rFonts w:asciiTheme="minorHAnsi" w:hAnsiTheme="minorHAnsi"/>
+          <w:lang w:val="en-US"/>
+        </w:rPr>
+      </w:pPr>
+      <w:r>
+        <w:rPr>
+          <w:rStyle w:val="Strong"/>
+          <w:rFonts w:asciiTheme="minorHAnsi" w:eastAsiaTheme="majorEastAsia" w:hAnsiTheme="minorHAnsi"/>
+          <w:lang w:val="en-US"/>
+        </w:rPr>
+        <w:t xml:space="preserve">Provider </w:t>
+      </w:r>
+      <w:r>
+        <w:rPr>
+          <w:rStyle w:val="Strong"/>
+          <w:rFonts w:asciiTheme="minorHAnsi" w:eastAsiaTheme="majorEastAsia" w:hAnsiTheme="minorHAnsi"/>
+          <w:b w:val="0"/>
+          <w:bCs w:val="0"/>
+          <w:lang w:val="en-US"/>
+        </w:rPr>
+        <w:t>updates app authentication state and current user data.</w:t>
+      </w:r>
+    </w:p>
+    <w:p>
+      <w:pPr>
+        <w:pStyle w:val="NormalWeb"/>
+        <w:rPr>
+          <w:rFonts w:asciiTheme="minorHAnsi" w:hAnsiTheme="minorHAnsi"/>
+          <w:lang w:val="en-US"/>
+        </w:rPr>
+      </w:pPr>
+      <w:r>
+        <w:rPr>
+          <w:rFonts w:asciiTheme="minorHAnsi" w:hAnsiTheme="minorHAnsi"/>
+          <w:lang w:val="en-US"/>
+        </w:rPr>
+        <w:t>Data Flow / Interactions:</w:t>
+      </w:r>
+      <w:r>
+        <w:rPr>
+          <w:rFonts w:asciiTheme="minorHAnsi" w:hAnsiTheme="minorHAnsi"/>
+          <w:noProof/>
+          <w:lang w:val="en-US"/>
+          <w14:ligatures w14:val="standardContextual"/>
+        </w:rPr>
+        <w:t xml:space="preserve"> </w:t>
+      </w:r>
+      <w:r>
+        <w:rPr>
+          <w:rFonts w:asciiTheme="minorHAnsi" w:hAnsiTheme="minorHAnsi"/>
+          <w:noProof/>
+          <w:lang w:val="en-US"/>
+          <w14:ligatures w14:val="standardContextual"/>
+        </w:rPr>
+        <w:drawing>
+          <wp:inline distT="0" distB="0" distL="0" distR="0" wp14:anchorId="45ECCEA9" wp14:editId="23774DCA">
+            <wp:extent cx="5760720" cy="2149807"/>
+            <wp:effectExtent l="0" t="0" r="5080" b="0"/>
+            <wp:docPr id="604600663" name="Picture 1"/>
+            <wp:cNvGraphicFramePr>
+              <a:graphicFrameLocks xmlns:a="http://schemas.openxmlformats.org/drawingml/2006/main" noChangeAspect="1"/>
+            </wp:cNvGraphicFramePr>
+            <a:graphic xmlns:a="http://schemas.openxmlformats.org/drawingml/2006/main">
+              <a:graphicData uri="http://schemas.openxmlformats.org/drawingml/2006/picture">
+                <pic:pic xmlns:pic="http://schemas.openxmlformats.org/drawingml/2006/picture">
+                  <pic:nvPicPr>
+                    <pic:cNvPr id="604600663" name="Picture 604600663"/>
+                    <pic:cNvPicPr/>
+                  </pic:nvPicPr>
+                  <pic:blipFill>
+                    <a:blip r:embed="rId14"/>
+                    <a:stretch>
+                      <a:fillRect/>
+                    </a:stretch>
+                  </pic:blipFill>
+                  <pic:spPr>
+                    <a:xfrm>
+                      <a:off x="0" y="0"/>
+                      <a:ext cx="5760720" cy="2149807"/>
+                    </a:xfrm>
+                    <a:prstGeom prst="rect">
+                      <a:avLst/>
+                    </a:prstGeom>
+                  </pic:spPr>
+                </pic:pic>
+              </a:graphicData>
+            </a:graphic>
+          </wp:inline>
+        </w:drawing>
+      </w:r>
+      <w:r>
+        <w:rPr>
+          <w:rFonts w:asciiTheme="minorHAnsi" w:hAnsiTheme="minorHAnsi"/>
+          <w:lang w:val="en-US"/>
+        </w:rPr>
+        <w:t xml:space="preserve"> </w:t>
+      </w:r>
+      <w:r>
+        <w:rPr>
+          <w:rFonts w:asciiTheme="minorHAnsi" w:hAnsiTheme="minorHAnsi"/>
+          <w:lang w:val="en-US"/>
+        </w:rPr>
+        <w:t>State Changes:</w:t>
+      </w:r>
+    </w:p>
+    <w:p>
+      <w:pPr>
+        <w:pStyle w:val="NormalWeb"/>
+        <w:numPr>
+          <w:ilvl w:val="0"/>
+          <w:numId w:val="12"/>
+        </w:numPr>
+        <w:rPr>
+          <w:rFonts w:asciiTheme="minorHAnsi" w:hAnsiTheme="minorHAnsi"/>
+          <w:lang w:val="en-US"/>
+        </w:rPr>
+      </w:pPr>
+      <w:r>
+        <w:rPr>
+          <w:rFonts w:asciiTheme="minorHAnsi" w:hAnsiTheme="minorHAnsi"/>
+          <w:lang w:val="en-US"/>
+        </w:rPr>
+        <w:t xml:space="preserve">App State: unauthenticated -&gt; authenticated </w:t>
+      </w:r>
+    </w:p>
+    <w:p>
+      <w:pPr>
+        <w:pStyle w:val="NormalWeb"/>
+        <w:numPr>
+          <w:ilvl w:val="0"/>
+          <w:numId w:val="12"/>
+        </w:numPr>
+        <w:rPr>
+          <w:rFonts w:asciiTheme="minorHAnsi" w:hAnsiTheme="minorHAnsi"/>
+          <w:lang w:val="en-US"/>
+        </w:rPr>
+      </w:pPr>
+      <w:r>
+        <w:rPr>
+          <w:rFonts w:asciiTheme="minorHAnsi" w:hAnsiTheme="minorHAnsi"/>
+          <w:lang w:val="en-US"/>
+        </w:rPr>
+        <w:t xml:space="preserve">Local State: Provider stores </w:t>
+      </w:r>
+      <w:proofErr w:type="spellStart"/>
+      <w:r>
+        <w:rPr>
+          <w:rFonts w:asciiTheme="minorHAnsi" w:hAnsiTheme="minorHAnsi"/>
+          <w:lang w:val="en-US"/>
+        </w:rPr>
+        <w:t>c</w:t>
+      </w:r>
+      <w:r>
+        <w:rPr>
+          <w:rFonts w:asciiTheme="minorHAnsi" w:hAnsiTheme="minorHAnsi"/>
+          <w:i/>
+          <w:iCs/>
+          <w:lang w:val="en-US"/>
+        </w:rPr>
+        <w:t>urrentUser</w:t>
+      </w:r>
+      <w:r>
+        <w:rPr>
+          <w:rFonts w:asciiTheme="minorHAnsi" w:hAnsiTheme="minorHAnsi"/>
+          <w:lang w:val="en-US"/>
+        </w:rPr>
+        <w:t>information</w:t>
+      </w:r>
+      <w:proofErr w:type="spellEnd"/>
+      <w:r>
+        <w:rPr>
+          <w:b/>
+          <w:bCs/>
+          <w:lang w:val="en-US"/>
+        </w:rPr>
+        <w:t xml:space="preserve"> </w:t>
+      </w:r>
+    </w:p>
+    <w:p>
+      <w:pPr>
+        <w:pStyle w:val="NormalWeb"/>
+        <w:ind w:left="720"/>
+        <w:rPr>
+          <w:rFonts w:asciiTheme="minorHAnsi" w:hAnsiTheme="minorHAnsi"/>
+          <w:lang w:val="en-US"/>
+        </w:rPr>
+      </w:pPr>
+    </w:p>
+    <w:p>
+      <w:pPr>
+        <w:pStyle w:val="NormalWeb"/>
+        <w:rPr>
+          <w:rFonts w:asciiTheme="minorHAnsi" w:hAnsiTheme="minorHAnsi"/>
+          <w:lang w:val="en-US"/>
+        </w:rPr>
+      </w:pPr>
+      <w:r>
+        <w:rPr>
+          <w:rFonts w:asciiTheme="minorHAnsi" w:hAnsiTheme="minorHAnsi"/>
+          <w:b/>
+          <w:bCs/>
+          <w:lang w:val="en-US"/>
+        </w:rPr>
+        <w:t xml:space="preserve">UC3 – Daily Survey Submission and Providing Feedback: </w:t>
+      </w:r>
+      <w:r>
+        <w:rPr>
+          <w:rFonts w:asciiTheme="minorHAnsi" w:hAnsiTheme="minorHAnsi"/>
+          <w:lang w:val="en-US"/>
+        </w:rPr>
+        <w:t>Submit answers, compute score, show feedback, store result</w:t>
+      </w:r>
+    </w:p>
+    <w:p>
+      <w:r>
+        <w:t xml:space="preserve">System Architecture Support: </w:t>
+      </w:r>
+    </w:p>
+    <w:p>
+      <w:pPr>
+        <w:pStyle w:val="NormalWeb"/>
+        <w:numPr>
+          <w:ilvl w:val="0"/>
+          <w:numId w:val="11"/>
+        </w:numPr>
+        <w:rPr>
+          <w:rFonts w:asciiTheme="minorHAnsi" w:hAnsiTheme="minorHAnsi"/>
+          <w:lang w:val="en-US"/>
+        </w:rPr>
+      </w:pPr>
+      <w:r>
+        <w:rPr>
+          <w:rStyle w:val="Strong"/>
+          <w:rFonts w:asciiTheme="minorHAnsi" w:eastAsiaTheme="majorEastAsia" w:hAnsiTheme="minorHAnsi"/>
+          <w:lang w:val="en-US"/>
+        </w:rPr>
+        <w:t>Flutter UI (Daily Survey Screen)</w:t>
+      </w:r>
+      <w:r>
+        <w:rPr>
+          <w:rStyle w:val="apple-converted-space"/>
+          <w:rFonts w:asciiTheme="minorHAnsi" w:eastAsiaTheme="majorEastAsia" w:hAnsiTheme="minorHAnsi"/>
+          <w:lang w:val="en-US"/>
+        </w:rPr>
+        <w:t> </w:t>
+      </w:r>
+      <w:r>
+        <w:rPr>
+          <w:rFonts w:asciiTheme="minorHAnsi" w:hAnsiTheme="minorHAnsi"/>
+          <w:lang w:val="en-US"/>
+        </w:rPr>
+        <w:t>collects answers.</w:t>
+      </w:r>
+    </w:p>
+    <w:p>
+      <w:pPr>
+        <w:pStyle w:val="NormalWeb"/>
+        <w:numPr>
+          <w:ilvl w:val="0"/>
+          <w:numId w:val="11"/>
+        </w:numPr>
+        <w:rPr>
+          <w:rFonts w:asciiTheme="minorHAnsi" w:hAnsiTheme="minorHAnsi"/>
+          <w:lang w:val="en-US"/>
+        </w:rPr>
+      </w:pPr>
+      <w:r>
+        <w:rPr>
+          <w:rStyle w:val="Strong"/>
+          <w:rFonts w:asciiTheme="minorHAnsi" w:eastAsiaTheme="majorEastAsia" w:hAnsiTheme="minorHAnsi"/>
+          <w:lang w:val="en-US"/>
+        </w:rPr>
+        <w:t xml:space="preserve">Local Logic </w:t>
+      </w:r>
+      <w:r>
+        <w:rPr>
+          <w:rStyle w:val="Strong"/>
+          <w:rFonts w:asciiTheme="minorHAnsi" w:eastAsiaTheme="majorEastAsia" w:hAnsiTheme="minorHAnsi"/>
+          <w:b w:val="0"/>
+          <w:bCs w:val="0"/>
+          <w:lang w:val="en-US"/>
+        </w:rPr>
+        <w:t xml:space="preserve">computes score and </w:t>
+      </w:r>
+      <w:proofErr w:type="gramStart"/>
+      <w:r>
+        <w:rPr>
+          <w:rStyle w:val="Strong"/>
+          <w:rFonts w:asciiTheme="minorHAnsi" w:eastAsiaTheme="majorEastAsia" w:hAnsiTheme="minorHAnsi"/>
+          <w:b w:val="0"/>
+          <w:bCs w:val="0"/>
+          <w:lang w:val="en-US"/>
+        </w:rPr>
+        <w:t>selects</w:t>
+      </w:r>
+      <w:proofErr w:type="gramEnd"/>
+      <w:r>
+        <w:rPr>
+          <w:rStyle w:val="Strong"/>
+          <w:rFonts w:asciiTheme="minorHAnsi" w:eastAsiaTheme="majorEastAsia" w:hAnsiTheme="minorHAnsi"/>
+          <w:b w:val="0"/>
+          <w:bCs w:val="0"/>
+          <w:lang w:val="en-US"/>
+        </w:rPr>
+        <w:t xml:space="preserve"> feedback message (rule based)</w:t>
+      </w:r>
+    </w:p>
+    <w:p>
+      <w:pPr>
+        <w:pStyle w:val="NormalWeb"/>
+        <w:numPr>
+          <w:ilvl w:val="0"/>
+          <w:numId w:val="11"/>
+        </w:numPr>
+        <w:rPr>
+          <w:rFonts w:asciiTheme="minorHAnsi" w:hAnsiTheme="minorHAnsi"/>
+          <w:lang w:val="en-US"/>
+        </w:rPr>
+      </w:pPr>
+      <w:proofErr w:type="spellStart"/>
+      <w:r>
+        <w:rPr>
+          <w:rStyle w:val="Strong"/>
+          <w:rFonts w:asciiTheme="minorHAnsi" w:eastAsiaTheme="majorEastAsia" w:hAnsiTheme="minorHAnsi"/>
+          <w:lang w:val="en-US"/>
+        </w:rPr>
+        <w:t>Firestore</w:t>
+      </w:r>
+      <w:proofErr w:type="spellEnd"/>
+      <w:r>
+        <w:rPr>
+          <w:rStyle w:val="Strong"/>
+          <w:rFonts w:asciiTheme="minorHAnsi" w:eastAsiaTheme="majorEastAsia" w:hAnsiTheme="minorHAnsi"/>
+          <w:lang w:val="en-US"/>
+        </w:rPr>
+        <w:t xml:space="preserve"> </w:t>
+      </w:r>
+      <w:r>
+        <w:rPr>
+          <w:rStyle w:val="Strong"/>
+          <w:rFonts w:asciiTheme="minorHAnsi" w:eastAsiaTheme="majorEastAsia" w:hAnsiTheme="minorHAnsi"/>
+          <w:b w:val="0"/>
+          <w:bCs w:val="0"/>
+          <w:lang w:val="en-US"/>
+        </w:rPr>
+        <w:t>stores survey entry.</w:t>
+      </w:r>
+    </w:p>
+    <w:p>
+      <w:pPr>
+        <w:pStyle w:val="NormalWeb"/>
+        <w:rPr>
+          <w:rFonts w:asciiTheme="minorHAnsi" w:hAnsiTheme="minorHAnsi"/>
+          <w:lang w:val="en-US"/>
+        </w:rPr>
+      </w:pPr>
+      <w:r>
+        <w:rPr>
+          <w:rFonts w:asciiTheme="minorHAnsi" w:hAnsiTheme="minorHAnsi"/>
+          <w:lang w:val="en-US"/>
+        </w:rPr>
+        <w:t>Data Flow / Interactions:</w:t>
+      </w:r>
+    </w:p>
+    <w:p>
+      <w:pPr>
+        <w:pStyle w:val="NormalWeb"/>
+        <w:rPr>
+          <w:rFonts w:asciiTheme="minorHAnsi" w:hAnsiTheme="minorHAnsi"/>
+          <w:lang w:val="en-US"/>
+        </w:rPr>
+      </w:pPr>
+      <w:r>
+        <w:rPr>
+          <w:rFonts w:asciiTheme="minorHAnsi" w:hAnsiTheme="minorHAnsi"/>
+          <w:noProof/>
+          <w:lang w:val="en-US"/>
+          <w14:ligatures w14:val="standardContextual"/>
+        </w:rPr>
+        <w:drawing>
+          <wp:inline distT="0" distB="0" distL="0" distR="0" wp14:anchorId="427D3525" wp14:editId="2D0F2CC3">
+            <wp:extent cx="5760720" cy="1769452"/>
+            <wp:effectExtent l="0" t="0" r="5080" b="0"/>
+            <wp:docPr id="998214237" name="Picture 3"/>
+            <wp:cNvGraphicFramePr>
+              <a:graphicFrameLocks xmlns:a="http://schemas.openxmlformats.org/drawingml/2006/main" noChangeAspect="1"/>
+            </wp:cNvGraphicFramePr>
+            <a:graphic xmlns:a="http://schemas.openxmlformats.org/drawingml/2006/main">
+              <a:graphicData uri="http://schemas.openxmlformats.org/drawingml/2006/picture">
+                <pic:pic xmlns:pic="http://schemas.openxmlformats.org/drawingml/2006/picture">
+                  <pic:nvPicPr>
+                    <pic:cNvPr id="998214237" name="Picture 998214237"/>
+                    <pic:cNvPicPr/>
+                  </pic:nvPicPr>
+                  <pic:blipFill>
+                    <a:blip r:embed="rId15"/>
+                    <a:stretch>
+                      <a:fillRect/>
+                    </a:stretch>
+                  </pic:blipFill>
+                  <pic:spPr>
+                    <a:xfrm>
+                      <a:off x="0" y="0"/>
+                      <a:ext cx="5760720" cy="1769452"/>
+                    </a:xfrm>
+                    <a:prstGeom prst="rect">
+                      <a:avLst/>
+                    </a:prstGeom>
+                  </pic:spPr>
+                </pic:pic>
+              </a:graphicData>
+            </a:graphic>
+          </wp:inline>
+        </w:drawing>
+      </w:r>
+      <w:r>
+        <w:rPr>
+          <w:rFonts w:asciiTheme="minorHAnsi" w:hAnsiTheme="minorHAnsi"/>
+          <w:lang w:val="en-US"/>
+        </w:rPr>
+        <w:t xml:space="preserve"> </w:t>
+      </w:r>
+    </w:p>
+    <w:p>
+      <w:pPr>
+        <w:pStyle w:val="NormalWeb"/>
+        <w:rPr>
+          <w:rFonts w:asciiTheme="minorHAnsi" w:hAnsiTheme="minorHAnsi"/>
+          <w:lang w:val="en-US"/>
+        </w:rPr>
+      </w:pPr>
+      <w:r>
+        <w:rPr>
+          <w:rFonts w:asciiTheme="minorHAnsi" w:hAnsiTheme="minorHAnsi"/>
+          <w:lang w:val="en-US"/>
+        </w:rPr>
+        <w:lastRenderedPageBreak/>
+        <w:t>State Changes:</w:t>
+      </w:r>
+    </w:p>
+    <w:p>
+      <w:pPr>
+        <w:pStyle w:val="NormalWeb"/>
+        <w:numPr>
+          <w:ilvl w:val="0"/>
+          <w:numId w:val="12"/>
+        </w:numPr>
+        <w:rPr>
+          <w:rFonts w:asciiTheme="minorHAnsi" w:hAnsiTheme="minorHAnsi"/>
+          <w:lang w:val="en-US"/>
+        </w:rPr>
+      </w:pPr>
+      <w:r>
+        <w:rPr>
+          <w:rFonts w:asciiTheme="minorHAnsi" w:hAnsiTheme="minorHAnsi"/>
+          <w:lang w:val="en-US"/>
+        </w:rPr>
+        <w:t>Database State</w:t>
+      </w:r>
+      <w:r>
+        <w:rPr>
+          <w:rFonts w:asciiTheme="minorHAnsi" w:hAnsiTheme="minorHAnsi"/>
+          <w:lang w:val="en-US"/>
+        </w:rPr>
+        <w:t>: new survey document created under the user</w:t>
+      </w:r>
+    </w:p>
+    <w:p>
+      <w:pPr>
+        <w:pStyle w:val="NormalWeb"/>
+        <w:numPr>
+          <w:ilvl w:val="0"/>
+          <w:numId w:val="12"/>
+        </w:numPr>
+        <w:rPr>
+          <w:rFonts w:asciiTheme="minorHAnsi" w:hAnsiTheme="minorHAnsi"/>
+          <w:lang w:val="en-US"/>
+        </w:rPr>
+      </w:pPr>
+      <w:r>
+        <w:rPr>
+          <w:rFonts w:asciiTheme="minorHAnsi" w:hAnsiTheme="minorHAnsi"/>
+          <w:lang w:val="en-US"/>
+        </w:rPr>
+        <w:t xml:space="preserve">UI State: </w:t>
+      </w:r>
+      <w:proofErr w:type="spellStart"/>
+      <w:r>
+        <w:rPr>
+          <w:rFonts w:asciiTheme="minorHAnsi" w:hAnsiTheme="minorHAnsi"/>
+          <w:lang w:val="en-US"/>
+        </w:rPr>
+        <w:t>surveyNotSubmitted</w:t>
+      </w:r>
+      <w:proofErr w:type="spellEnd"/>
+      <w:r>
+        <w:rPr>
+          <w:rFonts w:asciiTheme="minorHAnsi" w:hAnsiTheme="minorHAnsi"/>
+          <w:lang w:val="en-US"/>
+        </w:rPr>
+        <w:t xml:space="preserve"> -&gt; </w:t>
+      </w:r>
+      <w:proofErr w:type="spellStart"/>
+      <w:r>
+        <w:rPr>
+          <w:rFonts w:asciiTheme="minorHAnsi" w:hAnsiTheme="minorHAnsi"/>
+          <w:lang w:val="en-US"/>
+        </w:rPr>
+        <w:t>surveySubmitted</w:t>
+      </w:r>
+      <w:proofErr w:type="spellEnd"/>
+    </w:p>
+    <w:p>
+      <w:pPr>
+        <w:pStyle w:val="NormalWeb"/>
+        <w:rPr>
+          <w:rFonts w:asciiTheme="minorHAnsi" w:hAnsiTheme="minorHAnsi"/>
+          <w:lang w:val="en-US"/>
+        </w:rPr>
+      </w:pPr>
+      <w:r>
+        <w:rPr>
+          <w:rFonts w:asciiTheme="minorHAnsi" w:hAnsiTheme="minorHAnsi"/>
+          <w:b/>
+          <w:bCs/>
+          <w:lang w:val="en-US"/>
+        </w:rPr>
+        <w:t xml:space="preserve">UC4 – Survey History: </w:t>
+      </w:r>
+      <w:r>
+        <w:rPr>
+          <w:rFonts w:asciiTheme="minorHAnsi" w:hAnsiTheme="minorHAnsi"/>
+          <w:lang w:val="en-US"/>
+        </w:rPr>
+        <w:t>Displays previous surveys with date and score</w:t>
+      </w:r>
+    </w:p>
+    <w:p>
+      <w:r>
+        <w:t xml:space="preserve">System Architecture Support: </w:t>
+      </w:r>
+    </w:p>
+    <w:p>
+      <w:pPr>
+        <w:pStyle w:val="NormalWeb"/>
+        <w:numPr>
+          <w:ilvl w:val="0"/>
+          <w:numId w:val="11"/>
+        </w:numPr>
+        <w:rPr>
+          <w:rFonts w:asciiTheme="minorHAnsi" w:hAnsiTheme="minorHAnsi"/>
+          <w:lang w:val="en-US"/>
+        </w:rPr>
+      </w:pPr>
+      <w:r>
+        <w:rPr>
+          <w:rStyle w:val="Strong"/>
+          <w:rFonts w:asciiTheme="minorHAnsi" w:eastAsiaTheme="majorEastAsia" w:hAnsiTheme="minorHAnsi"/>
+          <w:lang w:val="en-US"/>
+        </w:rPr>
+        <w:t>History Screen</w:t>
+      </w:r>
+      <w:r>
+        <w:rPr>
+          <w:rStyle w:val="apple-converted-space"/>
+          <w:rFonts w:asciiTheme="minorHAnsi" w:eastAsiaTheme="majorEastAsia" w:hAnsiTheme="minorHAnsi"/>
+          <w:lang w:val="en-US"/>
+        </w:rPr>
+        <w:t> </w:t>
+      </w:r>
+      <w:r>
+        <w:rPr>
+          <w:rFonts w:asciiTheme="minorHAnsi" w:hAnsiTheme="minorHAnsi"/>
+          <w:lang w:val="en-US"/>
+        </w:rPr>
+        <w:t>requests past survey documents.</w:t>
+      </w:r>
+    </w:p>
+    <w:p>
+      <w:pPr>
+        <w:pStyle w:val="NormalWeb"/>
+        <w:numPr>
+          <w:ilvl w:val="0"/>
+          <w:numId w:val="11"/>
+        </w:numPr>
+        <w:rPr>
+          <w:rFonts w:asciiTheme="minorHAnsi" w:hAnsiTheme="minorHAnsi"/>
+          <w:lang w:val="en-US"/>
+        </w:rPr>
+      </w:pPr>
+      <w:proofErr w:type="spellStart"/>
+      <w:r>
+        <w:rPr>
+          <w:rStyle w:val="Strong"/>
+          <w:rFonts w:asciiTheme="minorHAnsi" w:eastAsiaTheme="majorEastAsia" w:hAnsiTheme="minorHAnsi"/>
+          <w:lang w:val="en-US"/>
+        </w:rPr>
+        <w:t>Firestore</w:t>
+      </w:r>
+      <w:proofErr w:type="spellEnd"/>
+      <w:r>
+        <w:rPr>
+          <w:rStyle w:val="Strong"/>
+          <w:rFonts w:asciiTheme="minorHAnsi" w:eastAsiaTheme="majorEastAsia" w:hAnsiTheme="minorHAnsi"/>
+          <w:lang w:val="en-US"/>
+        </w:rPr>
+        <w:t xml:space="preserve"> query </w:t>
+      </w:r>
+      <w:r>
+        <w:rPr>
+          <w:rStyle w:val="Strong"/>
+          <w:rFonts w:asciiTheme="minorHAnsi" w:eastAsiaTheme="majorEastAsia" w:hAnsiTheme="minorHAnsi"/>
+          <w:b w:val="0"/>
+          <w:bCs w:val="0"/>
+          <w:lang w:val="en-US"/>
+        </w:rPr>
+        <w:t>fetches survey entries</w:t>
+      </w:r>
+    </w:p>
+    <w:p>
+      <w:pPr>
+        <w:pStyle w:val="NormalWeb"/>
+        <w:rPr>
+          <w:rFonts w:asciiTheme="minorHAnsi" w:hAnsiTheme="minorHAnsi"/>
+          <w:lang w:val="en-US"/>
+        </w:rPr>
+      </w:pPr>
+      <w:r>
+        <w:rPr>
+          <w:rFonts w:asciiTheme="minorHAnsi" w:hAnsiTheme="minorHAnsi"/>
+          <w:lang w:val="en-US"/>
+        </w:rPr>
+        <w:t>Data Flow / Interactions:</w:t>
+      </w:r>
+      <w:r>
+        <w:rPr>
+          <w:rFonts w:asciiTheme="minorHAnsi" w:hAnsiTheme="minorHAnsi"/>
+          <w:noProof/>
+          <w:lang w:val="en-US"/>
+          <w14:ligatures w14:val="standardContextual"/>
+        </w:rPr>
+        <w:t xml:space="preserve"> </w:t>
+      </w:r>
+      <w:r>
+        <w:rPr>
+          <w:rFonts w:asciiTheme="minorHAnsi" w:hAnsiTheme="minorHAnsi"/>
+          <w:noProof/>
+          <w:lang w:val="en-US"/>
+          <w14:ligatures w14:val="standardContextual"/>
+        </w:rPr>
+        <w:drawing>
+          <wp:inline distT="0" distB="0" distL="0" distR="0" wp14:anchorId="359CC717" wp14:editId="1AB9DB92">
+            <wp:extent cx="5760720" cy="1766375"/>
+            <wp:effectExtent l="0" t="0" r="0" b="0"/>
+            <wp:docPr id="1605818907" name="Picture 4"/>
+            <wp:cNvGraphicFramePr>
+              <a:graphicFrameLocks xmlns:a="http://schemas.openxmlformats.org/drawingml/2006/main" noChangeAspect="1"/>
+            </wp:cNvGraphicFramePr>
+            <a:graphic xmlns:a="http://schemas.openxmlformats.org/drawingml/2006/main">
+              <a:graphicData uri="http://schemas.openxmlformats.org/drawingml/2006/picture">
+                <pic:pic xmlns:pic="http://schemas.openxmlformats.org/drawingml/2006/picture">
+                  <pic:nvPicPr>
+                    <pic:cNvPr id="1605818907" name="Picture 1605818907"/>
+                    <pic:cNvPicPr/>
+                  </pic:nvPicPr>
+                  <pic:blipFill>
+                    <a:blip r:embed="rId16"/>
+                    <a:stretch>
+                      <a:fillRect/>
+                    </a:stretch>
+                  </pic:blipFill>
+                  <pic:spPr>
+                    <a:xfrm>
+                      <a:off x="0" y="0"/>
+                      <a:ext cx="5760720" cy="1766375"/>
+                    </a:xfrm>
+                    <a:prstGeom prst="rect">
+                      <a:avLst/>
+                    </a:prstGeom>
+                  </pic:spPr>
+                </pic:pic>
+              </a:graphicData>
+            </a:graphic>
+          </wp:inline>
+        </w:drawing>
+      </w:r>
+      <w:r>
+        <w:rPr>
+          <w:rFonts w:asciiTheme="minorHAnsi" w:hAnsiTheme="minorHAnsi"/>
+          <w:lang w:val="en-US"/>
+        </w:rPr>
+        <w:t xml:space="preserve"> </w:t>
+      </w:r>
+      <w:r>
+        <w:rPr>
+          <w:rFonts w:asciiTheme="minorHAnsi" w:hAnsiTheme="minorHAnsi"/>
+          <w:lang w:val="en-US"/>
+        </w:rPr>
+        <w:t>State Changes:</w:t>
+      </w:r>
+    </w:p>
+    <w:p>
+      <w:pPr>
+        <w:pStyle w:val="NormalWeb"/>
+        <w:numPr>
+          <w:ilvl w:val="0"/>
+          <w:numId w:val="12"/>
+        </w:numPr>
+        <w:rPr>
+          <w:rFonts w:asciiTheme="minorHAnsi" w:hAnsiTheme="minorHAnsi"/>
+          <w:lang w:val="en-US"/>
+        </w:rPr>
+      </w:pPr>
+      <w:r>
+        <w:rPr>
+          <w:rFonts w:asciiTheme="minorHAnsi" w:hAnsiTheme="minorHAnsi"/>
+          <w:lang w:val="en-US"/>
+        </w:rPr>
+        <w:t xml:space="preserve">Database: </w:t>
+      </w:r>
+      <w:r>
+        <w:rPr>
+          <w:rFonts w:asciiTheme="minorHAnsi" w:hAnsiTheme="minorHAnsi"/>
+          <w:lang w:val="en-US"/>
+        </w:rPr>
+        <w:t>Read Only</w:t>
+      </w:r>
+    </w:p>
+    <w:p>
+      <w:pPr>
+        <w:pStyle w:val="NormalWeb"/>
+        <w:numPr>
+          <w:ilvl w:val="0"/>
+          <w:numId w:val="12"/>
+        </w:numPr>
+        <w:rPr>
+          <w:rFonts w:asciiTheme="minorHAnsi" w:hAnsiTheme="minorHAnsi"/>
+          <w:lang w:val="en-US"/>
+        </w:rPr>
+      </w:pPr>
+      <w:r>
+        <w:rPr>
+          <w:rFonts w:asciiTheme="minorHAnsi" w:hAnsiTheme="minorHAnsi"/>
+          <w:lang w:val="en-US"/>
+        </w:rPr>
+        <w:t xml:space="preserve">Local State: Provider updates </w:t>
+      </w:r>
+      <w:proofErr w:type="spellStart"/>
+      <w:r>
+        <w:rPr>
+          <w:rFonts w:asciiTheme="minorHAnsi" w:hAnsiTheme="minorHAnsi"/>
+          <w:lang w:val="en-US"/>
+        </w:rPr>
+        <w:t>surveyHistoryList</w:t>
+      </w:r>
+      <w:proofErr w:type="spellEnd"/>
+    </w:p>
+    <w:p>
+      <w:pPr>
+        <w:pStyle w:val="NormalWeb"/>
+        <w:ind w:left="360"/>
+        <w:rPr>
+          <w:rFonts w:asciiTheme="minorHAnsi" w:hAnsiTheme="minorHAnsi"/>
+          <w:lang w:val="en-US"/>
+        </w:rPr>
+      </w:pPr>
+      <w:r>
+        <w:rPr>
+          <w:rFonts w:asciiTheme="minorHAnsi" w:hAnsiTheme="minorHAnsi"/>
+          <w:lang w:val="en-US"/>
+        </w:rPr>
+        <w:t>3.4 Demo Requirement:</w:t>
+      </w:r>
+    </w:p>
+    <w:p>
+      <w:pPr>
+        <w:ind w:firstLine="720"/>
+      </w:pPr>
+      <w:r>
+        <w:t>The four use cases as stated above will be fully implemented and demonstrated during the final project presentation.</w:t>
+      </w:r>
+    </w:p>
+    <w:p>
+      <w:pPr>
+        <w:ind w:left="360"/>
         <w:rPr>
           <w:b/>
           <w:bCs/>
@@ -3898,8 +5402,7 @@
           <w:szCs w:val="28"/>
           <w:u w:val="single"/>
         </w:rPr>
-        <w:t>Use Case Support in Design</w:t>
-      </w:r>
+      </w:pPr>
     </w:p>
     <w:p>
       <w:pPr>
@@ -3952,8 +5455,6 @@
           <w:b/>
         </w:rPr>
       </w:pPr>
-      <w:bookmarkStart w:id="1" w:name="_GoBack"/>
-      <w:bookmarkEnd w:id="1"/>
     </w:p>
     <w:p/>
     <w:p>
@@ -3987,20 +5488,20 @@
     </w:p>
     <w:p>
       <w:pPr>
-        <w:pStyle w:val="ListeParagraf"/>
+        <w:pStyle w:val="ListParagraph"/>
         <w:ind w:left="3552"/>
       </w:pPr>
     </w:p>
     <w:tbl>
       <w:tblPr>
-        <w:tblStyle w:val="TabloKlavuzu"/>
+        <w:tblStyle w:val="TableGrid"/>
         <w:tblW w:w="8887" w:type="dxa"/>
         <w:tblInd w:w="-5" w:type="dxa"/>
         <w:tblLook w:val="04A0" w:firstRow="1" w:lastRow="0" w:firstColumn="1" w:lastColumn="0" w:noHBand="0" w:noVBand="1"/>
       </w:tblPr>
       <w:tblGrid>
-        <w:gridCol w:w="2822"/>
-        <w:gridCol w:w="6065"/>
+        <w:gridCol w:w="2801"/>
+        <w:gridCol w:w="6086"/>
       </w:tblGrid>
       <w:tr>
         <w:trPr>
@@ -4012,7 +5513,7 @@
           </w:tcPr>
           <w:p>
             <w:pPr>
-              <w:pStyle w:val="ListeParagraf"/>
+              <w:pStyle w:val="ListParagraph"/>
               <w:numPr>
                 <w:ilvl w:val="0"/>
                 <w:numId w:val="1"/>
@@ -4030,7 +5531,7 @@
           </w:tcPr>
           <w:p>
             <w:pPr>
-              <w:pStyle w:val="ListeParagraf"/>
+              <w:pStyle w:val="ListParagraph"/>
               <w:numPr>
                 <w:ilvl w:val="0"/>
                 <w:numId w:val="1"/>
@@ -4053,7 +5554,7 @@
           </w:tcPr>
           <w:p>
             <w:pPr>
-              <w:pStyle w:val="ListeParagraf"/>
+              <w:pStyle w:val="ListParagraph"/>
               <w:numPr>
                 <w:ilvl w:val="0"/>
                 <w:numId w:val="1"/>
@@ -4061,6 +5562,7 @@
               <w:ind w:left="0" w:firstLine="0"/>
             </w:pPr>
             <w:r>
+              <w:lastRenderedPageBreak/>
               <w:t>İpek Atak</w:t>
             </w:r>
           </w:p>
@@ -4071,7 +5573,7 @@
           </w:tcPr>
           <w:p>
             <w:pPr>
-              <w:pStyle w:val="ListeParagraf"/>
+              <w:pStyle w:val="ListParagraph"/>
               <w:numPr>
                 <w:ilvl w:val="0"/>
                 <w:numId w:val="1"/>
@@ -4094,20 +5596,15 @@
           </w:tcPr>
           <w:p>
             <w:pPr>
-              <w:pStyle w:val="ListeParagraf"/>
+              <w:pStyle w:val="ListParagraph"/>
               <w:numPr>
                 <w:ilvl w:val="0"/>
                 <w:numId w:val="1"/>
               </w:numPr>
               <w:ind w:left="0" w:firstLine="0"/>
             </w:pPr>
-            <w:proofErr w:type="spellStart"/>
             <w:r>
-              <w:t>Defne</w:t>
-            </w:r>
-            <w:proofErr w:type="spellEnd"/>
-            <w:r>
-              <w:t xml:space="preserve"> </w:t>
+              <w:t xml:space="preserve">Defne </w:t>
             </w:r>
             <w:proofErr w:type="spellStart"/>
             <w:r>
@@ -4122,7 +5619,7 @@
           </w:tcPr>
           <w:p>
             <w:pPr>
-              <w:pStyle w:val="ListeParagraf"/>
+              <w:pStyle w:val="ListParagraph"/>
               <w:numPr>
                 <w:ilvl w:val="0"/>
                 <w:numId w:val="1"/>
@@ -4145,7 +5642,7 @@
           </w:tcPr>
           <w:p>
             <w:pPr>
-              <w:pStyle w:val="ListeParagraf"/>
+              <w:pStyle w:val="ListParagraph"/>
               <w:numPr>
                 <w:ilvl w:val="0"/>
                 <w:numId w:val="1"/>
@@ -4163,7 +5660,7 @@
           </w:tcPr>
           <w:p>
             <w:pPr>
-              <w:pStyle w:val="ListeParagraf"/>
+              <w:pStyle w:val="ListParagraph"/>
               <w:numPr>
                 <w:ilvl w:val="0"/>
                 <w:numId w:val="1"/>
@@ -4189,8 +5686,121 @@
 </file>
 
 <file path=word/numbering.xml><?xml version="1.0" encoding="utf-8"?>
-<w:numbering xmlns:wpc="http://schemas.microsoft.com/office/word/2010/wordprocessingCanvas" xmlns:cx="http://schemas.microsoft.com/office/drawing/2014/chartex" xmlns:mc="http://schemas.openxmlformats.org/markup-compatibility/2006" xmlns:o="urn:schemas-microsoft-com:office:office" xmlns:r="http://schemas.openxmlformats.org/officeDocument/2006/relationships" xmlns:m="http://schemas.openxmlformats.org/officeDocument/2006/math" xmlns:v="urn:schemas-microsoft-com:vml" xmlns:wp14="http://schemas.microsoft.com/office/word/2010/wordprocessingDrawing" xmlns:wp="http://schemas.openxmlformats.org/drawingml/2006/wordprocessingDrawing" xmlns:w10="urn:schemas-microsoft-com:office:word" xmlns:w="http://schemas.openxmlformats.org/wordprocessingml/2006/main" xmlns:w14="http://schemas.microsoft.com/office/word/2010/wordml" xmlns:w15="http://schemas.microsoft.com/office/word/2012/wordml" xmlns:w16se="http://schemas.microsoft.com/office/word/2015/wordml/symex" xmlns:wpg="http://schemas.microsoft.com/office/word/2010/wordprocessingGroup" xmlns:wpi="http://schemas.microsoft.com/office/word/2010/wordprocessingInk" xmlns:wne="http://schemas.microsoft.com/office/word/2006/wordml" xmlns:wps="http://schemas.microsoft.com/office/word/2010/wordprocessingShape" mc:Ignorable="w14 w15 w16se wp14">
+<w:numbering xmlns:wpc="http://schemas.microsoft.com/office/word/2010/wordprocessingCanvas" xmlns:cx="http://schemas.microsoft.com/office/drawing/2014/chartex" xmlns:cx1="http://schemas.microsoft.com/office/drawing/2015/9/8/chartex" xmlns:cx2="http://schemas.microsoft.com/office/drawing/2015/10/21/chartex" xmlns:cx3="http://schemas.microsoft.com/office/drawing/2016/5/9/chartex" xmlns:cx4="http://schemas.microsoft.com/office/drawing/2016/5/10/chartex" xmlns:cx5="http://schemas.microsoft.com/office/drawing/2016/5/11/chartex" xmlns:cx6="http://schemas.microsoft.com/office/drawing/2016/5/12/chartex" xmlns:cx7="http://schemas.microsoft.com/office/drawing/2016/5/13/chartex" xmlns:cx8="http://schemas.microsoft.com/office/drawing/2016/5/14/chartex" xmlns:mc="http://schemas.openxmlformats.org/markup-compatibility/2006" xmlns:aink="http://schemas.microsoft.com/office/drawing/2016/ink" xmlns:am3d="http://schemas.microsoft.com/office/drawing/2017/model3d" xmlns:o="urn:schemas-microsoft-com:office:office" xmlns:oel="http://schemas.microsoft.com/office/2019/extlst" xmlns:r="http://schemas.openxmlformats.org/officeDocument/2006/relationships" xmlns:m="http://schemas.openxmlformats.org/officeDocument/2006/math" xmlns:v="urn:schemas-microsoft-com:vml" xmlns:wp14="http://schemas.microsoft.com/office/word/2010/wordprocessingDrawing" xmlns:wp="http://schemas.openxmlformats.org/drawingml/2006/wordprocessingDrawing" xmlns:w10="urn:schemas-microsoft-com:office:word" xmlns:w="http://schemas.openxmlformats.org/wordprocessingml/2006/main" xmlns:w14="http://schemas.microsoft.com/office/word/2010/wordml" xmlns:w15="http://schemas.microsoft.com/office/word/2012/wordml" xmlns:w16cex="http://schemas.microsoft.com/office/word/2018/wordml/cex" xmlns:w16cid="http://schemas.microsoft.com/office/word/2016/wordml/cid" xmlns:w16="http://schemas.microsoft.com/office/word/2018/wordml" xmlns:w16du="http://schemas.microsoft.com/office/word/2023/wordml/word16du" xmlns:w16sdtdh="http://schemas.microsoft.com/office/word/2020/wordml/sdtdatahash" xmlns:w16sdtfl="http://schemas.microsoft.com/office/word/2024/wordml/sdtformatlock" xmlns:w16se="http://schemas.microsoft.com/office/word/2015/wordml/symex" xmlns:wpg="http://schemas.microsoft.com/office/word/2010/wordprocessingGroup" xmlns:wpi="http://schemas.microsoft.com/office/word/2010/wordprocessingInk" xmlns:wne="http://schemas.microsoft.com/office/word/2006/wordml" xmlns:wps="http://schemas.microsoft.com/office/word/2010/wordprocessingShape" mc:Ignorable="w14 w15 w16se w16cid w16 w16cex w16sdtdh w16sdtfl w16du wp14">
   <w:abstractNum w:abstractNumId="0" w15:restartNumberingAfterBreak="0">
+    <w:nsid w:val="12C411F1"/>
+    <w:multiLevelType w:val="hybridMultilevel"/>
+    <w:tmpl w:val="6BE4ABD8"/>
+    <w:lvl w:ilvl="0" w:tplc="04090001">
+      <w:start w:val="1"/>
+      <w:numFmt w:val="bullet"/>
+      <w:lvlText w:val=""/>
+      <w:lvlJc w:val="left"/>
+      <w:pPr>
+        <w:ind w:left="720" w:hanging="360"/>
+      </w:pPr>
+      <w:rPr>
+        <w:rFonts w:ascii="Symbol" w:hAnsi="Symbol" w:hint="default"/>
+      </w:rPr>
+    </w:lvl>
+    <w:lvl w:ilvl="1" w:tplc="04090003" w:tentative="1">
+      <w:start w:val="1"/>
+      <w:numFmt w:val="bullet"/>
+      <w:lvlText w:val="o"/>
+      <w:lvlJc w:val="left"/>
+      <w:pPr>
+        <w:ind w:left="1440" w:hanging="360"/>
+      </w:pPr>
+      <w:rPr>
+        <w:rFonts w:ascii="Courier New" w:hAnsi="Courier New" w:hint="default"/>
+      </w:rPr>
+    </w:lvl>
+    <w:lvl w:ilvl="2" w:tplc="04090005" w:tentative="1">
+      <w:start w:val="1"/>
+      <w:numFmt w:val="bullet"/>
+      <w:lvlText w:val=""/>
+      <w:lvlJc w:val="left"/>
+      <w:pPr>
+        <w:ind w:left="2160" w:hanging="360"/>
+      </w:pPr>
+      <w:rPr>
+        <w:rFonts w:ascii="Wingdings" w:hAnsi="Wingdings" w:hint="default"/>
+      </w:rPr>
+    </w:lvl>
+    <w:lvl w:ilvl="3" w:tplc="04090001" w:tentative="1">
+      <w:start w:val="1"/>
+      <w:numFmt w:val="bullet"/>
+      <w:lvlText w:val=""/>
+      <w:lvlJc w:val="left"/>
+      <w:pPr>
+        <w:ind w:left="2880" w:hanging="360"/>
+      </w:pPr>
+      <w:rPr>
+        <w:rFonts w:ascii="Symbol" w:hAnsi="Symbol" w:hint="default"/>
+      </w:rPr>
+    </w:lvl>
+    <w:lvl w:ilvl="4" w:tplc="04090003" w:tentative="1">
+      <w:start w:val="1"/>
+      <w:numFmt w:val="bullet"/>
+      <w:lvlText w:val="o"/>
+      <w:lvlJc w:val="left"/>
+      <w:pPr>
+        <w:ind w:left="3600" w:hanging="360"/>
+      </w:pPr>
+      <w:rPr>
+        <w:rFonts w:ascii="Courier New" w:hAnsi="Courier New" w:hint="default"/>
+      </w:rPr>
+    </w:lvl>
+    <w:lvl w:ilvl="5" w:tplc="04090005" w:tentative="1">
+      <w:start w:val="1"/>
+      <w:numFmt w:val="bullet"/>
+      <w:lvlText w:val=""/>
+      <w:lvlJc w:val="left"/>
+      <w:pPr>
+        <w:ind w:left="4320" w:hanging="360"/>
+      </w:pPr>
+      <w:rPr>
+        <w:rFonts w:ascii="Wingdings" w:hAnsi="Wingdings" w:hint="default"/>
+      </w:rPr>
+    </w:lvl>
+    <w:lvl w:ilvl="6" w:tplc="04090001" w:tentative="1">
+      <w:start w:val="1"/>
+      <w:numFmt w:val="bullet"/>
+      <w:lvlText w:val=""/>
+      <w:lvlJc w:val="left"/>
+      <w:pPr>
+        <w:ind w:left="5040" w:hanging="360"/>
+      </w:pPr>
+      <w:rPr>
+        <w:rFonts w:ascii="Symbol" w:hAnsi="Symbol" w:hint="default"/>
+      </w:rPr>
+    </w:lvl>
+    <w:lvl w:ilvl="7" w:tplc="04090003" w:tentative="1">
+      <w:start w:val="1"/>
+      <w:numFmt w:val="bullet"/>
+      <w:lvlText w:val="o"/>
+      <w:lvlJc w:val="left"/>
+      <w:pPr>
+        <w:ind w:left="5760" w:hanging="360"/>
+      </w:pPr>
+      <w:rPr>
+        <w:rFonts w:ascii="Courier New" w:hAnsi="Courier New" w:hint="default"/>
+      </w:rPr>
+    </w:lvl>
+    <w:lvl w:ilvl="8" w:tplc="04090005" w:tentative="1">
+      <w:start w:val="1"/>
+      <w:numFmt w:val="bullet"/>
+      <w:lvlText w:val=""/>
+      <w:lvlJc w:val="left"/>
+      <w:pPr>
+        <w:ind w:left="6480" w:hanging="360"/>
+      </w:pPr>
+      <w:rPr>
+        <w:rFonts w:ascii="Wingdings" w:hAnsi="Wingdings" w:hint="default"/>
+      </w:rPr>
+    </w:lvl>
+  </w:abstractNum>
+  <w:abstractNum w:abstractNumId="1" w15:restartNumberingAfterBreak="0">
     <w:nsid w:val="14942950"/>
     <w:multiLevelType w:val="hybridMultilevel"/>
     <w:tmpl w:val="57B07DB8"/>
@@ -4276,7 +5886,7 @@
       </w:pPr>
     </w:lvl>
   </w:abstractNum>
-  <w:abstractNum w:abstractNumId="1" w15:restartNumberingAfterBreak="0">
+  <w:abstractNum w:abstractNumId="2" w15:restartNumberingAfterBreak="0">
     <w:nsid w:val="19DA08F6"/>
     <w:multiLevelType w:val="hybridMultilevel"/>
     <w:tmpl w:val="39060FAC"/>
@@ -4362,7 +5972,7 @@
       </w:pPr>
     </w:lvl>
   </w:abstractNum>
-  <w:abstractNum w:abstractNumId="2" w15:restartNumberingAfterBreak="0">
+  <w:abstractNum w:abstractNumId="3" w15:restartNumberingAfterBreak="0">
     <w:nsid w:val="292C3DC5"/>
     <w:multiLevelType w:val="hybridMultilevel"/>
     <w:tmpl w:val="F26224AE"/>
@@ -4448,7 +6058,120 @@
       </w:pPr>
     </w:lvl>
   </w:abstractNum>
-  <w:abstractNum w:abstractNumId="3" w15:restartNumberingAfterBreak="0">
+  <w:abstractNum w:abstractNumId="4" w15:restartNumberingAfterBreak="0">
+    <w:nsid w:val="2C876609"/>
+    <w:multiLevelType w:val="hybridMultilevel"/>
+    <w:tmpl w:val="447496C0"/>
+    <w:lvl w:ilvl="0" w:tplc="04090001">
+      <w:start w:val="1"/>
+      <w:numFmt w:val="bullet"/>
+      <w:lvlText w:val=""/>
+      <w:lvlJc w:val="left"/>
+      <w:pPr>
+        <w:ind w:left="720" w:hanging="360"/>
+      </w:pPr>
+      <w:rPr>
+        <w:rFonts w:ascii="Symbol" w:hAnsi="Symbol" w:hint="default"/>
+      </w:rPr>
+    </w:lvl>
+    <w:lvl w:ilvl="1" w:tplc="04090003">
+      <w:start w:val="1"/>
+      <w:numFmt w:val="bullet"/>
+      <w:lvlText w:val="o"/>
+      <w:lvlJc w:val="left"/>
+      <w:pPr>
+        <w:ind w:left="1440" w:hanging="360"/>
+      </w:pPr>
+      <w:rPr>
+        <w:rFonts w:ascii="Courier New" w:hAnsi="Courier New" w:hint="default"/>
+      </w:rPr>
+    </w:lvl>
+    <w:lvl w:ilvl="2" w:tplc="04090005" w:tentative="1">
+      <w:start w:val="1"/>
+      <w:numFmt w:val="bullet"/>
+      <w:lvlText w:val=""/>
+      <w:lvlJc w:val="left"/>
+      <w:pPr>
+        <w:ind w:left="2160" w:hanging="360"/>
+      </w:pPr>
+      <w:rPr>
+        <w:rFonts w:ascii="Wingdings" w:hAnsi="Wingdings" w:hint="default"/>
+      </w:rPr>
+    </w:lvl>
+    <w:lvl w:ilvl="3" w:tplc="04090001" w:tentative="1">
+      <w:start w:val="1"/>
+      <w:numFmt w:val="bullet"/>
+      <w:lvlText w:val=""/>
+      <w:lvlJc w:val="left"/>
+      <w:pPr>
+        <w:ind w:left="2880" w:hanging="360"/>
+      </w:pPr>
+      <w:rPr>
+        <w:rFonts w:ascii="Symbol" w:hAnsi="Symbol" w:hint="default"/>
+      </w:rPr>
+    </w:lvl>
+    <w:lvl w:ilvl="4" w:tplc="04090003" w:tentative="1">
+      <w:start w:val="1"/>
+      <w:numFmt w:val="bullet"/>
+      <w:lvlText w:val="o"/>
+      <w:lvlJc w:val="left"/>
+      <w:pPr>
+        <w:ind w:left="3600" w:hanging="360"/>
+      </w:pPr>
+      <w:rPr>
+        <w:rFonts w:ascii="Courier New" w:hAnsi="Courier New" w:hint="default"/>
+      </w:rPr>
+    </w:lvl>
+    <w:lvl w:ilvl="5" w:tplc="04090005" w:tentative="1">
+      <w:start w:val="1"/>
+      <w:numFmt w:val="bullet"/>
+      <w:lvlText w:val=""/>
+      <w:lvlJc w:val="left"/>
+      <w:pPr>
+        <w:ind w:left="4320" w:hanging="360"/>
+      </w:pPr>
+      <w:rPr>
+        <w:rFonts w:ascii="Wingdings" w:hAnsi="Wingdings" w:hint="default"/>
+      </w:rPr>
+    </w:lvl>
+    <w:lvl w:ilvl="6" w:tplc="04090001" w:tentative="1">
+      <w:start w:val="1"/>
+      <w:numFmt w:val="bullet"/>
+      <w:lvlText w:val=""/>
+      <w:lvlJc w:val="left"/>
+      <w:pPr>
+        <w:ind w:left="5040" w:hanging="360"/>
+      </w:pPr>
+      <w:rPr>
+        <w:rFonts w:ascii="Symbol" w:hAnsi="Symbol" w:hint="default"/>
+      </w:rPr>
+    </w:lvl>
+    <w:lvl w:ilvl="7" w:tplc="04090003" w:tentative="1">
+      <w:start w:val="1"/>
+      <w:numFmt w:val="bullet"/>
+      <w:lvlText w:val="o"/>
+      <w:lvlJc w:val="left"/>
+      <w:pPr>
+        <w:ind w:left="5760" w:hanging="360"/>
+      </w:pPr>
+      <w:rPr>
+        <w:rFonts w:ascii="Courier New" w:hAnsi="Courier New" w:hint="default"/>
+      </w:rPr>
+    </w:lvl>
+    <w:lvl w:ilvl="8" w:tplc="04090005" w:tentative="1">
+      <w:start w:val="1"/>
+      <w:numFmt w:val="bullet"/>
+      <w:lvlText w:val=""/>
+      <w:lvlJc w:val="left"/>
+      <w:pPr>
+        <w:ind w:left="6480" w:hanging="360"/>
+      </w:pPr>
+      <w:rPr>
+        <w:rFonts w:ascii="Wingdings" w:hAnsi="Wingdings" w:hint="default"/>
+      </w:rPr>
+    </w:lvl>
+  </w:abstractNum>
+  <w:abstractNum w:abstractNumId="5" w15:restartNumberingAfterBreak="0">
     <w:nsid w:val="2ECD2E84"/>
     <w:multiLevelType w:val="hybridMultilevel"/>
     <w:tmpl w:val="39060FAC"/>
@@ -4534,7 +6257,7 @@
       </w:pPr>
     </w:lvl>
   </w:abstractNum>
-  <w:abstractNum w:abstractNumId="4" w15:restartNumberingAfterBreak="0">
+  <w:abstractNum w:abstractNumId="6" w15:restartNumberingAfterBreak="0">
     <w:nsid w:val="2FA86A8A"/>
     <w:multiLevelType w:val="hybridMultilevel"/>
     <w:tmpl w:val="6640429A"/>
@@ -4620,7 +6343,120 @@
       </w:pPr>
     </w:lvl>
   </w:abstractNum>
-  <w:abstractNum w:abstractNumId="5" w15:restartNumberingAfterBreak="0">
+  <w:abstractNum w:abstractNumId="7" w15:restartNumberingAfterBreak="0">
+    <w:nsid w:val="3265084A"/>
+    <w:multiLevelType w:val="hybridMultilevel"/>
+    <w:tmpl w:val="B810BC5E"/>
+    <w:lvl w:ilvl="0" w:tplc="04090001">
+      <w:start w:val="1"/>
+      <w:numFmt w:val="bullet"/>
+      <w:lvlText w:val=""/>
+      <w:lvlJc w:val="left"/>
+      <w:pPr>
+        <w:ind w:left="720" w:hanging="360"/>
+      </w:pPr>
+      <w:rPr>
+        <w:rFonts w:ascii="Symbol" w:hAnsi="Symbol" w:hint="default"/>
+      </w:rPr>
+    </w:lvl>
+    <w:lvl w:ilvl="1" w:tplc="04090003" w:tentative="1">
+      <w:start w:val="1"/>
+      <w:numFmt w:val="bullet"/>
+      <w:lvlText w:val="o"/>
+      <w:lvlJc w:val="left"/>
+      <w:pPr>
+        <w:ind w:left="1440" w:hanging="360"/>
+      </w:pPr>
+      <w:rPr>
+        <w:rFonts w:ascii="Courier New" w:hAnsi="Courier New" w:hint="default"/>
+      </w:rPr>
+    </w:lvl>
+    <w:lvl w:ilvl="2" w:tplc="04090005" w:tentative="1">
+      <w:start w:val="1"/>
+      <w:numFmt w:val="bullet"/>
+      <w:lvlText w:val=""/>
+      <w:lvlJc w:val="left"/>
+      <w:pPr>
+        <w:ind w:left="2160" w:hanging="360"/>
+      </w:pPr>
+      <w:rPr>
+        <w:rFonts w:ascii="Wingdings" w:hAnsi="Wingdings" w:hint="default"/>
+      </w:rPr>
+    </w:lvl>
+    <w:lvl w:ilvl="3" w:tplc="04090001" w:tentative="1">
+      <w:start w:val="1"/>
+      <w:numFmt w:val="bullet"/>
+      <w:lvlText w:val=""/>
+      <w:lvlJc w:val="left"/>
+      <w:pPr>
+        <w:ind w:left="2880" w:hanging="360"/>
+      </w:pPr>
+      <w:rPr>
+        <w:rFonts w:ascii="Symbol" w:hAnsi="Symbol" w:hint="default"/>
+      </w:rPr>
+    </w:lvl>
+    <w:lvl w:ilvl="4" w:tplc="04090003" w:tentative="1">
+      <w:start w:val="1"/>
+      <w:numFmt w:val="bullet"/>
+      <w:lvlText w:val="o"/>
+      <w:lvlJc w:val="left"/>
+      <w:pPr>
+        <w:ind w:left="3600" w:hanging="360"/>
+      </w:pPr>
+      <w:rPr>
+        <w:rFonts w:ascii="Courier New" w:hAnsi="Courier New" w:hint="default"/>
+      </w:rPr>
+    </w:lvl>
+    <w:lvl w:ilvl="5" w:tplc="04090005" w:tentative="1">
+      <w:start w:val="1"/>
+      <w:numFmt w:val="bullet"/>
+      <w:lvlText w:val=""/>
+      <w:lvlJc w:val="left"/>
+      <w:pPr>
+        <w:ind w:left="4320" w:hanging="360"/>
+      </w:pPr>
+      <w:rPr>
+        <w:rFonts w:ascii="Wingdings" w:hAnsi="Wingdings" w:hint="default"/>
+      </w:rPr>
+    </w:lvl>
+    <w:lvl w:ilvl="6" w:tplc="04090001" w:tentative="1">
+      <w:start w:val="1"/>
+      <w:numFmt w:val="bullet"/>
+      <w:lvlText w:val=""/>
+      <w:lvlJc w:val="left"/>
+      <w:pPr>
+        <w:ind w:left="5040" w:hanging="360"/>
+      </w:pPr>
+      <w:rPr>
+        <w:rFonts w:ascii="Symbol" w:hAnsi="Symbol" w:hint="default"/>
+      </w:rPr>
+    </w:lvl>
+    <w:lvl w:ilvl="7" w:tplc="04090003" w:tentative="1">
+      <w:start w:val="1"/>
+      <w:numFmt w:val="bullet"/>
+      <w:lvlText w:val="o"/>
+      <w:lvlJc w:val="left"/>
+      <w:pPr>
+        <w:ind w:left="5760" w:hanging="360"/>
+      </w:pPr>
+      <w:rPr>
+        <w:rFonts w:ascii="Courier New" w:hAnsi="Courier New" w:hint="default"/>
+      </w:rPr>
+    </w:lvl>
+    <w:lvl w:ilvl="8" w:tplc="04090005" w:tentative="1">
+      <w:start w:val="1"/>
+      <w:numFmt w:val="bullet"/>
+      <w:lvlText w:val=""/>
+      <w:lvlJc w:val="left"/>
+      <w:pPr>
+        <w:ind w:left="6480" w:hanging="360"/>
+      </w:pPr>
+      <w:rPr>
+        <w:rFonts w:ascii="Wingdings" w:hAnsi="Wingdings" w:hint="default"/>
+      </w:rPr>
+    </w:lvl>
+  </w:abstractNum>
+  <w:abstractNum w:abstractNumId="8" w15:restartNumberingAfterBreak="0">
     <w:nsid w:val="326B6D26"/>
     <w:multiLevelType w:val="hybridMultilevel"/>
     <w:tmpl w:val="9402773A"/>
@@ -4709,7 +6545,7 @@
       </w:pPr>
     </w:lvl>
   </w:abstractNum>
-  <w:abstractNum w:abstractNumId="6" w15:restartNumberingAfterBreak="0">
+  <w:abstractNum w:abstractNumId="9" w15:restartNumberingAfterBreak="0">
     <w:nsid w:val="50853A28"/>
     <w:multiLevelType w:val="hybridMultilevel"/>
     <w:tmpl w:val="B7EEB630"/>
@@ -4822,7 +6658,7 @@
       </w:rPr>
     </w:lvl>
   </w:abstractNum>
-  <w:abstractNum w:abstractNumId="7" w15:restartNumberingAfterBreak="0">
+  <w:abstractNum w:abstractNumId="10" w15:restartNumberingAfterBreak="0">
     <w:nsid w:val="76FC6489"/>
     <w:multiLevelType w:val="hybridMultilevel"/>
     <w:tmpl w:val="131A53D2"/>
@@ -4935,35 +6771,160 @@
       </w:rPr>
     </w:lvl>
   </w:abstractNum>
-  <w:num w:numId="1">
+  <w:abstractNum w:abstractNumId="11" w15:restartNumberingAfterBreak="0">
+    <w:nsid w:val="7CBA3EF6"/>
+    <w:multiLevelType w:val="hybridMultilevel"/>
+    <w:tmpl w:val="6454773E"/>
+    <w:lvl w:ilvl="0" w:tplc="04090001">
+      <w:start w:val="1"/>
+      <w:numFmt w:val="bullet"/>
+      <w:lvlText w:val=""/>
+      <w:lvlJc w:val="left"/>
+      <w:pPr>
+        <w:ind w:left="720" w:hanging="360"/>
+      </w:pPr>
+      <w:rPr>
+        <w:rFonts w:ascii="Symbol" w:hAnsi="Symbol" w:hint="default"/>
+      </w:rPr>
+    </w:lvl>
+    <w:lvl w:ilvl="1" w:tplc="04090003" w:tentative="1">
+      <w:start w:val="1"/>
+      <w:numFmt w:val="bullet"/>
+      <w:lvlText w:val="o"/>
+      <w:lvlJc w:val="left"/>
+      <w:pPr>
+        <w:ind w:left="1440" w:hanging="360"/>
+      </w:pPr>
+      <w:rPr>
+        <w:rFonts w:ascii="Courier New" w:hAnsi="Courier New" w:hint="default"/>
+      </w:rPr>
+    </w:lvl>
+    <w:lvl w:ilvl="2" w:tplc="04090005" w:tentative="1">
+      <w:start w:val="1"/>
+      <w:numFmt w:val="bullet"/>
+      <w:lvlText w:val=""/>
+      <w:lvlJc w:val="left"/>
+      <w:pPr>
+        <w:ind w:left="2160" w:hanging="360"/>
+      </w:pPr>
+      <w:rPr>
+        <w:rFonts w:ascii="Wingdings" w:hAnsi="Wingdings" w:hint="default"/>
+      </w:rPr>
+    </w:lvl>
+    <w:lvl w:ilvl="3" w:tplc="04090001" w:tentative="1">
+      <w:start w:val="1"/>
+      <w:numFmt w:val="bullet"/>
+      <w:lvlText w:val=""/>
+      <w:lvlJc w:val="left"/>
+      <w:pPr>
+        <w:ind w:left="2880" w:hanging="360"/>
+      </w:pPr>
+      <w:rPr>
+        <w:rFonts w:ascii="Symbol" w:hAnsi="Symbol" w:hint="default"/>
+      </w:rPr>
+    </w:lvl>
+    <w:lvl w:ilvl="4" w:tplc="04090003" w:tentative="1">
+      <w:start w:val="1"/>
+      <w:numFmt w:val="bullet"/>
+      <w:lvlText w:val="o"/>
+      <w:lvlJc w:val="left"/>
+      <w:pPr>
+        <w:ind w:left="3600" w:hanging="360"/>
+      </w:pPr>
+      <w:rPr>
+        <w:rFonts w:ascii="Courier New" w:hAnsi="Courier New" w:hint="default"/>
+      </w:rPr>
+    </w:lvl>
+    <w:lvl w:ilvl="5" w:tplc="04090005" w:tentative="1">
+      <w:start w:val="1"/>
+      <w:numFmt w:val="bullet"/>
+      <w:lvlText w:val=""/>
+      <w:lvlJc w:val="left"/>
+      <w:pPr>
+        <w:ind w:left="4320" w:hanging="360"/>
+      </w:pPr>
+      <w:rPr>
+        <w:rFonts w:ascii="Wingdings" w:hAnsi="Wingdings" w:hint="default"/>
+      </w:rPr>
+    </w:lvl>
+    <w:lvl w:ilvl="6" w:tplc="04090001" w:tentative="1">
+      <w:start w:val="1"/>
+      <w:numFmt w:val="bullet"/>
+      <w:lvlText w:val=""/>
+      <w:lvlJc w:val="left"/>
+      <w:pPr>
+        <w:ind w:left="5040" w:hanging="360"/>
+      </w:pPr>
+      <w:rPr>
+        <w:rFonts w:ascii="Symbol" w:hAnsi="Symbol" w:hint="default"/>
+      </w:rPr>
+    </w:lvl>
+    <w:lvl w:ilvl="7" w:tplc="04090003" w:tentative="1">
+      <w:start w:val="1"/>
+      <w:numFmt w:val="bullet"/>
+      <w:lvlText w:val="o"/>
+      <w:lvlJc w:val="left"/>
+      <w:pPr>
+        <w:ind w:left="5760" w:hanging="360"/>
+      </w:pPr>
+      <w:rPr>
+        <w:rFonts w:ascii="Courier New" w:hAnsi="Courier New" w:hint="default"/>
+      </w:rPr>
+    </w:lvl>
+    <w:lvl w:ilvl="8" w:tplc="04090005" w:tentative="1">
+      <w:start w:val="1"/>
+      <w:numFmt w:val="bullet"/>
+      <w:lvlText w:val=""/>
+      <w:lvlJc w:val="left"/>
+      <w:pPr>
+        <w:ind w:left="6480" w:hanging="360"/>
+      </w:pPr>
+      <w:rPr>
+        <w:rFonts w:ascii="Wingdings" w:hAnsi="Wingdings" w:hint="default"/>
+      </w:rPr>
+    </w:lvl>
+  </w:abstractNum>
+  <w:num w:numId="1" w16cid:durableId="1839879207">
+    <w:abstractNumId w:val="10"/>
+  </w:num>
+  <w:num w:numId="2" w16cid:durableId="1894846322">
+    <w:abstractNumId w:val="3"/>
+  </w:num>
+  <w:num w:numId="3" w16cid:durableId="736630896">
+    <w:abstractNumId w:val="1"/>
+  </w:num>
+  <w:num w:numId="4" w16cid:durableId="1357537250">
+    <w:abstractNumId w:val="6"/>
+  </w:num>
+  <w:num w:numId="5" w16cid:durableId="1696270513">
+    <w:abstractNumId w:val="5"/>
+  </w:num>
+  <w:num w:numId="6" w16cid:durableId="1806116088">
+    <w:abstractNumId w:val="9"/>
+  </w:num>
+  <w:num w:numId="7" w16cid:durableId="1170946145">
+    <w:abstractNumId w:val="8"/>
+  </w:num>
+  <w:num w:numId="8" w16cid:durableId="1857452637">
+    <w:abstractNumId w:val="2"/>
+  </w:num>
+  <w:num w:numId="9" w16cid:durableId="574821880">
+    <w:abstractNumId w:val="11"/>
+  </w:num>
+  <w:num w:numId="10" w16cid:durableId="274992276">
     <w:abstractNumId w:val="7"/>
   </w:num>
-  <w:num w:numId="2">
-    <w:abstractNumId w:val="2"/>
-  </w:num>
-  <w:num w:numId="3">
+  <w:num w:numId="11" w16cid:durableId="184759075">
     <w:abstractNumId w:val="0"/>
   </w:num>
-  <w:num w:numId="4">
+  <w:num w:numId="12" w16cid:durableId="328797755">
     <w:abstractNumId w:val="4"/>
-  </w:num>
-  <w:num w:numId="5">
-    <w:abstractNumId w:val="3"/>
-  </w:num>
-  <w:num w:numId="6">
-    <w:abstractNumId w:val="6"/>
-  </w:num>
-  <w:num w:numId="7">
-    <w:abstractNumId w:val="5"/>
-  </w:num>
-  <w:num w:numId="8">
-    <w:abstractNumId w:val="1"/>
   </w:num>
 </w:numbering>
 </file>
 
 <file path=word/styles.xml><?xml version="1.0" encoding="utf-8"?>
-<w:styles xmlns:mc="http://schemas.openxmlformats.org/markup-compatibility/2006" xmlns:r="http://schemas.openxmlformats.org/officeDocument/2006/relationships" xmlns:w="http://schemas.openxmlformats.org/wordprocessingml/2006/main" xmlns:w14="http://schemas.microsoft.com/office/word/2010/wordml" xmlns:w15="http://schemas.microsoft.com/office/word/2012/wordml" xmlns:w16se="http://schemas.microsoft.com/office/word/2015/wordml/symex" mc:Ignorable="w14 w15 w16se">
+<w:styles xmlns:mc="http://schemas.openxmlformats.org/markup-compatibility/2006" xmlns:r="http://schemas.openxmlformats.org/officeDocument/2006/relationships" xmlns:w="http://schemas.openxmlformats.org/wordprocessingml/2006/main" xmlns:w14="http://schemas.microsoft.com/office/word/2010/wordml" xmlns:w15="http://schemas.microsoft.com/office/word/2012/wordml" xmlns:w16cex="http://schemas.microsoft.com/office/word/2018/wordml/cex" xmlns:w16cid="http://schemas.microsoft.com/office/word/2016/wordml/cid" xmlns:w16="http://schemas.microsoft.com/office/word/2018/wordml" xmlns:w16du="http://schemas.microsoft.com/office/word/2023/wordml/word16du" xmlns:w16sdtdh="http://schemas.microsoft.com/office/word/2020/wordml/sdtdatahash" xmlns:w16sdtfl="http://schemas.microsoft.com/office/word/2024/wordml/sdtformatlock" xmlns:w16se="http://schemas.microsoft.com/office/word/2015/wordml/symex" mc:Ignorable="w14 w15 w16se w16cid w16 w16cex w16sdtdh w16sdtfl w16du">
   <w:docDefaults>
     <w:rPrDefault>
       <w:rPr>
@@ -4979,7 +6940,7 @@
       </w:pPr>
     </w:pPrDefault>
   </w:docDefaults>
-  <w:latentStyles w:defLockedState="0" w:defUIPriority="99" w:defSemiHidden="0" w:defUnhideWhenUsed="0" w:defQFormat="0" w:count="371">
+  <w:latentStyles w:defLockedState="0" w:defUIPriority="99" w:defSemiHidden="0" w:defUnhideWhenUsed="0" w:defQFormat="0" w:count="376">
     <w:lsdException w:name="Normal" w:uiPriority="0" w:qFormat="1"/>
     <w:lsdException w:name="heading 1" w:uiPriority="9" w:qFormat="1"/>
     <w:lsdException w:name="heading 2" w:semiHidden="1" w:uiPriority="9" w:unhideWhenUsed="1" w:qFormat="1"/>
@@ -5351,6 +7312,11 @@
     <w:lsdException w:name="List Table 5 Dark Accent 6" w:uiPriority="50"/>
     <w:lsdException w:name="List Table 6 Colorful Accent 6" w:uiPriority="51"/>
     <w:lsdException w:name="List Table 7 Colorful Accent 6" w:uiPriority="52"/>
+    <w:lsdException w:name="Mention" w:semiHidden="1" w:unhideWhenUsed="1"/>
+    <w:lsdException w:name="Smart Hyperlink" w:semiHidden="1" w:unhideWhenUsed="1"/>
+    <w:lsdException w:name="Hashtag" w:semiHidden="1" w:unhideWhenUsed="1"/>
+    <w:lsdException w:name="Unresolved Mention" w:semiHidden="1" w:unhideWhenUsed="1"/>
+    <w:lsdException w:name="Smart Link" w:semiHidden="1" w:unhideWhenUsed="1"/>
   </w:latentStyles>
   <w:style w:type="paragraph" w:default="1" w:styleId="Normal">
     <w:name w:val="Normal"/>
@@ -5360,11 +7326,11 @@
       <w:lang w:val="en-US"/>
     </w:rPr>
   </w:style>
-  <w:style w:type="paragraph" w:styleId="Balk1">
+  <w:style w:type="paragraph" w:styleId="Heading1">
     <w:name w:val="heading 1"/>
     <w:basedOn w:val="Normal"/>
     <w:next w:val="Normal"/>
-    <w:link w:val="Balk1Char"/>
+    <w:link w:val="Heading1Char"/>
     <w:uiPriority w:val="9"/>
     <w:qFormat/>
     <w:rsid w:val="003E3F2A"/>
@@ -5381,11 +7347,11 @@
       <w:szCs w:val="40"/>
     </w:rPr>
   </w:style>
-  <w:style w:type="paragraph" w:styleId="Balk2">
+  <w:style w:type="paragraph" w:styleId="Heading2">
     <w:name w:val="heading 2"/>
     <w:basedOn w:val="Normal"/>
     <w:next w:val="Normal"/>
-    <w:link w:val="Balk2Char"/>
+    <w:link w:val="Heading2Char"/>
     <w:uiPriority w:val="9"/>
     <w:semiHidden/>
     <w:unhideWhenUsed/>
@@ -5404,11 +7370,11 @@
       <w:szCs w:val="32"/>
     </w:rPr>
   </w:style>
-  <w:style w:type="paragraph" w:styleId="Balk3">
+  <w:style w:type="paragraph" w:styleId="Heading3">
     <w:name w:val="heading 3"/>
     <w:basedOn w:val="Normal"/>
     <w:next w:val="Normal"/>
-    <w:link w:val="Balk3Char"/>
+    <w:link w:val="Heading3Char"/>
     <w:uiPriority w:val="9"/>
     <w:semiHidden/>
     <w:unhideWhenUsed/>
@@ -5427,11 +7393,11 @@
       <w:szCs w:val="28"/>
     </w:rPr>
   </w:style>
-  <w:style w:type="paragraph" w:styleId="Balk4">
+  <w:style w:type="paragraph" w:styleId="Heading4">
     <w:name w:val="heading 4"/>
     <w:basedOn w:val="Normal"/>
     <w:next w:val="Normal"/>
-    <w:link w:val="Balk4Char"/>
+    <w:link w:val="Heading4Char"/>
     <w:uiPriority w:val="9"/>
     <w:semiHidden/>
     <w:unhideWhenUsed/>
@@ -5450,11 +7416,11 @@
       <w:color w:val="2E74B5" w:themeColor="accent1" w:themeShade="BF"/>
     </w:rPr>
   </w:style>
-  <w:style w:type="paragraph" w:styleId="Balk5">
+  <w:style w:type="paragraph" w:styleId="Heading5">
     <w:name w:val="heading 5"/>
     <w:basedOn w:val="Normal"/>
     <w:next w:val="Normal"/>
-    <w:link w:val="Balk5Char"/>
+    <w:link w:val="Heading5Char"/>
     <w:uiPriority w:val="9"/>
     <w:semiHidden/>
     <w:unhideWhenUsed/>
@@ -5471,11 +7437,11 @@
       <w:color w:val="2E74B5" w:themeColor="accent1" w:themeShade="BF"/>
     </w:rPr>
   </w:style>
-  <w:style w:type="paragraph" w:styleId="Balk6">
+  <w:style w:type="paragraph" w:styleId="Heading6">
     <w:name w:val="heading 6"/>
     <w:basedOn w:val="Normal"/>
     <w:next w:val="Normal"/>
-    <w:link w:val="Balk6Char"/>
+    <w:link w:val="Heading6Char"/>
     <w:uiPriority w:val="9"/>
     <w:semiHidden/>
     <w:unhideWhenUsed/>
@@ -5494,11 +7460,11 @@
       <w:color w:val="595959" w:themeColor="text1" w:themeTint="A6"/>
     </w:rPr>
   </w:style>
-  <w:style w:type="paragraph" w:styleId="Balk7">
+  <w:style w:type="paragraph" w:styleId="Heading7">
     <w:name w:val="heading 7"/>
     <w:basedOn w:val="Normal"/>
     <w:next w:val="Normal"/>
-    <w:link w:val="Balk7Char"/>
+    <w:link w:val="Heading7Char"/>
     <w:uiPriority w:val="9"/>
     <w:semiHidden/>
     <w:unhideWhenUsed/>
@@ -5515,11 +7481,11 @@
       <w:color w:val="595959" w:themeColor="text1" w:themeTint="A6"/>
     </w:rPr>
   </w:style>
-  <w:style w:type="paragraph" w:styleId="Balk8">
+  <w:style w:type="paragraph" w:styleId="Heading8">
     <w:name w:val="heading 8"/>
     <w:basedOn w:val="Normal"/>
     <w:next w:val="Normal"/>
-    <w:link w:val="Balk8Char"/>
+    <w:link w:val="Heading8Char"/>
     <w:uiPriority w:val="9"/>
     <w:semiHidden/>
     <w:unhideWhenUsed/>
@@ -5538,11 +7504,11 @@
       <w:color w:val="272727" w:themeColor="text1" w:themeTint="D8"/>
     </w:rPr>
   </w:style>
-  <w:style w:type="paragraph" w:styleId="Balk9">
+  <w:style w:type="paragraph" w:styleId="Heading9">
     <w:name w:val="heading 9"/>
     <w:basedOn w:val="Normal"/>
     <w:next w:val="Normal"/>
-    <w:link w:val="Balk9Char"/>
+    <w:link w:val="Heading9Char"/>
     <w:uiPriority w:val="9"/>
     <w:semiHidden/>
     <w:unhideWhenUsed/>
@@ -5559,13 +7525,13 @@
       <w:color w:val="272727" w:themeColor="text1" w:themeTint="D8"/>
     </w:rPr>
   </w:style>
-  <w:style w:type="character" w:default="1" w:styleId="VarsaylanParagrafYazTipi">
+  <w:style w:type="character" w:default="1" w:styleId="DefaultParagraphFont">
     <w:name w:val="Default Paragraph Font"/>
     <w:uiPriority w:val="1"/>
     <w:semiHidden/>
     <w:unhideWhenUsed/>
   </w:style>
-  <w:style w:type="table" w:default="1" w:styleId="NormalTablo">
+  <w:style w:type="table" w:default="1" w:styleId="TableNormal">
     <w:name w:val="Normal Table"/>
     <w:uiPriority w:val="99"/>
     <w:semiHidden/>
@@ -5580,16 +7546,16 @@
       </w:tblCellMar>
     </w:tblPr>
   </w:style>
-  <w:style w:type="numbering" w:default="1" w:styleId="ListeYok">
+  <w:style w:type="numbering" w:default="1" w:styleId="NoList">
     <w:name w:val="No List"/>
     <w:uiPriority w:val="99"/>
     <w:semiHidden/>
     <w:unhideWhenUsed/>
   </w:style>
-  <w:style w:type="character" w:customStyle="1" w:styleId="Balk1Char">
-    <w:name w:val="Başlık 1 Char"/>
-    <w:basedOn w:val="VarsaylanParagrafYazTipi"/>
-    <w:link w:val="Balk1"/>
+  <w:style w:type="character" w:customStyle="1" w:styleId="Heading1Char">
+    <w:name w:val="Heading 1 Char"/>
+    <w:basedOn w:val="DefaultParagraphFont"/>
+    <w:link w:val="Heading1"/>
     <w:uiPriority w:val="9"/>
     <w:rsid w:val="003E3F2A"/>
     <w:rPr>
@@ -5599,10 +7565,10 @@
       <w:szCs w:val="40"/>
     </w:rPr>
   </w:style>
-  <w:style w:type="character" w:customStyle="1" w:styleId="Balk2Char">
-    <w:name w:val="Başlık 2 Char"/>
-    <w:basedOn w:val="VarsaylanParagrafYazTipi"/>
-    <w:link w:val="Balk2"/>
+  <w:style w:type="character" w:customStyle="1" w:styleId="Heading2Char">
+    <w:name w:val="Heading 2 Char"/>
+    <w:basedOn w:val="DefaultParagraphFont"/>
+    <w:link w:val="Heading2"/>
     <w:uiPriority w:val="9"/>
     <w:semiHidden/>
     <w:rsid w:val="003E3F2A"/>
@@ -5613,10 +7579,10 @@
       <w:szCs w:val="32"/>
     </w:rPr>
   </w:style>
-  <w:style w:type="character" w:customStyle="1" w:styleId="Balk3Char">
-    <w:name w:val="Başlık 3 Char"/>
-    <w:basedOn w:val="VarsaylanParagrafYazTipi"/>
-    <w:link w:val="Balk3"/>
+  <w:style w:type="character" w:customStyle="1" w:styleId="Heading3Char">
+    <w:name w:val="Heading 3 Char"/>
+    <w:basedOn w:val="DefaultParagraphFont"/>
+    <w:link w:val="Heading3"/>
     <w:uiPriority w:val="9"/>
     <w:semiHidden/>
     <w:rsid w:val="003E3F2A"/>
@@ -5627,10 +7593,10 @@
       <w:szCs w:val="28"/>
     </w:rPr>
   </w:style>
-  <w:style w:type="character" w:customStyle="1" w:styleId="Balk4Char">
-    <w:name w:val="Başlık 4 Char"/>
-    <w:basedOn w:val="VarsaylanParagrafYazTipi"/>
-    <w:link w:val="Balk4"/>
+  <w:style w:type="character" w:customStyle="1" w:styleId="Heading4Char">
+    <w:name w:val="Heading 4 Char"/>
+    <w:basedOn w:val="DefaultParagraphFont"/>
+    <w:link w:val="Heading4"/>
     <w:uiPriority w:val="9"/>
     <w:semiHidden/>
     <w:rsid w:val="003E3F2A"/>
@@ -5641,10 +7607,10 @@
       <w:color w:val="2E74B5" w:themeColor="accent1" w:themeShade="BF"/>
     </w:rPr>
   </w:style>
-  <w:style w:type="character" w:customStyle="1" w:styleId="Balk5Char">
-    <w:name w:val="Başlık 5 Char"/>
-    <w:basedOn w:val="VarsaylanParagrafYazTipi"/>
-    <w:link w:val="Balk5"/>
+  <w:style w:type="character" w:customStyle="1" w:styleId="Heading5Char">
+    <w:name w:val="Heading 5 Char"/>
+    <w:basedOn w:val="DefaultParagraphFont"/>
+    <w:link w:val="Heading5"/>
     <w:uiPriority w:val="9"/>
     <w:semiHidden/>
     <w:rsid w:val="003E3F2A"/>
@@ -5653,10 +7619,10 @@
       <w:color w:val="2E74B5" w:themeColor="accent1" w:themeShade="BF"/>
     </w:rPr>
   </w:style>
-  <w:style w:type="character" w:customStyle="1" w:styleId="Balk6Char">
-    <w:name w:val="Başlık 6 Char"/>
-    <w:basedOn w:val="VarsaylanParagrafYazTipi"/>
-    <w:link w:val="Balk6"/>
+  <w:style w:type="character" w:customStyle="1" w:styleId="Heading6Char">
+    <w:name w:val="Heading 6 Char"/>
+    <w:basedOn w:val="DefaultParagraphFont"/>
+    <w:link w:val="Heading6"/>
     <w:uiPriority w:val="9"/>
     <w:semiHidden/>
     <w:rsid w:val="003E3F2A"/>
@@ -5667,10 +7633,10 @@
       <w:color w:val="595959" w:themeColor="text1" w:themeTint="A6"/>
     </w:rPr>
   </w:style>
-  <w:style w:type="character" w:customStyle="1" w:styleId="Balk7Char">
-    <w:name w:val="Başlık 7 Char"/>
-    <w:basedOn w:val="VarsaylanParagrafYazTipi"/>
-    <w:link w:val="Balk7"/>
+  <w:style w:type="character" w:customStyle="1" w:styleId="Heading7Char">
+    <w:name w:val="Heading 7 Char"/>
+    <w:basedOn w:val="DefaultParagraphFont"/>
+    <w:link w:val="Heading7"/>
     <w:uiPriority w:val="9"/>
     <w:semiHidden/>
     <w:rsid w:val="003E3F2A"/>
@@ -5679,10 +7645,10 @@
       <w:color w:val="595959" w:themeColor="text1" w:themeTint="A6"/>
     </w:rPr>
   </w:style>
-  <w:style w:type="character" w:customStyle="1" w:styleId="Balk8Char">
-    <w:name w:val="Başlık 8 Char"/>
-    <w:basedOn w:val="VarsaylanParagrafYazTipi"/>
-    <w:link w:val="Balk8"/>
+  <w:style w:type="character" w:customStyle="1" w:styleId="Heading8Char">
+    <w:name w:val="Heading 8 Char"/>
+    <w:basedOn w:val="DefaultParagraphFont"/>
+    <w:link w:val="Heading8"/>
     <w:uiPriority w:val="9"/>
     <w:semiHidden/>
     <w:rsid w:val="003E3F2A"/>
@@ -5693,10 +7659,10 @@
       <w:color w:val="272727" w:themeColor="text1" w:themeTint="D8"/>
     </w:rPr>
   </w:style>
-  <w:style w:type="character" w:customStyle="1" w:styleId="Balk9Char">
-    <w:name w:val="Başlık 9 Char"/>
-    <w:basedOn w:val="VarsaylanParagrafYazTipi"/>
-    <w:link w:val="Balk9"/>
+  <w:style w:type="character" w:customStyle="1" w:styleId="Heading9Char">
+    <w:name w:val="Heading 9 Char"/>
+    <w:basedOn w:val="DefaultParagraphFont"/>
+    <w:link w:val="Heading9"/>
     <w:uiPriority w:val="9"/>
     <w:semiHidden/>
     <w:rsid w:val="003E3F2A"/>
@@ -5705,11 +7671,11 @@
       <w:color w:val="272727" w:themeColor="text1" w:themeTint="D8"/>
     </w:rPr>
   </w:style>
-  <w:style w:type="paragraph" w:styleId="KonuBal">
+  <w:style w:type="paragraph" w:styleId="Title">
     <w:name w:val="Title"/>
     <w:basedOn w:val="Normal"/>
     <w:next w:val="Normal"/>
-    <w:link w:val="KonuBalChar"/>
+    <w:link w:val="TitleChar"/>
     <w:uiPriority w:val="10"/>
     <w:qFormat/>
     <w:rsid w:val="003E3F2A"/>
@@ -5725,10 +7691,10 @@
       <w:szCs w:val="56"/>
     </w:rPr>
   </w:style>
-  <w:style w:type="character" w:customStyle="1" w:styleId="KonuBalChar">
-    <w:name w:val="Konu Başlığı Char"/>
-    <w:basedOn w:val="VarsaylanParagrafYazTipi"/>
-    <w:link w:val="KonuBal"/>
+  <w:style w:type="character" w:customStyle="1" w:styleId="TitleChar">
+    <w:name w:val="Title Char"/>
+    <w:basedOn w:val="DefaultParagraphFont"/>
+    <w:link w:val="Title"/>
     <w:uiPriority w:val="10"/>
     <w:rsid w:val="003E3F2A"/>
     <w:rPr>
@@ -5739,11 +7705,11 @@
       <w:szCs w:val="56"/>
     </w:rPr>
   </w:style>
-  <w:style w:type="paragraph" w:styleId="Altyaz">
+  <w:style w:type="paragraph" w:styleId="Subtitle">
     <w:name w:val="Subtitle"/>
     <w:basedOn w:val="Normal"/>
     <w:next w:val="Normal"/>
-    <w:link w:val="AltyazChar"/>
+    <w:link w:val="SubtitleChar"/>
     <w:uiPriority w:val="11"/>
     <w:qFormat/>
     <w:rsid w:val="003E3F2A"/>
@@ -5760,10 +7726,10 @@
       <w:szCs w:val="28"/>
     </w:rPr>
   </w:style>
-  <w:style w:type="character" w:customStyle="1" w:styleId="AltyazChar">
-    <w:name w:val="Altyazı Char"/>
-    <w:basedOn w:val="VarsaylanParagrafYazTipi"/>
-    <w:link w:val="Altyaz"/>
+  <w:style w:type="character" w:customStyle="1" w:styleId="SubtitleChar">
+    <w:name w:val="Subtitle Char"/>
+    <w:basedOn w:val="DefaultParagraphFont"/>
+    <w:link w:val="Subtitle"/>
     <w:uiPriority w:val="11"/>
     <w:rsid w:val="003E3F2A"/>
     <w:rPr>
@@ -5774,11 +7740,11 @@
       <w:szCs w:val="28"/>
     </w:rPr>
   </w:style>
-  <w:style w:type="paragraph" w:styleId="Alnt">
+  <w:style w:type="paragraph" w:styleId="Quote">
     <w:name w:val="Quote"/>
     <w:basedOn w:val="Normal"/>
     <w:next w:val="Normal"/>
-    <w:link w:val="AlntChar"/>
+    <w:link w:val="QuoteChar"/>
     <w:uiPriority w:val="29"/>
     <w:qFormat/>
     <w:rsid w:val="003E3F2A"/>
@@ -5792,10 +7758,10 @@
       <w:color w:val="404040" w:themeColor="text1" w:themeTint="BF"/>
     </w:rPr>
   </w:style>
-  <w:style w:type="character" w:customStyle="1" w:styleId="AlntChar">
-    <w:name w:val="Alıntı Char"/>
-    <w:basedOn w:val="VarsaylanParagrafYazTipi"/>
-    <w:link w:val="Alnt"/>
+  <w:style w:type="character" w:customStyle="1" w:styleId="QuoteChar">
+    <w:name w:val="Quote Char"/>
+    <w:basedOn w:val="DefaultParagraphFont"/>
+    <w:link w:val="Quote"/>
     <w:uiPriority w:val="29"/>
     <w:rsid w:val="003E3F2A"/>
     <w:rPr>
@@ -5804,7 +7770,7 @@
       <w:color w:val="404040" w:themeColor="text1" w:themeTint="BF"/>
     </w:rPr>
   </w:style>
-  <w:style w:type="paragraph" w:styleId="ListeParagraf">
+  <w:style w:type="paragraph" w:styleId="ListParagraph">
     <w:name w:val="List Paragraph"/>
     <w:basedOn w:val="Normal"/>
     <w:uiPriority w:val="34"/>
@@ -5815,9 +7781,9 @@
       <w:contextualSpacing/>
     </w:pPr>
   </w:style>
-  <w:style w:type="character" w:styleId="GlVurgulama">
+  <w:style w:type="character" w:styleId="IntenseEmphasis">
     <w:name w:val="Intense Emphasis"/>
-    <w:basedOn w:val="VarsaylanParagrafYazTipi"/>
+    <w:basedOn w:val="DefaultParagraphFont"/>
     <w:uiPriority w:val="21"/>
     <w:qFormat/>
     <w:rsid w:val="003E3F2A"/>
@@ -5827,11 +7793,11 @@
       <w:color w:val="2E74B5" w:themeColor="accent1" w:themeShade="BF"/>
     </w:rPr>
   </w:style>
-  <w:style w:type="paragraph" w:styleId="GlAlnt">
+  <w:style w:type="paragraph" w:styleId="IntenseQuote">
     <w:name w:val="Intense Quote"/>
     <w:basedOn w:val="Normal"/>
     <w:next w:val="Normal"/>
-    <w:link w:val="GlAlntChar"/>
+    <w:link w:val="IntenseQuoteChar"/>
     <w:uiPriority w:val="30"/>
     <w:qFormat/>
     <w:rsid w:val="003E3F2A"/>
@@ -5850,10 +7816,10 @@
       <w:color w:val="2E74B5" w:themeColor="accent1" w:themeShade="BF"/>
     </w:rPr>
   </w:style>
-  <w:style w:type="character" w:customStyle="1" w:styleId="GlAlntChar">
-    <w:name w:val="Güçlü Alıntı Char"/>
-    <w:basedOn w:val="VarsaylanParagrafYazTipi"/>
-    <w:link w:val="GlAlnt"/>
+  <w:style w:type="character" w:customStyle="1" w:styleId="IntenseQuoteChar">
+    <w:name w:val="Intense Quote Char"/>
+    <w:basedOn w:val="DefaultParagraphFont"/>
+    <w:link w:val="IntenseQuote"/>
     <w:uiPriority w:val="30"/>
     <w:rsid w:val="003E3F2A"/>
     <w:rPr>
@@ -5862,9 +7828,9 @@
       <w:color w:val="2E74B5" w:themeColor="accent1" w:themeShade="BF"/>
     </w:rPr>
   </w:style>
-  <w:style w:type="character" w:styleId="GlBavuru">
+  <w:style w:type="character" w:styleId="IntenseReference">
     <w:name w:val="Intense Reference"/>
-    <w:basedOn w:val="VarsaylanParagrafYazTipi"/>
+    <w:basedOn w:val="DefaultParagraphFont"/>
     <w:uiPriority w:val="32"/>
     <w:qFormat/>
     <w:rsid w:val="003E3F2A"/>
@@ -5876,9 +7842,9 @@
       <w:spacing w:val="5"/>
     </w:rPr>
   </w:style>
-  <w:style w:type="table" w:styleId="TabloKlavuzu">
+  <w:style w:type="table" w:styleId="TableGrid">
     <w:name w:val="Table Grid"/>
-    <w:basedOn w:val="NormalTablo"/>
+    <w:basedOn w:val="TableNormal"/>
     <w:uiPriority w:val="39"/>
     <w:rsid w:val="00E9790E"/>
     <w:pPr>
@@ -5894,6 +7860,38 @@
         <w:insideV w:val="single" w:sz="4" w:space="0" w:color="auto"/>
       </w:tblBorders>
     </w:tblPr>
+  </w:style>
+  <w:style w:type="paragraph" w:styleId="NormalWeb">
+    <w:name w:val="Normal (Web)"/>
+    <w:basedOn w:val="Normal"/>
+    <w:uiPriority w:val="99"/>
+    <w:unhideWhenUsed/>
+    <w:rsid w:val="00170EED"/>
+    <w:pPr>
+      <w:spacing w:before="100" w:beforeAutospacing="1" w:after="100" w:afterAutospacing="1" w:line="240" w:lineRule="auto"/>
+    </w:pPr>
+    <w:rPr>
+      <w:rFonts w:ascii="Times New Roman" w:eastAsia="Times New Roman" w:hAnsi="Times New Roman" w:cs="Times New Roman"/>
+      <w:sz w:val="24"/>
+      <w:szCs w:val="24"/>
+      <w:lang w:val="en-TR"/>
+    </w:rPr>
+  </w:style>
+  <w:style w:type="character" w:styleId="Strong">
+    <w:name w:val="Strong"/>
+    <w:basedOn w:val="DefaultParagraphFont"/>
+    <w:uiPriority w:val="22"/>
+    <w:qFormat/>
+    <w:rsid w:val="00170EED"/>
+    <w:rPr>
+      <w:b/>
+      <w:bCs/>
+    </w:rPr>
+  </w:style>
+  <w:style w:type="character" w:customStyle="1" w:styleId="apple-converted-space">
+    <w:name w:val="apple-converted-space"/>
+    <w:basedOn w:val="DefaultParagraphFont"/>
+    <w:rsid w:val="00170EED"/>
   </w:style>
 </w:styles>
 </file>

</xml_diff>

<commit_message>
Assignment 3: Part 4 is added to Design Document by Nehir Adak and Defne Saracel
</commit_message>
<xml_diff>
--- a/Assignment3/Design Document.docx
+++ b/Assignment3/Design Document.docx
@@ -199,13 +199,8 @@
         </w:numPr>
       </w:pPr>
       <w:r>
-        <w:t xml:space="preserve">Defne </w:t>
-      </w:r>
-      <w:proofErr w:type="spellStart"/>
-      <w:r>
-        <w:t>Saracel</w:t>
-      </w:r>
-      <w:proofErr w:type="spellEnd"/>
+        <w:t>Defne Saracel</w:t>
+      </w:r>
     </w:p>
     <w:p>
       <w:pPr>
@@ -784,58 +779,33 @@
         </w:rPr>
         <w:t xml:space="preserve">For database layer we use “Cloud </w:t>
       </w:r>
-      <w:proofErr w:type="spellStart"/>
       <w:r>
         <w:rPr>
           <w:sz w:val="24"/>
           <w:szCs w:val="24"/>
         </w:rPr>
-        <w:t>Firestore</w:t>
-      </w:r>
-      <w:proofErr w:type="spellEnd"/>
+        <w:t>Firestore” a</w:t>
+      </w:r>
       <w:r>
         <w:rPr>
           <w:sz w:val="24"/>
           <w:szCs w:val="24"/>
         </w:rPr>
-        <w:t>” a</w:t>
+        <w:t xml:space="preserve"> NoSQL document database. It helps system to store user profiles, daily survey results, earned badges and ranks while enabling real time updates.</w:t>
       </w:r>
       <w:r>
         <w:rPr>
           <w:sz w:val="24"/>
           <w:szCs w:val="24"/>
         </w:rPr>
-        <w:t xml:space="preserve"> NoSQL document database. It helps system to store user profiles, daily survey results, earned badges and ranks while enabling real time updates.</w:t>
+        <w:t xml:space="preserve"> </w:t>
       </w:r>
       <w:r>
         <w:rPr>
           <w:sz w:val="24"/>
           <w:szCs w:val="24"/>
         </w:rPr>
-        <w:t xml:space="preserve"> </w:t>
-      </w:r>
-      <w:r>
-        <w:rPr>
-          <w:sz w:val="24"/>
-          <w:szCs w:val="24"/>
-        </w:rPr>
-        <w:t xml:space="preserve">Service layer process the data fetched from </w:t>
-      </w:r>
-      <w:proofErr w:type="spellStart"/>
-      <w:r>
-        <w:rPr>
-          <w:sz w:val="24"/>
-          <w:szCs w:val="24"/>
-        </w:rPr>
-        <w:t>Firestore</w:t>
-      </w:r>
-      <w:proofErr w:type="spellEnd"/>
-      <w:r>
-        <w:rPr>
-          <w:sz w:val="24"/>
-          <w:szCs w:val="24"/>
-        </w:rPr>
-        <w:t xml:space="preserve"> which resides here. </w:t>
+        <w:t xml:space="preserve">Service layer process the data fetched from Firestore which resides here. </w:t>
       </w:r>
     </w:p>
     <w:p>
@@ -982,7 +952,7 @@
                     <pic:cNvPicPr/>
                   </pic:nvPicPr>
                   <pic:blipFill>
-                    <a:blip r:embed="rId5">
+                    <a:blip r:embed="rId6">
                       <a:extLst>
                         <a:ext uri="{28A0092B-C50C-407E-A947-70E740481C1C}">
                           <a14:useLocalDpi xmlns:a14="http://schemas.microsoft.com/office/drawing/2010/main" val="0"/>
@@ -1075,7 +1045,7 @@
                     <pic:cNvPicPr/>
                   </pic:nvPicPr>
                   <pic:blipFill>
-                    <a:blip r:embed="rId6">
+                    <a:blip r:embed="rId7">
                       <a:extLst>
                         <a:ext uri="{28A0092B-C50C-407E-A947-70E740481C1C}">
                           <a14:useLocalDpi xmlns:a14="http://schemas.microsoft.com/office/drawing/2010/main" val="0"/>
@@ -1190,17 +1160,8 @@
           <w:sz w:val="24"/>
           <w:szCs w:val="24"/>
         </w:rPr>
-        <w:t xml:space="preserve">Backend / Database: Cloud </w:t>
-      </w:r>
-      <w:proofErr w:type="spellStart"/>
-      <w:r>
-        <w:rPr>
-          <w:sz w:val="24"/>
-          <w:szCs w:val="24"/>
-        </w:rPr>
-        <w:t>Firestore</w:t>
-      </w:r>
-      <w:proofErr w:type="spellEnd"/>
+        <w:t>Backend / Database: Cloud Firestore</w:t>
+      </w:r>
     </w:p>
     <w:p>
       <w:pPr>
@@ -1414,27 +1375,7 @@
           <w:sz w:val="20"/>
           <w:lang w:val="en-GB"/>
         </w:rPr>
-        <w:t xml:space="preserve">├── </w:t>
-      </w:r>
-      <w:proofErr w:type="spellStart"/>
-      <w:proofErr w:type="gramStart"/>
-      <w:r>
-        <w:rPr>
-          <w:bCs/>
-          <w:sz w:val="20"/>
-          <w:lang w:val="en-GB"/>
-        </w:rPr>
-        <w:t>main.dart</w:t>
-      </w:r>
-      <w:proofErr w:type="spellEnd"/>
-      <w:proofErr w:type="gramEnd"/>
-      <w:r>
-        <w:rPr>
-          <w:bCs/>
-          <w:sz w:val="20"/>
-          <w:lang w:val="en-GB"/>
-        </w:rPr>
-        <w:t xml:space="preserve">                      # Firebase initialization + Provider setup</w:t>
+        <w:t>├── main.dart                      # Firebase initialization + Provider setup</w:t>
       </w:r>
     </w:p>
     <w:p>
@@ -1451,61 +1392,59 @@
           <w:sz w:val="20"/>
           <w:lang w:val="en-GB"/>
         </w:rPr>
-        <w:t xml:space="preserve">├── </w:t>
-      </w:r>
-      <w:proofErr w:type="spellStart"/>
-      <w:proofErr w:type="gramStart"/>
-      <w:r>
-        <w:rPr>
-          <w:bCs/>
-          <w:sz w:val="20"/>
-          <w:lang w:val="en-GB"/>
-        </w:rPr>
-        <w:t>app.dart</w:t>
-      </w:r>
-      <w:proofErr w:type="spellEnd"/>
-      <w:proofErr w:type="gramEnd"/>
-      <w:r>
-        <w:rPr>
-          <w:bCs/>
-          <w:sz w:val="20"/>
-          <w:lang w:val="en-GB"/>
-        </w:rPr>
-        <w:t xml:space="preserve">                       </w:t>
+        <w:t xml:space="preserve">├── app.dart                       </w:t>
       </w:r>
       <w:r>
         <w:rPr>
           <w:sz w:val="20"/>
           <w:szCs w:val="20"/>
         </w:rPr>
-        <w:t xml:space="preserve"># </w:t>
-      </w:r>
-      <w:proofErr w:type="spellStart"/>
-      <w:r>
-        <w:rPr>
+        <w:t># MaterialApp configuration (routes, theme)</w:t>
+      </w:r>
+    </w:p>
+    <w:p>
+      <w:pPr>
+        <w:spacing w:after="0" w:line="240" w:lineRule="auto"/>
+        <w:rPr>
+          <w:bCs/>
+          <w:sz w:val="20"/>
+          <w:lang w:val="en-GB"/>
+        </w:rPr>
+      </w:pPr>
+    </w:p>
+    <w:p>
+      <w:pPr>
+        <w:spacing w:after="0" w:line="240" w:lineRule="auto"/>
+        <w:rPr>
+          <w:bCs/>
           <w:sz w:val="20"/>
           <w:szCs w:val="20"/>
-        </w:rPr>
-        <w:t>MaterialApp</w:t>
-      </w:r>
-      <w:proofErr w:type="spellEnd"/>
+          <w:lang w:val="en-GB"/>
+        </w:rPr>
+      </w:pPr>
+      <w:r>
+        <w:rPr>
+          <w:bCs/>
+          <w:sz w:val="20"/>
+          <w:lang w:val="en-GB"/>
+        </w:rPr>
+        <w:t xml:space="preserve">├── models/       </w:t>
+      </w:r>
+      <w:r>
+        <w:rPr>
+          <w:bCs/>
+          <w:sz w:val="20"/>
+          <w:lang w:val="en-GB"/>
+        </w:rPr>
+        <w:t xml:space="preserve">                 </w:t>
+      </w:r>
       <w:r>
         <w:rPr>
           <w:sz w:val="20"/>
           <w:szCs w:val="20"/>
         </w:rPr>
-        <w:t xml:space="preserve"> configuration (routes, theme)</w:t>
-      </w:r>
-    </w:p>
-    <w:p>
-      <w:pPr>
-        <w:spacing w:after="0" w:line="240" w:lineRule="auto"/>
-        <w:rPr>
-          <w:bCs/>
-          <w:sz w:val="20"/>
-          <w:lang w:val="en-GB"/>
-        </w:rPr>
-      </w:pPr>
+        <w:t># DATABASE LAYER – Firestore data models</w:t>
+      </w:r>
     </w:p>
     <w:p>
       <w:pPr>
@@ -1521,40 +1460,73 @@
         <w:rPr>
           <w:bCs/>
           <w:sz w:val="20"/>
-          <w:lang w:val="en-GB"/>
-        </w:rPr>
-        <w:t xml:space="preserve">├── models/       </w:t>
-      </w:r>
-      <w:r>
+          <w:szCs w:val="20"/>
+          <w:lang w:val="en-GB"/>
+        </w:rPr>
+        <w:t>│   ├── user_model.dart</w:t>
+      </w:r>
+    </w:p>
+    <w:p>
+      <w:pPr>
+        <w:spacing w:after="0" w:line="240" w:lineRule="auto"/>
         <w:rPr>
           <w:bCs/>
           <w:sz w:val="20"/>
           <w:lang w:val="en-GB"/>
         </w:rPr>
-        <w:t xml:space="preserve">                 </w:t>
-      </w:r>
-      <w:r>
-        <w:rPr>
+      </w:pPr>
+      <w:r>
+        <w:rPr>
+          <w:bCs/>
+          <w:sz w:val="20"/>
+          <w:lang w:val="en-GB"/>
+        </w:rPr>
+        <w:t>│   └── survey_model.dart</w:t>
+      </w:r>
+    </w:p>
+    <w:p>
+      <w:pPr>
+        <w:spacing w:after="0" w:line="240" w:lineRule="auto"/>
+        <w:rPr>
+          <w:bCs/>
           <w:sz w:val="20"/>
           <w:szCs w:val="20"/>
-        </w:rPr>
-        <w:t xml:space="preserve"># DATABASE LAYER – </w:t>
-      </w:r>
-      <w:proofErr w:type="spellStart"/>
-      <w:r>
-        <w:rPr>
+          <w:lang w:val="en-GB"/>
+        </w:rPr>
+      </w:pPr>
+    </w:p>
+    <w:p>
+      <w:pPr>
+        <w:spacing w:after="0" w:line="240" w:lineRule="auto"/>
+        <w:rPr>
+          <w:bCs/>
           <w:sz w:val="20"/>
-          <w:szCs w:val="20"/>
-        </w:rPr>
-        <w:t>Firestore</w:t>
-      </w:r>
-      <w:proofErr w:type="spellEnd"/>
-      <w:r>
-        <w:rPr>
+          <w:lang w:val="en-GB"/>
+        </w:rPr>
+      </w:pPr>
+      <w:r>
+        <w:rPr>
+          <w:bCs/>
           <w:sz w:val="20"/>
-          <w:szCs w:val="20"/>
-        </w:rPr>
-        <w:t xml:space="preserve"> data models</w:t>
+          <w:lang w:val="en-GB"/>
+        </w:rPr>
+        <w:t xml:space="preserve">├── services/                      # </w:t>
+      </w:r>
+      <w:r>
+        <w:rPr>
+          <w:bCs/>
+          <w:sz w:val="20"/>
+          <w:lang w:val="en-GB"/>
+        </w:rPr>
+        <w:t>SERVICE LAYER</w:t>
+      </w:r>
+      <w:r>
+        <w:rPr>
+          <w:bCs/>
+          <w:sz w:val="20"/>
+          <w:lang w:val="en-GB"/>
+        </w:rPr>
+        <w:t xml:space="preserve"> </w:t>
       </w:r>
     </w:p>
     <w:p>
@@ -1563,7 +1535,6 @@
         <w:rPr>
           <w:bCs/>
           <w:sz w:val="20"/>
-          <w:szCs w:val="20"/>
           <w:lang w:val="en-GB"/>
         </w:rPr>
       </w:pPr>
@@ -1571,33 +1542,28 @@
         <w:rPr>
           <w:bCs/>
           <w:sz w:val="20"/>
-          <w:szCs w:val="20"/>
-          <w:lang w:val="en-GB"/>
-        </w:rPr>
-        <w:t xml:space="preserve">│   ├── </w:t>
-      </w:r>
-      <w:proofErr w:type="spellStart"/>
-      <w:r>
+          <w:lang w:val="en-GB"/>
+        </w:rPr>
+        <w:t xml:space="preserve">│   ├── providers/                 # state management </w:t>
+      </w:r>
+    </w:p>
+    <w:p>
+      <w:pPr>
+        <w:spacing w:after="0" w:line="240" w:lineRule="auto"/>
         <w:rPr>
           <w:bCs/>
           <w:sz w:val="20"/>
-          <w:szCs w:val="20"/>
-          <w:lang w:val="en-GB"/>
-        </w:rPr>
-        <w:t>user_</w:t>
-      </w:r>
-      <w:proofErr w:type="gramStart"/>
+          <w:lang w:val="en-GB"/>
+        </w:rPr>
+      </w:pPr>
       <w:r>
         <w:rPr>
           <w:bCs/>
           <w:sz w:val="20"/>
-          <w:szCs w:val="20"/>
-          <w:lang w:val="en-GB"/>
-        </w:rPr>
-        <w:t>model.dart</w:t>
-      </w:r>
-      <w:proofErr w:type="spellEnd"/>
-      <w:proofErr w:type="gramEnd"/>
+          <w:lang w:val="en-GB"/>
+        </w:rPr>
+        <w:t>│   │   └── auth_provider.dart</w:t>
+      </w:r>
     </w:p>
     <w:p>
       <w:pPr>
@@ -1614,28 +1580,26 @@
           <w:sz w:val="20"/>
           <w:lang w:val="en-GB"/>
         </w:rPr>
-        <w:t xml:space="preserve">│   └── </w:t>
-      </w:r>
-      <w:proofErr w:type="spellStart"/>
-      <w:r>
+        <w:t xml:space="preserve">│   │   └── survey_provider.dart   </w:t>
+      </w:r>
+    </w:p>
+    <w:p>
+      <w:pPr>
+        <w:spacing w:after="0" w:line="240" w:lineRule="auto"/>
         <w:rPr>
           <w:bCs/>
           <w:sz w:val="20"/>
           <w:lang w:val="en-GB"/>
         </w:rPr>
-        <w:t>survey_</w:t>
-      </w:r>
-      <w:proofErr w:type="gramStart"/>
+      </w:pPr>
       <w:r>
         <w:rPr>
           <w:bCs/>
           <w:sz w:val="20"/>
           <w:lang w:val="en-GB"/>
         </w:rPr>
-        <w:t>model.dart</w:t>
-      </w:r>
-      <w:proofErr w:type="spellEnd"/>
-      <w:proofErr w:type="gramEnd"/>
+        <w:t xml:space="preserve">│   │   └── review_provider.dart   </w:t>
+      </w:r>
     </w:p>
     <w:p>
       <w:pPr>
@@ -1643,10 +1607,17 @@
         <w:rPr>
           <w:bCs/>
           <w:sz w:val="20"/>
-          <w:szCs w:val="20"/>
-          <w:lang w:val="en-GB"/>
-        </w:rPr>
-      </w:pPr>
+          <w:lang w:val="en-GB"/>
+        </w:rPr>
+      </w:pPr>
+      <w:r>
+        <w:rPr>
+          <w:bCs/>
+          <w:sz w:val="20"/>
+          <w:lang w:val="en-GB"/>
+        </w:rPr>
+        <w:t>│   │</w:t>
+      </w:r>
     </w:p>
     <w:p>
       <w:pPr>
@@ -1657,29 +1628,41 @@
           <w:lang w:val="en-GB"/>
         </w:rPr>
       </w:pPr>
-      <w:r>
+    </w:p>
+    <w:p>
+      <w:pPr>
+        <w:spacing w:after="0" w:line="240" w:lineRule="auto"/>
         <w:rPr>
           <w:bCs/>
           <w:sz w:val="20"/>
           <w:lang w:val="en-GB"/>
         </w:rPr>
-        <w:t xml:space="preserve">├── services/                      # </w:t>
-      </w:r>
+      </w:pPr>
       <w:r>
         <w:rPr>
           <w:bCs/>
           <w:sz w:val="20"/>
           <w:lang w:val="en-GB"/>
         </w:rPr>
-        <w:t>SERVICE LAYER</w:t>
-      </w:r>
-      <w:r>
+        <w:t xml:space="preserve">│   ├── auth/                      </w:t>
+      </w:r>
+    </w:p>
+    <w:p>
+      <w:pPr>
+        <w:spacing w:after="0" w:line="240" w:lineRule="auto"/>
         <w:rPr>
           <w:bCs/>
           <w:sz w:val="20"/>
           <w:lang w:val="en-GB"/>
         </w:rPr>
-        <w:t xml:space="preserve"> </w:t>
+      </w:pPr>
+      <w:r>
+        <w:rPr>
+          <w:bCs/>
+          <w:sz w:val="20"/>
+          <w:lang w:val="en-GB"/>
+        </w:rPr>
+        <w:t>│   │   └── auth_service.dart      # login and register</w:t>
       </w:r>
     </w:p>
     <w:p>
@@ -1697,7 +1680,7 @@
           <w:sz w:val="20"/>
           <w:lang w:val="en-GB"/>
         </w:rPr>
-        <w:t xml:space="preserve">│   ├── providers/                 # state management </w:t>
+        <w:t>│   │</w:t>
       </w:r>
     </w:p>
     <w:p>
@@ -1709,34 +1692,32 @@
           <w:lang w:val="en-GB"/>
         </w:rPr>
       </w:pPr>
-      <w:r>
+    </w:p>
+    <w:p>
+      <w:pPr>
+        <w:spacing w:after="0" w:line="240" w:lineRule="auto"/>
         <w:rPr>
           <w:bCs/>
           <w:sz w:val="20"/>
           <w:lang w:val="en-GB"/>
         </w:rPr>
-        <w:t xml:space="preserve">│   │   └── </w:t>
-      </w:r>
-      <w:proofErr w:type="spellStart"/>
+      </w:pPr>
       <w:r>
         <w:rPr>
           <w:bCs/>
           <w:sz w:val="20"/>
           <w:lang w:val="en-GB"/>
         </w:rPr>
-        <w:t>auth_</w:t>
-      </w:r>
-      <w:proofErr w:type="gramStart"/>
+        <w:t>│   ├── firestore/                 # database acces</w:t>
+      </w:r>
       <w:r>
         <w:rPr>
           <w:bCs/>
           <w:sz w:val="20"/>
           <w:lang w:val="en-GB"/>
         </w:rPr>
-        <w:t>provider.dart</w:t>
-      </w:r>
-      <w:proofErr w:type="spellEnd"/>
-      <w:proofErr w:type="gramEnd"/>
+        <w:t>s</w:t>
+      </w:r>
     </w:p>
     <w:p>
       <w:pPr>
@@ -1753,35 +1734,43 @@
           <w:sz w:val="20"/>
           <w:lang w:val="en-GB"/>
         </w:rPr>
-        <w:t xml:space="preserve">│   │   └── </w:t>
-      </w:r>
-      <w:proofErr w:type="spellStart"/>
-      <w:r>
+        <w:t>│   │   └── user_service.dart</w:t>
+      </w:r>
+    </w:p>
+    <w:p>
+      <w:pPr>
+        <w:spacing w:after="0" w:line="240" w:lineRule="auto"/>
         <w:rPr>
           <w:bCs/>
           <w:sz w:val="20"/>
           <w:lang w:val="en-GB"/>
         </w:rPr>
-        <w:t>survey_</w:t>
-      </w:r>
-      <w:proofErr w:type="gramStart"/>
+      </w:pPr>
       <w:r>
         <w:rPr>
           <w:bCs/>
           <w:sz w:val="20"/>
           <w:lang w:val="en-GB"/>
         </w:rPr>
-        <w:t>provider.dart</w:t>
-      </w:r>
-      <w:proofErr w:type="spellEnd"/>
-      <w:proofErr w:type="gramEnd"/>
-      <w:r>
+        <w:t>│   │   └── survey_service.dart</w:t>
+      </w:r>
+    </w:p>
+    <w:p>
+      <w:pPr>
+        <w:spacing w:after="0" w:line="240" w:lineRule="auto"/>
         <w:rPr>
           <w:bCs/>
           <w:sz w:val="20"/>
           <w:lang w:val="en-GB"/>
         </w:rPr>
-        <w:t xml:space="preserve">   </w:t>
+      </w:pPr>
+      <w:r>
+        <w:rPr>
+          <w:bCs/>
+          <w:sz w:val="20"/>
+          <w:lang w:val="en-GB"/>
+        </w:rPr>
+        <w:t>│   │</w:t>
       </w:r>
     </w:p>
     <w:p>
@@ -1799,35 +1788,43 @@
           <w:sz w:val="20"/>
           <w:lang w:val="en-GB"/>
         </w:rPr>
-        <w:t xml:space="preserve">│   │   └── </w:t>
-      </w:r>
-      <w:proofErr w:type="spellStart"/>
-      <w:r>
+        <w:t xml:space="preserve">│   └── logic/                     </w:t>
+      </w:r>
+    </w:p>
+    <w:p>
+      <w:pPr>
+        <w:spacing w:after="0" w:line="240" w:lineRule="auto"/>
         <w:rPr>
           <w:bCs/>
           <w:sz w:val="20"/>
           <w:lang w:val="en-GB"/>
         </w:rPr>
-        <w:t>review_</w:t>
-      </w:r>
-      <w:proofErr w:type="gramStart"/>
+      </w:pPr>
       <w:r>
         <w:rPr>
           <w:bCs/>
           <w:sz w:val="20"/>
           <w:lang w:val="en-GB"/>
         </w:rPr>
-        <w:t>provider.dart</w:t>
-      </w:r>
-      <w:proofErr w:type="spellEnd"/>
-      <w:proofErr w:type="gramEnd"/>
-      <w:r>
+        <w:t>│       ├── score_calculator.dart</w:t>
+      </w:r>
+    </w:p>
+    <w:p>
+      <w:pPr>
+        <w:spacing w:after="0" w:line="240" w:lineRule="auto"/>
         <w:rPr>
           <w:bCs/>
           <w:sz w:val="20"/>
           <w:lang w:val="en-GB"/>
         </w:rPr>
-        <w:t xml:space="preserve">   </w:t>
+      </w:pPr>
+      <w:r>
+        <w:rPr>
+          <w:bCs/>
+          <w:sz w:val="20"/>
+          <w:lang w:val="en-GB"/>
+        </w:rPr>
+        <w:t xml:space="preserve">│       └── review_generator.dart  </w:t>
       </w:r>
     </w:p>
     <w:p>
@@ -1839,13 +1836,47 @@
           <w:lang w:val="en-GB"/>
         </w:rPr>
       </w:pPr>
-      <w:r>
+    </w:p>
+    <w:p>
+      <w:pPr>
+        <w:spacing w:after="0" w:line="240" w:lineRule="auto"/>
         <w:rPr>
           <w:bCs/>
           <w:sz w:val="20"/>
           <w:lang w:val="en-GB"/>
         </w:rPr>
-        <w:t>│   │</w:t>
+      </w:pPr>
+      <w:r>
+        <w:rPr>
+          <w:bCs/>
+          <w:sz w:val="20"/>
+          <w:lang w:val="en-GB"/>
+        </w:rPr>
+        <w:t xml:space="preserve">├── screens/                       # </w:t>
+      </w:r>
+      <w:r>
+        <w:rPr>
+          <w:bCs/>
+          <w:sz w:val="20"/>
+          <w:lang w:val="en-GB"/>
+        </w:rPr>
+        <w:t xml:space="preserve"> PRESENTATION LAYER- </w:t>
+      </w:r>
+      <w:r>
+        <w:rPr>
+          <w:bCs/>
+          <w:sz w:val="20"/>
+          <w:lang w:val="en-GB"/>
+        </w:rPr>
+        <w:t xml:space="preserve">UI </w:t>
+      </w:r>
+      <w:r>
+        <w:rPr>
+          <w:bCs/>
+          <w:sz w:val="20"/>
+          <w:lang w:val="en-GB"/>
+        </w:rPr>
+        <w:t>screens</w:t>
       </w:r>
     </w:p>
     <w:p>
@@ -1857,6 +1888,14 @@
           <w:lang w:val="en-GB"/>
         </w:rPr>
       </w:pPr>
+      <w:r>
+        <w:rPr>
+          <w:bCs/>
+          <w:sz w:val="20"/>
+          <w:lang w:val="en-GB"/>
+        </w:rPr>
+        <w:t>│   ├── auth/</w:t>
+      </w:r>
     </w:p>
     <w:p>
       <w:pPr>
@@ -1873,7 +1912,7 @@
           <w:sz w:val="20"/>
           <w:lang w:val="en-GB"/>
         </w:rPr>
-        <w:t xml:space="preserve">│   ├── auth/                      </w:t>
+        <w:t>│   │   ├── login_screen.dart</w:t>
       </w:r>
     </w:p>
     <w:p>
@@ -1891,35 +1930,43 @@
           <w:sz w:val="20"/>
           <w:lang w:val="en-GB"/>
         </w:rPr>
-        <w:t xml:space="preserve">│   │   └── </w:t>
-      </w:r>
-      <w:proofErr w:type="spellStart"/>
-      <w:r>
+        <w:t>│   │   └── register_screen.dart</w:t>
+      </w:r>
+    </w:p>
+    <w:p>
+      <w:pPr>
+        <w:spacing w:after="0" w:line="240" w:lineRule="auto"/>
         <w:rPr>
           <w:bCs/>
           <w:sz w:val="20"/>
           <w:lang w:val="en-GB"/>
         </w:rPr>
-        <w:t>auth_</w:t>
-      </w:r>
-      <w:proofErr w:type="gramStart"/>
+      </w:pPr>
       <w:r>
         <w:rPr>
           <w:bCs/>
           <w:sz w:val="20"/>
           <w:lang w:val="en-GB"/>
         </w:rPr>
-        <w:t>service.dart</w:t>
-      </w:r>
-      <w:proofErr w:type="spellEnd"/>
-      <w:proofErr w:type="gramEnd"/>
-      <w:r>
+        <w:t>│   ├── home/</w:t>
+      </w:r>
+    </w:p>
+    <w:p>
+      <w:pPr>
+        <w:spacing w:after="0" w:line="240" w:lineRule="auto"/>
         <w:rPr>
           <w:bCs/>
           <w:sz w:val="20"/>
           <w:lang w:val="en-GB"/>
         </w:rPr>
-        <w:t xml:space="preserve">      # login and register</w:t>
+      </w:pPr>
+      <w:r>
+        <w:rPr>
+          <w:bCs/>
+          <w:sz w:val="20"/>
+          <w:lang w:val="en-GB"/>
+        </w:rPr>
+        <w:t>│   │   └── home_screen.dart</w:t>
       </w:r>
     </w:p>
     <w:p>
@@ -1937,7 +1984,7 @@
           <w:sz w:val="20"/>
           <w:lang w:val="en-GB"/>
         </w:rPr>
-        <w:t>│   │</w:t>
+        <w:t>│   ├── survey/</w:t>
       </w:r>
     </w:p>
     <w:p>
@@ -1949,6 +1996,14 @@
           <w:lang w:val="en-GB"/>
         </w:rPr>
       </w:pPr>
+      <w:r>
+        <w:rPr>
+          <w:bCs/>
+          <w:sz w:val="20"/>
+          <w:lang w:val="en-GB"/>
+        </w:rPr>
+        <w:t>│   │   └── survey_screen.dart</w:t>
+      </w:r>
     </w:p>
     <w:p>
       <w:pPr>
@@ -1961,29 +2016,38 @@
       </w:pPr>
       <w:r>
         <w:rPr>
+          <w:b/>
           <w:bCs/>
           <w:sz w:val="20"/>
           <w:lang w:val="en-GB"/>
         </w:rPr>
-        <w:t xml:space="preserve">│   ├── </w:t>
-      </w:r>
-      <w:proofErr w:type="spellStart"/>
+        <w:t xml:space="preserve">│   </w:t>
+      </w:r>
       <w:r>
         <w:rPr>
           <w:bCs/>
           <w:sz w:val="20"/>
           <w:lang w:val="en-GB"/>
         </w:rPr>
-        <w:t>firestore</w:t>
-      </w:r>
-      <w:proofErr w:type="spellEnd"/>
-      <w:r>
+        <w:t>└── history/</w:t>
+      </w:r>
+    </w:p>
+    <w:p>
+      <w:pPr>
+        <w:spacing w:after="0" w:line="240" w:lineRule="auto"/>
         <w:rPr>
           <w:bCs/>
           <w:sz w:val="20"/>
           <w:lang w:val="en-GB"/>
         </w:rPr>
-        <w:t>/                 # database access</w:t>
+      </w:pPr>
+      <w:r>
+        <w:rPr>
+          <w:bCs/>
+          <w:sz w:val="20"/>
+          <w:lang w:val="en-GB"/>
+        </w:rPr>
+        <w:t>│       └── history_screen.dart</w:t>
       </w:r>
     </w:p>
     <w:p>
@@ -1995,34 +2059,40 @@
           <w:lang w:val="en-GB"/>
         </w:rPr>
       </w:pPr>
-      <w:r>
+    </w:p>
+    <w:p>
+      <w:pPr>
+        <w:spacing w:after="0" w:line="240" w:lineRule="auto"/>
         <w:rPr>
           <w:bCs/>
           <w:sz w:val="20"/>
           <w:lang w:val="en-GB"/>
         </w:rPr>
-        <w:t xml:space="preserve">│   │   └── </w:t>
-      </w:r>
-      <w:proofErr w:type="spellStart"/>
+      </w:pPr>
       <w:r>
         <w:rPr>
           <w:bCs/>
           <w:sz w:val="20"/>
           <w:lang w:val="en-GB"/>
         </w:rPr>
-        <w:t>user_</w:t>
-      </w:r>
-      <w:proofErr w:type="gramStart"/>
+        <w:t xml:space="preserve">├── widgets/                       # </w:t>
+      </w:r>
       <w:r>
         <w:rPr>
           <w:bCs/>
           <w:sz w:val="20"/>
           <w:lang w:val="en-GB"/>
         </w:rPr>
-        <w:t>service.dart</w:t>
-      </w:r>
-      <w:proofErr w:type="spellEnd"/>
-      <w:proofErr w:type="gramEnd"/>
+        <w:t xml:space="preserve">PRESENTATION LAYER- </w:t>
+      </w:r>
+      <w:r>
+        <w:rPr>
+          <w:bCs/>
+          <w:sz w:val="20"/>
+          <w:lang w:val="en-GB"/>
+        </w:rPr>
+        <w:t>reusable UI components</w:t>
+      </w:r>
     </w:p>
     <w:p>
       <w:pPr>
@@ -2039,28 +2109,26 @@
           <w:sz w:val="20"/>
           <w:lang w:val="en-GB"/>
         </w:rPr>
-        <w:t xml:space="preserve">│   │   └── </w:t>
-      </w:r>
-      <w:proofErr w:type="spellStart"/>
-      <w:r>
+        <w:t>│   ├── common/</w:t>
+      </w:r>
+    </w:p>
+    <w:p>
+      <w:pPr>
+        <w:spacing w:after="0" w:line="240" w:lineRule="auto"/>
         <w:rPr>
           <w:bCs/>
           <w:sz w:val="20"/>
           <w:lang w:val="en-GB"/>
         </w:rPr>
-        <w:t>survey_</w:t>
-      </w:r>
-      <w:proofErr w:type="gramStart"/>
+      </w:pPr>
       <w:r>
         <w:rPr>
           <w:bCs/>
           <w:sz w:val="20"/>
           <w:lang w:val="en-GB"/>
         </w:rPr>
-        <w:t>service.dart</w:t>
-      </w:r>
-      <w:proofErr w:type="spellEnd"/>
-      <w:proofErr w:type="gramEnd"/>
+        <w:t>│   │   ├── custom_button.dart</w:t>
+      </w:r>
     </w:p>
     <w:p>
       <w:pPr>
@@ -2077,7 +2145,7 @@
           <w:sz w:val="20"/>
           <w:lang w:val="en-GB"/>
         </w:rPr>
-        <w:t>│   │</w:t>
+        <w:t>│   │   └── theme_toggle.dart</w:t>
       </w:r>
     </w:p>
     <w:p>
@@ -2095,7 +2163,7 @@
           <w:sz w:val="20"/>
           <w:lang w:val="en-GB"/>
         </w:rPr>
-        <w:t xml:space="preserve">│   └── logic/                     </w:t>
+        <w:t>│   ├── survey/</w:t>
       </w:r>
     </w:p>
     <w:p>
@@ -2113,28 +2181,26 @@
           <w:sz w:val="20"/>
           <w:lang w:val="en-GB"/>
         </w:rPr>
-        <w:t xml:space="preserve">│       ├── </w:t>
-      </w:r>
-      <w:proofErr w:type="spellStart"/>
-      <w:r>
+        <w:t>│   │   └── survey_question.dart</w:t>
+      </w:r>
+    </w:p>
+    <w:p>
+      <w:pPr>
+        <w:spacing w:after="0" w:line="240" w:lineRule="auto"/>
         <w:rPr>
           <w:bCs/>
           <w:sz w:val="20"/>
           <w:lang w:val="en-GB"/>
         </w:rPr>
-        <w:t>score_</w:t>
-      </w:r>
-      <w:proofErr w:type="gramStart"/>
+      </w:pPr>
       <w:r>
         <w:rPr>
           <w:bCs/>
           <w:sz w:val="20"/>
           <w:lang w:val="en-GB"/>
         </w:rPr>
-        <w:t>calculator.dart</w:t>
-      </w:r>
-      <w:proofErr w:type="spellEnd"/>
-      <w:proofErr w:type="gramEnd"/>
+        <w:t>│   └── history/</w:t>
+      </w:r>
     </w:p>
     <w:p>
       <w:pPr>
@@ -2151,635 +2217,16 @@
           <w:sz w:val="20"/>
           <w:lang w:val="en-GB"/>
         </w:rPr>
-        <w:t xml:space="preserve">│       └── </w:t>
-      </w:r>
-      <w:proofErr w:type="spellStart"/>
+        <w:t xml:space="preserve">│   </w:t>
+      </w:r>
       <w:r>
         <w:rPr>
           <w:bCs/>
           <w:sz w:val="20"/>
           <w:lang w:val="en-GB"/>
         </w:rPr>
-        <w:t>review_</w:t>
-      </w:r>
-      <w:proofErr w:type="gramStart"/>
-      <w:r>
-        <w:rPr>
-          <w:bCs/>
-          <w:sz w:val="20"/>
-          <w:lang w:val="en-GB"/>
-        </w:rPr>
-        <w:t>generator.dart</w:t>
-      </w:r>
-      <w:proofErr w:type="spellEnd"/>
-      <w:proofErr w:type="gramEnd"/>
-      <w:r>
-        <w:rPr>
-          <w:bCs/>
-          <w:sz w:val="20"/>
-          <w:lang w:val="en-GB"/>
-        </w:rPr>
-        <w:t xml:space="preserve">  </w:t>
-      </w:r>
-    </w:p>
-    <w:p>
-      <w:pPr>
-        <w:spacing w:after="0" w:line="240" w:lineRule="auto"/>
-        <w:rPr>
-          <w:bCs/>
-          <w:sz w:val="20"/>
-          <w:lang w:val="en-GB"/>
-        </w:rPr>
-      </w:pPr>
-    </w:p>
-    <w:p>
-      <w:pPr>
-        <w:spacing w:after="0" w:line="240" w:lineRule="auto"/>
-        <w:rPr>
-          <w:bCs/>
-          <w:sz w:val="20"/>
-          <w:lang w:val="en-GB"/>
-        </w:rPr>
-      </w:pPr>
-      <w:r>
-        <w:rPr>
-          <w:bCs/>
-          <w:sz w:val="20"/>
-          <w:lang w:val="en-GB"/>
-        </w:rPr>
-        <w:t xml:space="preserve">├── screens/                       </w:t>
-      </w:r>
-      <w:proofErr w:type="gramStart"/>
-      <w:r>
-        <w:rPr>
-          <w:bCs/>
-          <w:sz w:val="20"/>
-          <w:lang w:val="en-GB"/>
-        </w:rPr>
-        <w:t xml:space="preserve"># </w:t>
-      </w:r>
-      <w:r>
-        <w:rPr>
-          <w:bCs/>
-          <w:sz w:val="20"/>
-          <w:lang w:val="en-GB"/>
-        </w:rPr>
-        <w:t xml:space="preserve"> PRESENTATION</w:t>
-      </w:r>
-      <w:proofErr w:type="gramEnd"/>
-      <w:r>
-        <w:rPr>
-          <w:bCs/>
-          <w:sz w:val="20"/>
-          <w:lang w:val="en-GB"/>
-        </w:rPr>
-        <w:t xml:space="preserve"> LAYER- </w:t>
-      </w:r>
-      <w:r>
-        <w:rPr>
-          <w:bCs/>
-          <w:sz w:val="20"/>
-          <w:lang w:val="en-GB"/>
-        </w:rPr>
-        <w:t xml:space="preserve">UI </w:t>
-      </w:r>
-      <w:r>
-        <w:rPr>
-          <w:bCs/>
-          <w:sz w:val="20"/>
-          <w:lang w:val="en-GB"/>
-        </w:rPr>
-        <w:t>screens</w:t>
-      </w:r>
-    </w:p>
-    <w:p>
-      <w:pPr>
-        <w:spacing w:after="0" w:line="240" w:lineRule="auto"/>
-        <w:rPr>
-          <w:bCs/>
-          <w:sz w:val="20"/>
-          <w:lang w:val="en-GB"/>
-        </w:rPr>
-      </w:pPr>
-      <w:r>
-        <w:rPr>
-          <w:bCs/>
-          <w:sz w:val="20"/>
-          <w:lang w:val="en-GB"/>
-        </w:rPr>
-        <w:t>│   ├── auth/</w:t>
-      </w:r>
-    </w:p>
-    <w:p>
-      <w:pPr>
-        <w:spacing w:after="0" w:line="240" w:lineRule="auto"/>
-        <w:rPr>
-          <w:bCs/>
-          <w:sz w:val="20"/>
-          <w:lang w:val="en-GB"/>
-        </w:rPr>
-      </w:pPr>
-      <w:r>
-        <w:rPr>
-          <w:bCs/>
-          <w:sz w:val="20"/>
-          <w:lang w:val="en-GB"/>
-        </w:rPr>
-        <w:t xml:space="preserve">│   │   ├── </w:t>
-      </w:r>
-      <w:proofErr w:type="spellStart"/>
-      <w:r>
-        <w:rPr>
-          <w:bCs/>
-          <w:sz w:val="20"/>
-          <w:lang w:val="en-GB"/>
-        </w:rPr>
-        <w:t>login_</w:t>
-      </w:r>
-      <w:proofErr w:type="gramStart"/>
-      <w:r>
-        <w:rPr>
-          <w:bCs/>
-          <w:sz w:val="20"/>
-          <w:lang w:val="en-GB"/>
-        </w:rPr>
-        <w:t>screen.dart</w:t>
-      </w:r>
-      <w:proofErr w:type="spellEnd"/>
-      <w:proofErr w:type="gramEnd"/>
-    </w:p>
-    <w:p>
-      <w:pPr>
-        <w:spacing w:after="0" w:line="240" w:lineRule="auto"/>
-        <w:rPr>
-          <w:bCs/>
-          <w:sz w:val="20"/>
-          <w:lang w:val="en-GB"/>
-        </w:rPr>
-      </w:pPr>
-      <w:r>
-        <w:rPr>
-          <w:bCs/>
-          <w:sz w:val="20"/>
-          <w:lang w:val="en-GB"/>
-        </w:rPr>
-        <w:t xml:space="preserve">│   │   └── </w:t>
-      </w:r>
-      <w:proofErr w:type="spellStart"/>
-      <w:r>
-        <w:rPr>
-          <w:bCs/>
-          <w:sz w:val="20"/>
-          <w:lang w:val="en-GB"/>
-        </w:rPr>
-        <w:t>register_</w:t>
-      </w:r>
-      <w:proofErr w:type="gramStart"/>
-      <w:r>
-        <w:rPr>
-          <w:bCs/>
-          <w:sz w:val="20"/>
-          <w:lang w:val="en-GB"/>
-        </w:rPr>
-        <w:t>screen.dart</w:t>
-      </w:r>
-      <w:proofErr w:type="spellEnd"/>
-      <w:proofErr w:type="gramEnd"/>
-    </w:p>
-    <w:p>
-      <w:pPr>
-        <w:spacing w:after="0" w:line="240" w:lineRule="auto"/>
-        <w:rPr>
-          <w:bCs/>
-          <w:sz w:val="20"/>
-          <w:lang w:val="en-GB"/>
-        </w:rPr>
-      </w:pPr>
-      <w:r>
-        <w:rPr>
-          <w:bCs/>
-          <w:sz w:val="20"/>
-          <w:lang w:val="en-GB"/>
-        </w:rPr>
-        <w:t>│   ├── home/</w:t>
-      </w:r>
-    </w:p>
-    <w:p>
-      <w:pPr>
-        <w:spacing w:after="0" w:line="240" w:lineRule="auto"/>
-        <w:rPr>
-          <w:bCs/>
-          <w:sz w:val="20"/>
-          <w:lang w:val="en-GB"/>
-        </w:rPr>
-      </w:pPr>
-      <w:r>
-        <w:rPr>
-          <w:bCs/>
-          <w:sz w:val="20"/>
-          <w:lang w:val="en-GB"/>
-        </w:rPr>
-        <w:t xml:space="preserve">│   │   └── </w:t>
-      </w:r>
-      <w:proofErr w:type="spellStart"/>
-      <w:r>
-        <w:rPr>
-          <w:bCs/>
-          <w:sz w:val="20"/>
-          <w:lang w:val="en-GB"/>
-        </w:rPr>
-        <w:t>home_</w:t>
-      </w:r>
-      <w:proofErr w:type="gramStart"/>
-      <w:r>
-        <w:rPr>
-          <w:bCs/>
-          <w:sz w:val="20"/>
-          <w:lang w:val="en-GB"/>
-        </w:rPr>
-        <w:t>screen.dart</w:t>
-      </w:r>
-      <w:proofErr w:type="spellEnd"/>
-      <w:proofErr w:type="gramEnd"/>
-    </w:p>
-    <w:p>
-      <w:pPr>
-        <w:spacing w:after="0" w:line="240" w:lineRule="auto"/>
-        <w:rPr>
-          <w:bCs/>
-          <w:sz w:val="20"/>
-          <w:lang w:val="en-GB"/>
-        </w:rPr>
-      </w:pPr>
-      <w:r>
-        <w:rPr>
-          <w:bCs/>
-          <w:sz w:val="20"/>
-          <w:lang w:val="en-GB"/>
-        </w:rPr>
-        <w:t>│   ├── survey/</w:t>
-      </w:r>
-    </w:p>
-    <w:p>
-      <w:pPr>
-        <w:spacing w:after="0" w:line="240" w:lineRule="auto"/>
-        <w:rPr>
-          <w:bCs/>
-          <w:sz w:val="20"/>
-          <w:lang w:val="en-GB"/>
-        </w:rPr>
-      </w:pPr>
-      <w:r>
-        <w:rPr>
-          <w:bCs/>
-          <w:sz w:val="20"/>
-          <w:lang w:val="en-GB"/>
-        </w:rPr>
-        <w:t xml:space="preserve">│   │   └── </w:t>
-      </w:r>
-      <w:proofErr w:type="spellStart"/>
-      <w:r>
-        <w:rPr>
-          <w:bCs/>
-          <w:sz w:val="20"/>
-          <w:lang w:val="en-GB"/>
-        </w:rPr>
-        <w:t>survey_</w:t>
-      </w:r>
-      <w:proofErr w:type="gramStart"/>
-      <w:r>
-        <w:rPr>
-          <w:bCs/>
-          <w:sz w:val="20"/>
-          <w:lang w:val="en-GB"/>
-        </w:rPr>
-        <w:t>screen.dart</w:t>
-      </w:r>
-      <w:proofErr w:type="spellEnd"/>
-      <w:proofErr w:type="gramEnd"/>
-    </w:p>
-    <w:p>
-      <w:pPr>
-        <w:spacing w:after="0" w:line="240" w:lineRule="auto"/>
-        <w:rPr>
-          <w:bCs/>
-          <w:sz w:val="20"/>
-          <w:lang w:val="en-GB"/>
-        </w:rPr>
-      </w:pPr>
-      <w:r>
-        <w:rPr>
-          <w:b/>
-          <w:bCs/>
-          <w:sz w:val="20"/>
-          <w:lang w:val="en-GB"/>
-        </w:rPr>
-        <w:t xml:space="preserve">│   </w:t>
-      </w:r>
-      <w:r>
-        <w:rPr>
-          <w:bCs/>
-          <w:sz w:val="20"/>
-          <w:lang w:val="en-GB"/>
-        </w:rPr>
-        <w:t>└── history/</w:t>
-      </w:r>
-    </w:p>
-    <w:p>
-      <w:pPr>
-        <w:spacing w:after="0" w:line="240" w:lineRule="auto"/>
-        <w:rPr>
-          <w:bCs/>
-          <w:sz w:val="20"/>
-          <w:lang w:val="en-GB"/>
-        </w:rPr>
-      </w:pPr>
-      <w:r>
-        <w:rPr>
-          <w:bCs/>
-          <w:sz w:val="20"/>
-          <w:lang w:val="en-GB"/>
-        </w:rPr>
-        <w:t xml:space="preserve">│       └── </w:t>
-      </w:r>
-      <w:proofErr w:type="spellStart"/>
-      <w:r>
-        <w:rPr>
-          <w:bCs/>
-          <w:sz w:val="20"/>
-          <w:lang w:val="en-GB"/>
-        </w:rPr>
-        <w:t>history_</w:t>
-      </w:r>
-      <w:proofErr w:type="gramStart"/>
-      <w:r>
-        <w:rPr>
-          <w:bCs/>
-          <w:sz w:val="20"/>
-          <w:lang w:val="en-GB"/>
-        </w:rPr>
-        <w:t>screen.dart</w:t>
-      </w:r>
-      <w:proofErr w:type="spellEnd"/>
-      <w:proofErr w:type="gramEnd"/>
-    </w:p>
-    <w:p>
-      <w:pPr>
-        <w:spacing w:after="0" w:line="240" w:lineRule="auto"/>
-        <w:rPr>
-          <w:bCs/>
-          <w:sz w:val="20"/>
-          <w:lang w:val="en-GB"/>
-        </w:rPr>
-      </w:pPr>
-    </w:p>
-    <w:p>
-      <w:pPr>
-        <w:spacing w:after="0" w:line="240" w:lineRule="auto"/>
-        <w:rPr>
-          <w:bCs/>
-          <w:sz w:val="20"/>
-          <w:lang w:val="en-GB"/>
-        </w:rPr>
-      </w:pPr>
-      <w:r>
-        <w:rPr>
-          <w:bCs/>
-          <w:sz w:val="20"/>
-          <w:lang w:val="en-GB"/>
-        </w:rPr>
-        <w:t xml:space="preserve">├── widgets/                       # </w:t>
-      </w:r>
-      <w:r>
-        <w:rPr>
-          <w:bCs/>
-          <w:sz w:val="20"/>
-          <w:lang w:val="en-GB"/>
-        </w:rPr>
-        <w:t xml:space="preserve">PRESENTATION LAYER- </w:t>
-      </w:r>
-      <w:r>
-        <w:rPr>
-          <w:bCs/>
-          <w:sz w:val="20"/>
-          <w:lang w:val="en-GB"/>
-        </w:rPr>
-        <w:t>reusable UI components</w:t>
-      </w:r>
-    </w:p>
-    <w:p>
-      <w:pPr>
-        <w:spacing w:after="0" w:line="240" w:lineRule="auto"/>
-        <w:rPr>
-          <w:bCs/>
-          <w:sz w:val="20"/>
-          <w:lang w:val="en-GB"/>
-        </w:rPr>
-      </w:pPr>
-      <w:r>
-        <w:rPr>
-          <w:bCs/>
-          <w:sz w:val="20"/>
-          <w:lang w:val="en-GB"/>
-        </w:rPr>
-        <w:t>│   ├── common/</w:t>
-      </w:r>
-    </w:p>
-    <w:p>
-      <w:pPr>
-        <w:spacing w:after="0" w:line="240" w:lineRule="auto"/>
-        <w:rPr>
-          <w:bCs/>
-          <w:sz w:val="20"/>
-          <w:lang w:val="en-GB"/>
-        </w:rPr>
-      </w:pPr>
-      <w:r>
-        <w:rPr>
-          <w:bCs/>
-          <w:sz w:val="20"/>
-          <w:lang w:val="en-GB"/>
-        </w:rPr>
-        <w:t xml:space="preserve">│   │   ├── </w:t>
-      </w:r>
-      <w:proofErr w:type="spellStart"/>
-      <w:r>
-        <w:rPr>
-          <w:bCs/>
-          <w:sz w:val="20"/>
-          <w:lang w:val="en-GB"/>
-        </w:rPr>
-        <w:t>custom_</w:t>
-      </w:r>
-      <w:proofErr w:type="gramStart"/>
-      <w:r>
-        <w:rPr>
-          <w:bCs/>
-          <w:sz w:val="20"/>
-          <w:lang w:val="en-GB"/>
-        </w:rPr>
-        <w:t>button.dart</w:t>
-      </w:r>
-      <w:proofErr w:type="spellEnd"/>
-      <w:proofErr w:type="gramEnd"/>
-    </w:p>
-    <w:p>
-      <w:pPr>
-        <w:spacing w:after="0" w:line="240" w:lineRule="auto"/>
-        <w:rPr>
-          <w:bCs/>
-          <w:sz w:val="20"/>
-          <w:lang w:val="en-GB"/>
-        </w:rPr>
-      </w:pPr>
-      <w:r>
-        <w:rPr>
-          <w:bCs/>
-          <w:sz w:val="20"/>
-          <w:lang w:val="en-GB"/>
-        </w:rPr>
-        <w:t xml:space="preserve">│   │   └── </w:t>
-      </w:r>
-      <w:proofErr w:type="spellStart"/>
-      <w:r>
-        <w:rPr>
-          <w:bCs/>
-          <w:sz w:val="20"/>
-          <w:lang w:val="en-GB"/>
-        </w:rPr>
-        <w:t>theme_</w:t>
-      </w:r>
-      <w:proofErr w:type="gramStart"/>
-      <w:r>
-        <w:rPr>
-          <w:bCs/>
-          <w:sz w:val="20"/>
-          <w:lang w:val="en-GB"/>
-        </w:rPr>
-        <w:t>toggle.dart</w:t>
-      </w:r>
-      <w:proofErr w:type="spellEnd"/>
-      <w:proofErr w:type="gramEnd"/>
-    </w:p>
-    <w:p>
-      <w:pPr>
-        <w:spacing w:after="0" w:line="240" w:lineRule="auto"/>
-        <w:rPr>
-          <w:bCs/>
-          <w:sz w:val="20"/>
-          <w:lang w:val="en-GB"/>
-        </w:rPr>
-      </w:pPr>
-      <w:r>
-        <w:rPr>
-          <w:bCs/>
-          <w:sz w:val="20"/>
-          <w:lang w:val="en-GB"/>
-        </w:rPr>
-        <w:t>│   ├── survey/</w:t>
-      </w:r>
-    </w:p>
-    <w:p>
-      <w:pPr>
-        <w:spacing w:after="0" w:line="240" w:lineRule="auto"/>
-        <w:rPr>
-          <w:bCs/>
-          <w:sz w:val="20"/>
-          <w:lang w:val="en-GB"/>
-        </w:rPr>
-      </w:pPr>
-      <w:r>
-        <w:rPr>
-          <w:bCs/>
-          <w:sz w:val="20"/>
-          <w:lang w:val="en-GB"/>
-        </w:rPr>
-        <w:t xml:space="preserve">│   │   └── </w:t>
-      </w:r>
-      <w:proofErr w:type="spellStart"/>
-      <w:r>
-        <w:rPr>
-          <w:bCs/>
-          <w:sz w:val="20"/>
-          <w:lang w:val="en-GB"/>
-        </w:rPr>
-        <w:t>survey_</w:t>
-      </w:r>
-      <w:proofErr w:type="gramStart"/>
-      <w:r>
-        <w:rPr>
-          <w:bCs/>
-          <w:sz w:val="20"/>
-          <w:lang w:val="en-GB"/>
-        </w:rPr>
-        <w:t>question.dart</w:t>
-      </w:r>
-      <w:proofErr w:type="spellEnd"/>
-      <w:proofErr w:type="gramEnd"/>
-    </w:p>
-    <w:p>
-      <w:pPr>
-        <w:spacing w:after="0" w:line="240" w:lineRule="auto"/>
-        <w:rPr>
-          <w:bCs/>
-          <w:sz w:val="20"/>
-          <w:lang w:val="en-GB"/>
-        </w:rPr>
-      </w:pPr>
-      <w:r>
-        <w:rPr>
-          <w:bCs/>
-          <w:sz w:val="20"/>
-          <w:lang w:val="en-GB"/>
-        </w:rPr>
-        <w:t>│   └── history/</w:t>
-      </w:r>
-    </w:p>
-    <w:p>
-      <w:pPr>
-        <w:spacing w:after="0" w:line="240" w:lineRule="auto"/>
-        <w:rPr>
-          <w:bCs/>
-          <w:sz w:val="20"/>
-          <w:lang w:val="en-GB"/>
-        </w:rPr>
-      </w:pPr>
-      <w:r>
-        <w:rPr>
-          <w:bCs/>
-          <w:sz w:val="20"/>
-          <w:lang w:val="en-GB"/>
-        </w:rPr>
-        <w:t xml:space="preserve">│   </w:t>
-      </w:r>
-      <w:r>
-        <w:rPr>
-          <w:bCs/>
-          <w:sz w:val="20"/>
-          <w:lang w:val="en-GB"/>
-        </w:rPr>
-        <w:t xml:space="preserve">│   ├── </w:t>
-      </w:r>
-      <w:proofErr w:type="spellStart"/>
-      <w:r>
-        <w:rPr>
-          <w:bCs/>
-          <w:sz w:val="20"/>
-          <w:lang w:val="en-GB"/>
-        </w:rPr>
-        <w:t>history_</w:t>
-      </w:r>
-      <w:proofErr w:type="gramStart"/>
-      <w:r>
-        <w:rPr>
-          <w:bCs/>
-          <w:sz w:val="20"/>
-          <w:lang w:val="en-GB"/>
-        </w:rPr>
-        <w:t>item.dart</w:t>
-      </w:r>
-      <w:proofErr w:type="spellEnd"/>
-      <w:proofErr w:type="gramEnd"/>
+        <w:t>│   ├── history_item.dart</w:t>
+      </w:r>
     </w:p>
     <w:p>
       <w:pPr>
@@ -2805,28 +2252,42 @@
           <w:sz w:val="20"/>
           <w:lang w:val="en-GB"/>
         </w:rPr>
-        <w:t xml:space="preserve"> </w:t>
-      </w:r>
-      <w:proofErr w:type="spellStart"/>
-      <w:r>
+        <w:t xml:space="preserve"> badge_item.dart</w:t>
+      </w:r>
+    </w:p>
+    <w:p>
+      <w:pPr>
+        <w:spacing w:after="0" w:line="240" w:lineRule="auto"/>
         <w:rPr>
           <w:bCs/>
           <w:sz w:val="20"/>
           <w:lang w:val="en-GB"/>
         </w:rPr>
-        <w:t>badge_</w:t>
-      </w:r>
-      <w:proofErr w:type="gramStart"/>
+      </w:pPr>
       <w:r>
         <w:rPr>
           <w:bCs/>
           <w:sz w:val="20"/>
           <w:lang w:val="en-GB"/>
         </w:rPr>
-        <w:t>item.dart</w:t>
-      </w:r>
-      <w:proofErr w:type="spellEnd"/>
-      <w:proofErr w:type="gramEnd"/>
+        <w:t xml:space="preserve">└── utils/         </w:t>
+      </w:r>
+      <w:r>
+        <w:rPr>
+          <w:bCs/>
+          <w:sz w:val="20"/>
+          <w:lang w:val="en-GB"/>
+        </w:rPr>
+        <w:t xml:space="preserve">                # shared configurations and </w:t>
+      </w:r>
+      <w:r>
+        <w:rPr>
+          <w:bCs/>
+          <w:sz w:val="20"/>
+          <w:lang w:val="en-GB"/>
+        </w:rPr>
+        <w:t>helpers</w:t>
+      </w:r>
     </w:p>
     <w:p>
       <w:pPr>
@@ -2843,100 +2304,26 @@
           <w:sz w:val="20"/>
           <w:lang w:val="en-GB"/>
         </w:rPr>
-        <w:t xml:space="preserve">└── utils/         </w:t>
-      </w:r>
-      <w:r>
+        <w:t xml:space="preserve">    ├── app_constants.dart</w:t>
+      </w:r>
+    </w:p>
+    <w:p>
+      <w:pPr>
+        <w:spacing w:after="0" w:line="240" w:lineRule="auto"/>
         <w:rPr>
           <w:bCs/>
           <w:sz w:val="20"/>
           <w:lang w:val="en-GB"/>
         </w:rPr>
-        <w:t xml:space="preserve">                # shared configurations and </w:t>
-      </w:r>
+      </w:pPr>
       <w:r>
         <w:rPr>
           <w:bCs/>
           <w:sz w:val="20"/>
           <w:lang w:val="en-GB"/>
         </w:rPr>
-        <w:t>helpers</w:t>
-      </w:r>
-    </w:p>
-    <w:p>
-      <w:pPr>
-        <w:spacing w:after="0" w:line="240" w:lineRule="auto"/>
-        <w:rPr>
-          <w:bCs/>
-          <w:sz w:val="20"/>
-          <w:lang w:val="en-GB"/>
-        </w:rPr>
-      </w:pPr>
-      <w:r>
-        <w:rPr>
-          <w:bCs/>
-          <w:sz w:val="20"/>
-          <w:lang w:val="en-GB"/>
-        </w:rPr>
-        <w:t xml:space="preserve">    ├── </w:t>
-      </w:r>
-      <w:proofErr w:type="spellStart"/>
-      <w:r>
-        <w:rPr>
-          <w:bCs/>
-          <w:sz w:val="20"/>
-          <w:lang w:val="en-GB"/>
-        </w:rPr>
-        <w:t>app_</w:t>
-      </w:r>
-      <w:proofErr w:type="gramStart"/>
-      <w:r>
-        <w:rPr>
-          <w:bCs/>
-          <w:sz w:val="20"/>
-          <w:lang w:val="en-GB"/>
-        </w:rPr>
-        <w:t>constants.dart</w:t>
-      </w:r>
-      <w:proofErr w:type="spellEnd"/>
-      <w:proofErr w:type="gramEnd"/>
-    </w:p>
-    <w:p>
-      <w:pPr>
-        <w:spacing w:after="0" w:line="240" w:lineRule="auto"/>
-        <w:rPr>
-          <w:bCs/>
-          <w:sz w:val="20"/>
-          <w:lang w:val="en-GB"/>
-        </w:rPr>
-      </w:pPr>
-      <w:r>
-        <w:rPr>
-          <w:bCs/>
-          <w:sz w:val="20"/>
-          <w:lang w:val="en-GB"/>
-        </w:rPr>
-        <w:t xml:space="preserve">    ├── </w:t>
-      </w:r>
-      <w:proofErr w:type="spellStart"/>
-      <w:r>
-        <w:rPr>
-          <w:bCs/>
-          <w:sz w:val="20"/>
-          <w:lang w:val="en-GB"/>
-        </w:rPr>
-        <w:t>app_</w:t>
-      </w:r>
-      <w:proofErr w:type="gramStart"/>
-      <w:r>
-        <w:rPr>
-          <w:bCs/>
-          <w:sz w:val="20"/>
-          <w:lang w:val="en-GB"/>
-        </w:rPr>
-        <w:t>theme.dart</w:t>
-      </w:r>
-      <w:proofErr w:type="spellEnd"/>
-      <w:proofErr w:type="gramEnd"/>
+        <w:t xml:space="preserve">    ├── app_theme.dart</w:t>
+      </w:r>
     </w:p>
     <w:p>
       <w:pPr>
@@ -2990,7 +2377,7 @@
                     </pic:cNvPicPr>
                   </pic:nvPicPr>
                   <pic:blipFill>
-                    <a:blip r:embed="rId7">
+                    <a:blip r:embed="rId8">
                       <a:extLst>
                         <a:ext uri="{28A0092B-C50C-407E-A947-70E740481C1C}">
                           <a14:useLocalDpi xmlns:a14="http://schemas.microsoft.com/office/drawing/2010/main" val="0"/>
@@ -3375,56 +2762,424 @@
           <w:szCs w:val="30"/>
         </w:rPr>
         <w:lastRenderedPageBreak/>
-        <w:t xml:space="preserve">2.2 </w:t>
-      </w:r>
-      <w:r>
+        <w:t>2.2 Key Implementations</w:t>
+      </w:r>
+    </w:p>
+    <w:p>
+      <w:pPr>
+        <w:rPr>
+          <w:sz w:val="28"/>
+          <w:szCs w:val="28"/>
+        </w:rPr>
+      </w:pPr>
+      <w:r>
+        <w:rPr>
+          <w:sz w:val="28"/>
+          <w:szCs w:val="28"/>
+        </w:rPr>
+        <w:t>This section describes the core logic and technical mechanisms for the functional requirements of Planeta application:</w:t>
+      </w:r>
+    </w:p>
+    <w:p>
+      <w:pPr>
+        <w:rPr>
+          <w:sz w:val="28"/>
+          <w:szCs w:val="28"/>
+        </w:rPr>
+      </w:pPr>
+      <w:r>
+        <w:rPr>
+          <w:rFonts w:ascii="Arial Unicode MS" w:eastAsia="Arial Unicode MS" w:hAnsi="Arial Unicode MS" w:cs="Arial Unicode MS"/>
+          <w:sz w:val="28"/>
+          <w:szCs w:val="28"/>
+        </w:rPr>
+        <w:t>UI Layer → Service Layer → Firebase Backend</w:t>
+      </w:r>
+    </w:p>
+    <w:p>
+      <w:pPr>
+        <w:rPr>
+          <w:sz w:val="28"/>
+          <w:szCs w:val="28"/>
+        </w:rPr>
+      </w:pPr>
+    </w:p>
+    <w:p>
+      <w:pPr>
+        <w:rPr>
+          <w:b/>
+          <w:bCs/>
+          <w:sz w:val="26"/>
+          <w:szCs w:val="26"/>
+        </w:rPr>
+      </w:pPr>
+      <w:r>
+        <w:rPr>
+          <w:b/>
+          <w:bCs/>
+          <w:sz w:val="26"/>
+          <w:szCs w:val="26"/>
+        </w:rPr>
+        <w:t>Hybrid Scoring and Feedback Engine:</w:t>
+      </w:r>
+    </w:p>
+    <w:p>
+      <w:pPr>
+        <w:rPr>
+          <w:sz w:val="28"/>
+          <w:szCs w:val="28"/>
+        </w:rPr>
+      </w:pPr>
+      <w:r>
+        <w:rPr>
+          <w:sz w:val="28"/>
+          <w:szCs w:val="28"/>
+        </w:rPr>
+        <w:t>This is the core business logic that processes daily surveys. It supports both binary (Yes/No) and Likert-scale (5 option) answers by assigning points (0/100 for binary answers ; 0,25,50,75,100 for Likert answers) to calculate a final sustainability score. Based on the result, it triggers a rule-based feedback system to provide users environmental advice.</w:t>
+      </w:r>
+    </w:p>
+    <w:p>
+      <w:pPr>
+        <w:rPr>
+          <w:sz w:val="28"/>
+          <w:szCs w:val="28"/>
+        </w:rPr>
+      </w:pPr>
+      <w:r>
+        <w:rPr>
+          <w:sz w:val="28"/>
+          <w:szCs w:val="28"/>
+        </w:rPr>
+        <w:t>finalScore = totalPoints / numberOfQuestions;</w:t>
+      </w:r>
+    </w:p>
+    <w:p>
+      <w:pPr>
+        <w:rPr>
+          <w:sz w:val="28"/>
+          <w:szCs w:val="28"/>
+        </w:rPr>
+      </w:pPr>
+    </w:p>
+    <w:p>
+      <w:pPr>
+        <w:rPr>
+          <w:b/>
+          <w:bCs/>
+          <w:sz w:val="26"/>
+          <w:szCs w:val="26"/>
+        </w:rPr>
+      </w:pPr>
+      <w:r>
+        <w:rPr>
+          <w:b/>
+          <w:bCs/>
+          <w:sz w:val="26"/>
+          <w:szCs w:val="26"/>
+        </w:rPr>
+        <w:t>Award Logic:</w:t>
+      </w:r>
+    </w:p>
+    <w:p>
+      <w:pPr>
+        <w:rPr>
+          <w:sz w:val="28"/>
+          <w:szCs w:val="28"/>
+        </w:rPr>
+      </w:pPr>
+      <w:r>
+        <w:rPr>
+          <w:sz w:val="28"/>
+          <w:szCs w:val="28"/>
+        </w:rPr>
+        <w:t>This module manages the Award System by analyzing the user’s historical survey scores stored in the database. When the cumulative score reaches predefined thresholds, the system automatically grants the user a new rank. This ensures that users are rewarded for their long commitment and consistent sustainable performance over time. When predefined thresholds are reached, the user is automatically promoted to a higher sustainability rank.</w:t>
+      </w:r>
+    </w:p>
+    <w:p>
+      <w:pPr>
+        <w:rPr>
+          <w:sz w:val="28"/>
+          <w:szCs w:val="28"/>
+        </w:rPr>
+      </w:pPr>
+    </w:p>
+    <w:p>
+      <w:pPr>
+        <w:rPr>
+          <w:b/>
+          <w:bCs/>
+          <w:sz w:val="26"/>
+          <w:szCs w:val="26"/>
+        </w:rPr>
+      </w:pPr>
+      <w:r>
+        <w:rPr>
+          <w:b/>
+          <w:bCs/>
+          <w:sz w:val="26"/>
+          <w:szCs w:val="26"/>
+        </w:rPr>
+        <w:t>Provider-Driven State and Theme Management:</w:t>
+      </w:r>
+    </w:p>
+    <w:p>
+      <w:pPr>
+        <w:rPr>
+          <w:sz w:val="28"/>
+          <w:szCs w:val="28"/>
+        </w:rPr>
+      </w:pPr>
+      <w:r>
+        <w:rPr>
+          <w:sz w:val="28"/>
+          <w:szCs w:val="28"/>
+        </w:rPr>
+        <w:t>Using the Provider pattern, the app manages real time state changes, such as survey progress and authentication status. It also handles the Dark/Light Mode toggle, ensuring visual integrity across different system themes.</w:t>
+      </w:r>
+    </w:p>
+    <w:p>
+      <w:pPr>
+        <w:rPr>
+          <w:sz w:val="28"/>
+          <w:szCs w:val="28"/>
+        </w:rPr>
+      </w:pPr>
+    </w:p>
+    <w:p>
+      <w:pPr>
+        <w:rPr>
+          <w:b/>
+          <w:bCs/>
+          <w:sz w:val="26"/>
+          <w:szCs w:val="26"/>
+        </w:rPr>
+      </w:pPr>
+      <w:r>
+        <w:rPr>
+          <w:b/>
+          <w:bCs/>
+          <w:sz w:val="26"/>
+          <w:szCs w:val="26"/>
+        </w:rPr>
+        <w:t>Firebase Authentication and Profile Integration:</w:t>
+      </w:r>
+    </w:p>
+    <w:p>
+      <w:pPr>
+        <w:rPr>
+          <w:sz w:val="28"/>
+          <w:szCs w:val="28"/>
+        </w:rPr>
+      </w:pPr>
+      <w:r>
+        <w:rPr>
+          <w:sz w:val="28"/>
+          <w:szCs w:val="28"/>
+        </w:rPr>
+        <w:t>This module implements the logic for secure user registration and login functionality. We want users to be able to sign up for a new account and log in with their existing information.</w:t>
+      </w:r>
+    </w:p>
+    <w:p>
+      <w:pPr>
+        <w:rPr>
+          <w:b/>
+          <w:bCs/>
+          <w:sz w:val="26"/>
+          <w:szCs w:val="26"/>
+        </w:rPr>
+      </w:pPr>
+      <w:r>
+        <w:rPr>
+          <w:b/>
+          <w:bCs/>
+          <w:sz w:val="26"/>
+          <w:szCs w:val="26"/>
+        </w:rPr>
+        <w:lastRenderedPageBreak/>
+        <w:t>History Tracking Management:</w:t>
+      </w:r>
+    </w:p>
+    <w:p>
+      <w:pPr>
+        <w:rPr>
+          <w:sz w:val="28"/>
+          <w:szCs w:val="28"/>
+        </w:rPr>
+      </w:pPr>
+      <w:r>
+        <w:rPr>
+          <w:sz w:val="28"/>
+          <w:szCs w:val="28"/>
+        </w:rPr>
+        <w:t>Every submitted survey is stored as a timestamped document in a Firebase. This architecture enables users to view their historical surveys, scores, and dates through the “User History” screen.</w:t>
+      </w:r>
+    </w:p>
+    <w:p>
+      <w:pPr>
+        <w:spacing w:before="240" w:after="240"/>
+        <w:rPr>
+          <w:sz w:val="28"/>
+          <w:szCs w:val="28"/>
+        </w:rPr>
+      </w:pPr>
+      <w:r>
+        <w:rPr>
+          <w:sz w:val="28"/>
+          <w:szCs w:val="28"/>
+        </w:rPr>
+        <w:t>Each submitted survey is stored as a timestamped document under:</w:t>
+      </w:r>
+    </w:p>
+    <w:p>
+      <w:pPr>
+        <w:rPr>
+          <w:sz w:val="28"/>
+          <w:szCs w:val="28"/>
+        </w:rPr>
+      </w:pPr>
+      <w:r>
+        <w:rPr>
+          <w:sz w:val="28"/>
+          <w:szCs w:val="28"/>
+        </w:rPr>
+        <w:t>class SurveyEntry {</w:t>
+      </w:r>
+    </w:p>
+    <w:p>
+      <w:pPr>
+        <w:rPr>
+          <w:sz w:val="28"/>
+          <w:szCs w:val="28"/>
+        </w:rPr>
+      </w:pPr>
+      <w:r>
+        <w:rPr>
+          <w:sz w:val="28"/>
+          <w:szCs w:val="28"/>
+        </w:rPr>
+        <w:t xml:space="preserve">  final String id;</w:t>
+      </w:r>
+    </w:p>
+    <w:p>
+      <w:pPr>
+        <w:rPr>
+          <w:sz w:val="28"/>
+          <w:szCs w:val="28"/>
+        </w:rPr>
+      </w:pPr>
+      <w:r>
+        <w:rPr>
+          <w:sz w:val="28"/>
+          <w:szCs w:val="28"/>
+        </w:rPr>
+        <w:t xml:space="preserve">  final DateTime timestamp;</w:t>
+      </w:r>
+    </w:p>
+    <w:p>
+      <w:pPr>
+        <w:rPr>
+          <w:sz w:val="28"/>
+          <w:szCs w:val="28"/>
+        </w:rPr>
+      </w:pPr>
+      <w:r>
+        <w:rPr>
+          <w:sz w:val="28"/>
+          <w:szCs w:val="28"/>
+        </w:rPr>
+        <w:t xml:space="preserve">  final Map&lt;String, dynamic&gt; answers;</w:t>
+      </w:r>
+    </w:p>
+    <w:p>
+      <w:pPr>
+        <w:rPr>
+          <w:sz w:val="28"/>
+          <w:szCs w:val="28"/>
+        </w:rPr>
+      </w:pPr>
+      <w:r>
+        <w:rPr>
+          <w:sz w:val="28"/>
+          <w:szCs w:val="28"/>
+        </w:rPr>
+        <w:t xml:space="preserve">  final int score;</w:t>
+      </w:r>
+    </w:p>
+    <w:p>
+      <w:pPr>
+        <w:rPr>
+          <w:sz w:val="28"/>
+          <w:szCs w:val="28"/>
+        </w:rPr>
+      </w:pPr>
+      <w:r>
+        <w:rPr>
+          <w:sz w:val="28"/>
+          <w:szCs w:val="28"/>
+        </w:rPr>
+        <w:t xml:space="preserve">  final String feedback;</w:t>
+      </w:r>
+    </w:p>
+    <w:p>
+      <w:pPr>
+        <w:rPr>
+          <w:sz w:val="28"/>
+          <w:szCs w:val="28"/>
+        </w:rPr>
+      </w:pPr>
+      <w:r>
+        <w:rPr>
+          <w:sz w:val="28"/>
+          <w:szCs w:val="28"/>
+        </w:rPr>
+        <w:t>}</w:t>
+      </w:r>
+    </w:p>
+    <w:p>
+      <w:pPr>
+        <w:rPr>
+          <w:sz w:val="28"/>
+          <w:szCs w:val="28"/>
+        </w:rPr>
+      </w:pPr>
+    </w:p>
+    <w:p>
+      <w:pPr>
         <w:rPr>
           <w:b/>
           <w:bCs/>
           <w:sz w:val="30"/>
           <w:szCs w:val="30"/>
         </w:rPr>
-        <w:t>Key Implementations</w:t>
-      </w:r>
-    </w:p>
-    <w:p>
-      <w:pPr>
-        <w:rPr>
-          <w:sz w:val="28"/>
-          <w:szCs w:val="28"/>
-        </w:rPr>
-      </w:pPr>
-      <w:r>
-        <w:rPr>
-          <w:sz w:val="28"/>
-          <w:szCs w:val="28"/>
-        </w:rPr>
-        <w:t>This section describes the core logic and technical mechanisms for the functional requirements of Planeta application:</w:t>
-      </w:r>
-    </w:p>
-    <w:p>
-      <w:pPr>
-        <w:rPr>
-          <w:sz w:val="28"/>
-          <w:szCs w:val="28"/>
-        </w:rPr>
-      </w:pPr>
-      <w:r>
-        <w:rPr>
-          <w:rFonts w:ascii="Arial Unicode MS" w:eastAsia="Arial Unicode MS" w:hAnsi="Arial Unicode MS" w:cs="Arial Unicode MS"/>
-          <w:sz w:val="28"/>
-          <w:szCs w:val="28"/>
-        </w:rPr>
-        <w:t>UI Layer → Service Layer → Firebase Backend</w:t>
-      </w:r>
-    </w:p>
-    <w:p>
-      <w:pPr>
-        <w:rPr>
-          <w:sz w:val="28"/>
-          <w:szCs w:val="28"/>
-        </w:rPr>
-      </w:pPr>
+      </w:pPr>
+      <w:r>
+        <w:rPr>
+          <w:b/>
+          <w:bCs/>
+          <w:sz w:val="30"/>
+          <w:szCs w:val="30"/>
+        </w:rPr>
+        <w:t>2.3 Component Interfaces</w:t>
+      </w:r>
+    </w:p>
+    <w:p>
+      <w:pPr>
+        <w:rPr>
+          <w:b/>
+          <w:bCs/>
+          <w:sz w:val="28"/>
+          <w:szCs w:val="28"/>
+        </w:rPr>
+      </w:pPr>
+      <w:r>
+        <w:rPr>
+          <w:b/>
+          <w:bCs/>
+          <w:sz w:val="28"/>
+          <w:szCs w:val="28"/>
+        </w:rPr>
+        <w:t>1)Presentation Layer:</w:t>
+      </w:r>
     </w:p>
     <w:p>
       <w:pPr>
@@ -3439,593 +3194,10 @@
         <w:rPr>
           <w:b/>
           <w:bCs/>
-          <w:sz w:val="26"/>
-          <w:szCs w:val="26"/>
-        </w:rPr>
-        <w:t>Hybrid Scoring and Feedback Engine:</w:t>
-      </w:r>
-    </w:p>
-    <w:p>
-      <w:pPr>
-        <w:rPr>
-          <w:sz w:val="28"/>
-          <w:szCs w:val="28"/>
-        </w:rPr>
-      </w:pPr>
-      <w:r>
-        <w:rPr>
-          <w:sz w:val="28"/>
-          <w:szCs w:val="28"/>
-        </w:rPr>
-        <w:t xml:space="preserve">This is the core business logic that processes daily surveys. It supports both binary (Yes/No) and Likert-scale (5 option) answers by assigning points (0/100 for binary </w:t>
-      </w:r>
-      <w:proofErr w:type="gramStart"/>
-      <w:r>
-        <w:rPr>
-          <w:sz w:val="28"/>
-          <w:szCs w:val="28"/>
-        </w:rPr>
-        <w:t>answers ;</w:t>
-      </w:r>
-      <w:proofErr w:type="gramEnd"/>
-      <w:r>
-        <w:rPr>
-          <w:sz w:val="28"/>
-          <w:szCs w:val="28"/>
-        </w:rPr>
-        <w:t xml:space="preserve"> 0,25,50,75,100 for Likert answers) to calculate a final sustainability score. Based on the result, it triggers a rule-based feedback system to provide users environmental advice.</w:t>
-      </w:r>
-    </w:p>
-    <w:p>
-      <w:pPr>
-        <w:rPr>
-          <w:sz w:val="28"/>
-          <w:szCs w:val="28"/>
-        </w:rPr>
-      </w:pPr>
-      <w:proofErr w:type="spellStart"/>
-      <w:proofErr w:type="gramStart"/>
-      <w:r>
-        <w:rPr>
-          <w:sz w:val="28"/>
-          <w:szCs w:val="28"/>
-        </w:rPr>
-        <w:t>finalScore</w:t>
-      </w:r>
-      <w:proofErr w:type="spellEnd"/>
-      <w:proofErr w:type="gramEnd"/>
-      <w:r>
-        <w:rPr>
-          <w:sz w:val="28"/>
-          <w:szCs w:val="28"/>
-        </w:rPr>
-        <w:t xml:space="preserve"> = </w:t>
-      </w:r>
-      <w:proofErr w:type="spellStart"/>
-      <w:r>
-        <w:rPr>
-          <w:sz w:val="28"/>
-          <w:szCs w:val="28"/>
-        </w:rPr>
-        <w:t>totalPoints</w:t>
-      </w:r>
-      <w:proofErr w:type="spellEnd"/>
-      <w:r>
-        <w:rPr>
-          <w:sz w:val="28"/>
-          <w:szCs w:val="28"/>
-        </w:rPr>
-        <w:t xml:space="preserve"> / </w:t>
-      </w:r>
-      <w:proofErr w:type="spellStart"/>
-      <w:proofErr w:type="gramStart"/>
-      <w:r>
-        <w:rPr>
-          <w:sz w:val="28"/>
-          <w:szCs w:val="28"/>
-        </w:rPr>
-        <w:t>numberOfQuestions</w:t>
-      </w:r>
-      <w:proofErr w:type="spellEnd"/>
-      <w:r>
-        <w:rPr>
-          <w:sz w:val="28"/>
-          <w:szCs w:val="28"/>
-        </w:rPr>
-        <w:t>;</w:t>
-      </w:r>
-      <w:proofErr w:type="gramEnd"/>
-    </w:p>
-    <w:p>
-      <w:pPr>
-        <w:rPr>
-          <w:sz w:val="28"/>
-          <w:szCs w:val="28"/>
-        </w:rPr>
-      </w:pPr>
-    </w:p>
-    <w:p>
-      <w:pPr>
-        <w:rPr>
-          <w:b/>
-          <w:bCs/>
-          <w:sz w:val="26"/>
-          <w:szCs w:val="26"/>
-        </w:rPr>
-      </w:pPr>
-      <w:r>
-        <w:rPr>
-          <w:b/>
-          <w:bCs/>
-          <w:sz w:val="26"/>
-          <w:szCs w:val="26"/>
-        </w:rPr>
-        <w:t>Award Logic:</w:t>
-      </w:r>
-    </w:p>
-    <w:p>
-      <w:pPr>
-        <w:rPr>
-          <w:sz w:val="28"/>
-          <w:szCs w:val="28"/>
-        </w:rPr>
-      </w:pPr>
-      <w:r>
-        <w:rPr>
-          <w:sz w:val="28"/>
-          <w:szCs w:val="28"/>
-        </w:rPr>
-        <w:t>This module manages the Award System by analyzing the user’s historical survey scores stored in the database. When the cumulative score reaches predefined thresholds, the system automatically grants the user a new rank. This ensures that users are rewarded for their long commitment and consistent sustainable performance over time. When predefined thresholds are reached, the user is automatically promoted to a higher sustainability rank.</w:t>
-      </w:r>
-    </w:p>
-    <w:p>
-      <w:pPr>
-        <w:rPr>
-          <w:sz w:val="28"/>
-          <w:szCs w:val="28"/>
-        </w:rPr>
-      </w:pPr>
-    </w:p>
-    <w:p>
-      <w:pPr>
-        <w:rPr>
-          <w:b/>
-          <w:bCs/>
-          <w:sz w:val="26"/>
-          <w:szCs w:val="26"/>
-        </w:rPr>
-      </w:pPr>
-      <w:r>
-        <w:rPr>
-          <w:b/>
-          <w:bCs/>
-          <w:sz w:val="26"/>
-          <w:szCs w:val="26"/>
-        </w:rPr>
-        <w:t>Provider-Driven State and Theme Management:</w:t>
-      </w:r>
-    </w:p>
-    <w:p>
-      <w:pPr>
-        <w:rPr>
-          <w:sz w:val="28"/>
-          <w:szCs w:val="28"/>
-        </w:rPr>
-      </w:pPr>
-      <w:r>
-        <w:rPr>
-          <w:sz w:val="28"/>
-          <w:szCs w:val="28"/>
-        </w:rPr>
-        <w:t>Using the Provider pattern, the app manages real time state changes, such as survey progress and authentication status. It also handles the Dark/Light Mode toggle, ensuring visual integrity across different system themes.</w:t>
-      </w:r>
-    </w:p>
-    <w:p>
-      <w:pPr>
-        <w:rPr>
-          <w:sz w:val="28"/>
-          <w:szCs w:val="28"/>
-        </w:rPr>
-      </w:pPr>
-    </w:p>
-    <w:p>
-      <w:pPr>
-        <w:rPr>
-          <w:b/>
-          <w:bCs/>
-          <w:sz w:val="26"/>
-          <w:szCs w:val="26"/>
-        </w:rPr>
-      </w:pPr>
-      <w:r>
-        <w:rPr>
-          <w:b/>
-          <w:bCs/>
-          <w:sz w:val="26"/>
-          <w:szCs w:val="26"/>
-        </w:rPr>
-        <w:t>Firebase Authentication and Profile Integration:</w:t>
-      </w:r>
-    </w:p>
-    <w:p>
-      <w:pPr>
-        <w:rPr>
-          <w:sz w:val="28"/>
-          <w:szCs w:val="28"/>
-        </w:rPr>
-      </w:pPr>
-      <w:r>
-        <w:rPr>
-          <w:sz w:val="28"/>
-          <w:szCs w:val="28"/>
-        </w:rPr>
-        <w:t xml:space="preserve">This module implements </w:t>
-      </w:r>
-      <w:proofErr w:type="gramStart"/>
-      <w:r>
-        <w:rPr>
-          <w:sz w:val="28"/>
-          <w:szCs w:val="28"/>
-        </w:rPr>
-        <w:t>the logic</w:t>
-      </w:r>
-      <w:proofErr w:type="gramEnd"/>
-      <w:r>
-        <w:rPr>
-          <w:sz w:val="28"/>
-          <w:szCs w:val="28"/>
-        </w:rPr>
-        <w:t xml:space="preserve"> for secure user registration and login functionality. We want users to be able to sign up for a new account and log in with their existing information</w:t>
-      </w:r>
-      <w:r>
-        <w:rPr>
-          <w:sz w:val="28"/>
-          <w:szCs w:val="28"/>
-        </w:rPr>
-        <w:t>.</w:t>
-      </w:r>
-    </w:p>
-    <w:p>
-      <w:pPr>
-        <w:rPr>
-          <w:b/>
-          <w:bCs/>
-          <w:sz w:val="26"/>
-          <w:szCs w:val="26"/>
-        </w:rPr>
-      </w:pPr>
-      <w:r>
-        <w:rPr>
-          <w:b/>
-          <w:bCs/>
-          <w:sz w:val="26"/>
-          <w:szCs w:val="26"/>
-        </w:rPr>
-        <w:lastRenderedPageBreak/>
-        <w:t>History Tracking Management:</w:t>
-      </w:r>
-    </w:p>
-    <w:p>
-      <w:pPr>
-        <w:rPr>
-          <w:sz w:val="28"/>
-          <w:szCs w:val="28"/>
-        </w:rPr>
-      </w:pPr>
-      <w:r>
-        <w:rPr>
-          <w:sz w:val="28"/>
-          <w:szCs w:val="28"/>
-        </w:rPr>
-        <w:t>Every submitted survey is stored as a timestamped document in a Firebase. This architecture enables users to view their historical surveys, scores, and dates through the “User History” screen.</w:t>
-      </w:r>
-    </w:p>
-    <w:p>
-      <w:pPr>
-        <w:spacing w:before="240" w:after="240"/>
-        <w:rPr>
-          <w:sz w:val="28"/>
-          <w:szCs w:val="28"/>
-        </w:rPr>
-      </w:pPr>
-      <w:r>
-        <w:rPr>
-          <w:sz w:val="28"/>
-          <w:szCs w:val="28"/>
-        </w:rPr>
-        <w:t xml:space="preserve">Each </w:t>
-      </w:r>
-      <w:proofErr w:type="gramStart"/>
-      <w:r>
-        <w:rPr>
-          <w:sz w:val="28"/>
-          <w:szCs w:val="28"/>
-        </w:rPr>
-        <w:t>submitted survey</w:t>
-      </w:r>
-      <w:proofErr w:type="gramEnd"/>
-      <w:r>
-        <w:rPr>
-          <w:sz w:val="28"/>
-          <w:szCs w:val="28"/>
-        </w:rPr>
-        <w:t xml:space="preserve"> is stored as a timestamped document under:</w:t>
-      </w:r>
-    </w:p>
-    <w:p>
-      <w:pPr>
-        <w:rPr>
-          <w:sz w:val="28"/>
-          <w:szCs w:val="28"/>
-        </w:rPr>
-      </w:pPr>
-      <w:r>
-        <w:rPr>
-          <w:sz w:val="28"/>
-          <w:szCs w:val="28"/>
-        </w:rPr>
-        <w:t xml:space="preserve">class </w:t>
-      </w:r>
-      <w:proofErr w:type="spellStart"/>
-      <w:r>
-        <w:rPr>
-          <w:sz w:val="28"/>
-          <w:szCs w:val="28"/>
-        </w:rPr>
-        <w:t>SurveyEntry</w:t>
-      </w:r>
-      <w:proofErr w:type="spellEnd"/>
-      <w:r>
-        <w:rPr>
-          <w:sz w:val="28"/>
-          <w:szCs w:val="28"/>
-        </w:rPr>
-        <w:t xml:space="preserve"> {</w:t>
-      </w:r>
-    </w:p>
-    <w:p>
-      <w:pPr>
-        <w:rPr>
-          <w:sz w:val="28"/>
-          <w:szCs w:val="28"/>
-        </w:rPr>
-      </w:pPr>
-      <w:r>
-        <w:rPr>
-          <w:sz w:val="28"/>
-          <w:szCs w:val="28"/>
-        </w:rPr>
-        <w:t xml:space="preserve">  final String </w:t>
-      </w:r>
-      <w:proofErr w:type="gramStart"/>
-      <w:r>
-        <w:rPr>
-          <w:sz w:val="28"/>
-          <w:szCs w:val="28"/>
-        </w:rPr>
-        <w:t>id;</w:t>
-      </w:r>
-      <w:proofErr w:type="gramEnd"/>
-    </w:p>
-    <w:p>
-      <w:pPr>
-        <w:rPr>
-          <w:sz w:val="28"/>
-          <w:szCs w:val="28"/>
-        </w:rPr>
-      </w:pPr>
-      <w:r>
-        <w:rPr>
-          <w:sz w:val="28"/>
-          <w:szCs w:val="28"/>
-        </w:rPr>
-        <w:t xml:space="preserve">  final </w:t>
-      </w:r>
-      <w:proofErr w:type="spellStart"/>
-      <w:r>
-        <w:rPr>
-          <w:sz w:val="28"/>
-          <w:szCs w:val="28"/>
-        </w:rPr>
-        <w:t>DateTime</w:t>
-      </w:r>
-      <w:proofErr w:type="spellEnd"/>
-      <w:r>
-        <w:rPr>
-          <w:sz w:val="28"/>
-          <w:szCs w:val="28"/>
-        </w:rPr>
-        <w:t xml:space="preserve"> </w:t>
-      </w:r>
-      <w:proofErr w:type="gramStart"/>
-      <w:r>
-        <w:rPr>
-          <w:sz w:val="28"/>
-          <w:szCs w:val="28"/>
-        </w:rPr>
-        <w:t>timestamp;</w:t>
-      </w:r>
-      <w:proofErr w:type="gramEnd"/>
-    </w:p>
-    <w:p>
-      <w:pPr>
-        <w:rPr>
-          <w:sz w:val="28"/>
-          <w:szCs w:val="28"/>
-        </w:rPr>
-      </w:pPr>
-      <w:r>
-        <w:rPr>
-          <w:sz w:val="28"/>
-          <w:szCs w:val="28"/>
-        </w:rPr>
-        <w:t xml:space="preserve">  final Map&lt;String, dynamic&gt; </w:t>
-      </w:r>
-      <w:proofErr w:type="gramStart"/>
-      <w:r>
-        <w:rPr>
-          <w:sz w:val="28"/>
-          <w:szCs w:val="28"/>
-        </w:rPr>
-        <w:t>answers;</w:t>
-      </w:r>
-      <w:proofErr w:type="gramEnd"/>
-    </w:p>
-    <w:p>
-      <w:pPr>
-        <w:rPr>
-          <w:sz w:val="28"/>
-          <w:szCs w:val="28"/>
-        </w:rPr>
-      </w:pPr>
-      <w:r>
-        <w:rPr>
-          <w:sz w:val="28"/>
-          <w:szCs w:val="28"/>
-        </w:rPr>
-        <w:t xml:space="preserve">  final int </w:t>
-      </w:r>
-      <w:proofErr w:type="gramStart"/>
-      <w:r>
-        <w:rPr>
-          <w:sz w:val="28"/>
-          <w:szCs w:val="28"/>
-        </w:rPr>
-        <w:t>score;</w:t>
-      </w:r>
-      <w:proofErr w:type="gramEnd"/>
-    </w:p>
-    <w:p>
-      <w:pPr>
-        <w:rPr>
-          <w:sz w:val="28"/>
-          <w:szCs w:val="28"/>
-        </w:rPr>
-      </w:pPr>
-      <w:r>
-        <w:rPr>
-          <w:sz w:val="28"/>
-          <w:szCs w:val="28"/>
-        </w:rPr>
-        <w:t xml:space="preserve">  final String </w:t>
-      </w:r>
-      <w:proofErr w:type="gramStart"/>
-      <w:r>
-        <w:rPr>
-          <w:sz w:val="28"/>
-          <w:szCs w:val="28"/>
-        </w:rPr>
-        <w:t>feedback;</w:t>
-      </w:r>
-      <w:proofErr w:type="gramEnd"/>
-    </w:p>
-    <w:p>
-      <w:pPr>
-        <w:rPr>
-          <w:sz w:val="28"/>
-          <w:szCs w:val="28"/>
-        </w:rPr>
-      </w:pPr>
-      <w:r>
-        <w:rPr>
-          <w:sz w:val="28"/>
-          <w:szCs w:val="28"/>
-        </w:rPr>
-        <w:t>}</w:t>
-      </w:r>
-    </w:p>
-    <w:p>
-      <w:pPr>
-        <w:rPr>
-          <w:sz w:val="28"/>
-          <w:szCs w:val="28"/>
-        </w:rPr>
-      </w:pPr>
-    </w:p>
-    <w:p>
-      <w:pPr>
-        <w:rPr>
-          <w:b/>
-          <w:bCs/>
-          <w:sz w:val="30"/>
-          <w:szCs w:val="30"/>
-        </w:rPr>
-      </w:pPr>
-      <w:r>
-        <w:rPr>
-          <w:b/>
-          <w:bCs/>
-          <w:sz w:val="30"/>
-          <w:szCs w:val="30"/>
-        </w:rPr>
-        <w:t xml:space="preserve">2.3 </w:t>
-      </w:r>
-      <w:r>
-        <w:rPr>
-          <w:b/>
-          <w:bCs/>
-          <w:sz w:val="30"/>
-          <w:szCs w:val="30"/>
-        </w:rPr>
-        <w:t>Component Interfaces</w:t>
-      </w:r>
-    </w:p>
-    <w:p>
-      <w:pPr>
-        <w:rPr>
-          <w:b/>
-          <w:bCs/>
-          <w:sz w:val="28"/>
-          <w:szCs w:val="28"/>
-        </w:rPr>
-      </w:pPr>
-      <w:r>
-        <w:rPr>
-          <w:b/>
-          <w:bCs/>
-          <w:sz w:val="28"/>
-          <w:szCs w:val="28"/>
-        </w:rPr>
-        <w:t>1)Presentation Layer:</w:t>
-      </w:r>
-    </w:p>
-    <w:p>
-      <w:pPr>
-        <w:rPr>
-          <w:b/>
-          <w:bCs/>
-          <w:sz w:val="26"/>
-          <w:szCs w:val="26"/>
-        </w:rPr>
-      </w:pPr>
-      <w:r>
-        <w:rPr>
-          <w:b/>
-          <w:bCs/>
-          <w:sz w:val="28"/>
-          <w:szCs w:val="28"/>
-        </w:rPr>
-        <w:t xml:space="preserve">UI </w:t>
-      </w:r>
-      <w:proofErr w:type="gramStart"/>
-      <w:r>
-        <w:rPr>
-          <w:b/>
-          <w:bCs/>
-          <w:sz w:val="28"/>
-          <w:szCs w:val="28"/>
-        </w:rPr>
-        <w:t>Components(</w:t>
-      </w:r>
-      <w:proofErr w:type="gramEnd"/>
-      <w:r>
-        <w:rPr>
-          <w:b/>
-          <w:bCs/>
-          <w:sz w:val="28"/>
-          <w:szCs w:val="28"/>
-        </w:rPr>
-        <w:t>Widgets):</w:t>
+          <w:sz w:val="28"/>
+          <w:szCs w:val="28"/>
+        </w:rPr>
+        <w:t>UI Components(Widgets):</w:t>
       </w:r>
     </w:p>
     <w:p>
@@ -4042,7 +3214,6 @@
           <w:szCs w:val="28"/>
         </w:rPr>
       </w:pPr>
-      <w:proofErr w:type="spellStart"/>
       <w:r>
         <w:rPr>
           <w:sz w:val="28"/>
@@ -4050,7 +3221,6 @@
         </w:rPr>
         <w:t>SurveyQuestionsWidget</w:t>
       </w:r>
-      <w:proofErr w:type="spellEnd"/>
       <w:r>
         <w:rPr>
           <w:b/>
@@ -4098,21 +3268,12 @@
           <w:szCs w:val="28"/>
         </w:rPr>
       </w:pPr>
-      <w:proofErr w:type="spellStart"/>
-      <w:r>
-        <w:rPr>
-          <w:sz w:val="28"/>
-          <w:szCs w:val="28"/>
-        </w:rPr>
-        <w:t>CustomButton</w:t>
-      </w:r>
-      <w:proofErr w:type="spellEnd"/>
-      <w:r>
-        <w:rPr>
-          <w:sz w:val="28"/>
-          <w:szCs w:val="28"/>
-        </w:rPr>
-        <w:t>:</w:t>
+      <w:r>
+        <w:rPr>
+          <w:sz w:val="28"/>
+          <w:szCs w:val="28"/>
+        </w:rPr>
+        <w:t>CustomButton:</w:t>
       </w:r>
     </w:p>
     <w:p>
@@ -4128,25 +3289,7 @@
           <w:sz w:val="28"/>
           <w:szCs w:val="28"/>
         </w:rPr>
-        <w:t xml:space="preserve">A standardized button used across </w:t>
-      </w:r>
-      <w:proofErr w:type="spellStart"/>
-      <w:proofErr w:type="gramStart"/>
-      <w:r>
-        <w:rPr>
-          <w:sz w:val="28"/>
-          <w:szCs w:val="28"/>
-        </w:rPr>
-        <w:t>Login,Register</w:t>
-      </w:r>
-      <w:proofErr w:type="spellEnd"/>
-      <w:proofErr w:type="gramEnd"/>
-      <w:r>
-        <w:rPr>
-          <w:sz w:val="28"/>
-          <w:szCs w:val="28"/>
-        </w:rPr>
-        <w:t xml:space="preserve"> and survey screens for consistent UX.</w:t>
+        <w:t>A standardized button used across Login,Register and survey screens for consistent UX.</w:t>
       </w:r>
     </w:p>
     <w:p>
@@ -4216,78 +3359,22 @@
           <w:szCs w:val="28"/>
         </w:rPr>
         <w:lastRenderedPageBreak/>
-        <w:t xml:space="preserve">2)Service </w:t>
-      </w:r>
-      <w:proofErr w:type="gramStart"/>
-      <w:r>
-        <w:rPr>
-          <w:b/>
-          <w:bCs/>
-          <w:sz w:val="28"/>
-          <w:szCs w:val="28"/>
-        </w:rPr>
-        <w:t>Layer(</w:t>
-      </w:r>
-      <w:proofErr w:type="spellStart"/>
-      <w:proofErr w:type="gramEnd"/>
-      <w:r>
-        <w:rPr>
-          <w:b/>
-          <w:bCs/>
-          <w:sz w:val="28"/>
-          <w:szCs w:val="28"/>
-        </w:rPr>
-        <w:t>SurveyProvider&amp;AuthProvider</w:t>
-      </w:r>
-      <w:proofErr w:type="spellEnd"/>
-      <w:r>
-        <w:rPr>
-          <w:b/>
-          <w:bCs/>
-          <w:sz w:val="28"/>
-          <w:szCs w:val="28"/>
-        </w:rPr>
-        <w:t>):</w:t>
-      </w:r>
-    </w:p>
-    <w:p>
-      <w:pPr>
-        <w:rPr>
-          <w:sz w:val="28"/>
-          <w:szCs w:val="28"/>
-        </w:rPr>
-      </w:pPr>
-      <w:r>
-        <w:rPr>
-          <w:sz w:val="28"/>
-          <w:szCs w:val="28"/>
-        </w:rPr>
-        <w:t xml:space="preserve">This layer handles both the scoring algorithms and direct communication with the cloud backend. It eliminates the need </w:t>
-      </w:r>
-      <w:proofErr w:type="gramStart"/>
-      <w:r>
-        <w:rPr>
-          <w:sz w:val="28"/>
-          <w:szCs w:val="28"/>
-        </w:rPr>
-        <w:t xml:space="preserve">of </w:t>
-      </w:r>
-      <w:proofErr w:type="spellStart"/>
-      <w:r>
-        <w:rPr>
-          <w:sz w:val="28"/>
-          <w:szCs w:val="28"/>
-        </w:rPr>
-        <w:t>seperate</w:t>
-      </w:r>
-      <w:proofErr w:type="spellEnd"/>
-      <w:proofErr w:type="gramEnd"/>
-      <w:r>
-        <w:rPr>
-          <w:sz w:val="28"/>
-          <w:szCs w:val="28"/>
-        </w:rPr>
-        <w:t xml:space="preserve"> Repository layer by utilizing the Firebase SDK directly.</w:t>
+        <w:t>2)Service Layer(SurveyProvider&amp;AuthProvider):</w:t>
+      </w:r>
+    </w:p>
+    <w:p>
+      <w:pPr>
+        <w:rPr>
+          <w:sz w:val="28"/>
+          <w:szCs w:val="28"/>
+        </w:rPr>
+      </w:pPr>
+      <w:r>
+        <w:rPr>
+          <w:sz w:val="28"/>
+          <w:szCs w:val="28"/>
+        </w:rPr>
+        <w:t>This layer handles both the scoring algorithms and direct communication with the cloud backend. It eliminates the need of seperate Repository layer by utilizing the Firebase SDK directly.</w:t>
       </w:r>
     </w:p>
     <w:p>
@@ -4302,48 +3389,12 @@
           <w:szCs w:val="28"/>
         </w:rPr>
       </w:pPr>
-      <w:proofErr w:type="spellStart"/>
-      <w:proofErr w:type="gramStart"/>
-      <w:r>
-        <w:rPr>
-          <w:sz w:val="28"/>
-          <w:szCs w:val="28"/>
-        </w:rPr>
-        <w:t>submitSurvey</w:t>
-      </w:r>
-      <w:proofErr w:type="spellEnd"/>
-      <w:r>
-        <w:rPr>
-          <w:sz w:val="28"/>
-          <w:szCs w:val="28"/>
-        </w:rPr>
-        <w:t>(</w:t>
-      </w:r>
-      <w:proofErr w:type="gramEnd"/>
-      <w:r>
-        <w:rPr>
-          <w:sz w:val="28"/>
-          <w:szCs w:val="28"/>
-        </w:rPr>
-        <w:t>Map&lt;</w:t>
-      </w:r>
-      <w:proofErr w:type="spellStart"/>
-      <w:proofErr w:type="gramStart"/>
-      <w:r>
-        <w:rPr>
-          <w:sz w:val="28"/>
-          <w:szCs w:val="28"/>
-        </w:rPr>
-        <w:t>String,dynamic</w:t>
-      </w:r>
-      <w:proofErr w:type="spellEnd"/>
-      <w:proofErr w:type="gramEnd"/>
-      <w:r>
-        <w:rPr>
-          <w:sz w:val="28"/>
-          <w:szCs w:val="28"/>
-        </w:rPr>
-        <w:t>&gt; answers):</w:t>
+      <w:r>
+        <w:rPr>
+          <w:sz w:val="28"/>
+          <w:szCs w:val="28"/>
+        </w:rPr>
+        <w:t>submitSurvey(Map&lt;String,dynamic&gt; answers):</w:t>
       </w:r>
     </w:p>
     <w:p>
@@ -4359,103 +3410,7 @@
           <w:sz w:val="28"/>
           <w:szCs w:val="28"/>
         </w:rPr>
-        <w:t xml:space="preserve">Triggers the scoring </w:t>
-      </w:r>
-      <w:proofErr w:type="gramStart"/>
-      <w:r>
-        <w:rPr>
-          <w:sz w:val="28"/>
-          <w:szCs w:val="28"/>
-        </w:rPr>
-        <w:t>algorithm(</w:t>
-      </w:r>
-      <w:proofErr w:type="gramEnd"/>
-      <w:r>
-        <w:rPr>
-          <w:sz w:val="28"/>
-          <w:szCs w:val="28"/>
-        </w:rPr>
-        <w:t xml:space="preserve">Hybrid Scoring) and </w:t>
-      </w:r>
-      <w:proofErr w:type="gramStart"/>
-      <w:r>
-        <w:rPr>
-          <w:sz w:val="28"/>
-          <w:szCs w:val="28"/>
-        </w:rPr>
-        <w:t>generates</w:t>
-      </w:r>
-      <w:proofErr w:type="gramEnd"/>
-      <w:r>
-        <w:rPr>
-          <w:sz w:val="28"/>
-          <w:szCs w:val="28"/>
-        </w:rPr>
-        <w:t xml:space="preserve"> </w:t>
-      </w:r>
-      <w:proofErr w:type="gramStart"/>
-      <w:r>
-        <w:rPr>
-          <w:sz w:val="28"/>
-          <w:szCs w:val="28"/>
-        </w:rPr>
-        <w:t>feedback message</w:t>
-      </w:r>
-      <w:proofErr w:type="gramEnd"/>
-      <w:r>
-        <w:rPr>
-          <w:sz w:val="28"/>
-          <w:szCs w:val="28"/>
-        </w:rPr>
-        <w:t xml:space="preserve"> based on the result. </w:t>
-      </w:r>
-      <w:proofErr w:type="gramStart"/>
-      <w:r>
-        <w:rPr>
-          <w:sz w:val="28"/>
-          <w:szCs w:val="28"/>
-        </w:rPr>
-        <w:t>Calls</w:t>
-      </w:r>
-      <w:proofErr w:type="gramEnd"/>
-      <w:r>
-        <w:rPr>
-          <w:sz w:val="28"/>
-          <w:szCs w:val="28"/>
-        </w:rPr>
-        <w:t xml:space="preserve"> </w:t>
-      </w:r>
-      <w:proofErr w:type="spellStart"/>
-      <w:r>
-        <w:rPr>
-          <w:sz w:val="28"/>
-          <w:szCs w:val="28"/>
-        </w:rPr>
-        <w:t>SurveyRepository</w:t>
-      </w:r>
-      <w:proofErr w:type="spellEnd"/>
-      <w:r>
-        <w:rPr>
-          <w:sz w:val="28"/>
-          <w:szCs w:val="28"/>
-        </w:rPr>
-        <w:t xml:space="preserve"> to </w:t>
-      </w:r>
-      <w:proofErr w:type="gramStart"/>
-      <w:r>
-        <w:rPr>
-          <w:sz w:val="28"/>
-          <w:szCs w:val="28"/>
-        </w:rPr>
-        <w:t>persist</w:t>
-      </w:r>
-      <w:proofErr w:type="gramEnd"/>
-      <w:r>
-        <w:rPr>
-          <w:sz w:val="28"/>
-          <w:szCs w:val="28"/>
-        </w:rPr>
-        <w:t xml:space="preserve"> the entry.</w:t>
+        <w:t>Triggers the scoring algorithm(Hybrid Scoring) and generates feedback message based on the result. Calls SurveyRepository to persist the entry.</w:t>
       </w:r>
     </w:p>
     <w:p>
@@ -4478,30 +3433,12 @@
           <w:szCs w:val="28"/>
         </w:rPr>
       </w:pPr>
-      <w:proofErr w:type="spellStart"/>
-      <w:proofErr w:type="gramStart"/>
-      <w:r>
-        <w:rPr>
-          <w:sz w:val="28"/>
-          <w:szCs w:val="28"/>
-        </w:rPr>
-        <w:t>loadHistory</w:t>
-      </w:r>
-      <w:proofErr w:type="spellEnd"/>
-      <w:r>
-        <w:rPr>
-          <w:sz w:val="28"/>
-          <w:szCs w:val="28"/>
-        </w:rPr>
-        <w:t>(</w:t>
-      </w:r>
-      <w:proofErr w:type="gramEnd"/>
-      <w:r>
-        <w:rPr>
-          <w:sz w:val="28"/>
-          <w:szCs w:val="28"/>
-        </w:rPr>
-        <w:t>):</w:t>
+      <w:r>
+        <w:rPr>
+          <w:sz w:val="28"/>
+          <w:szCs w:val="28"/>
+        </w:rPr>
+        <w:t>loadHistory():</w:t>
       </w:r>
     </w:p>
     <w:p>
@@ -4517,23 +3454,7 @@
           <w:sz w:val="28"/>
           <w:szCs w:val="28"/>
         </w:rPr>
-        <w:t xml:space="preserve">This function finds the user’s past survey results from </w:t>
-      </w:r>
-      <w:proofErr w:type="spellStart"/>
-      <w:r>
-        <w:rPr>
-          <w:sz w:val="28"/>
-          <w:szCs w:val="28"/>
-        </w:rPr>
-        <w:t>Firestore</w:t>
-      </w:r>
-      <w:proofErr w:type="spellEnd"/>
-      <w:r>
-        <w:rPr>
-          <w:sz w:val="28"/>
-          <w:szCs w:val="28"/>
-        </w:rPr>
-        <w:t>. It organizes them from newest to oldest using timestamps and refreshes the list on the screen. After getting the data from the database, the app puts this new information into the list so the user can see it.</w:t>
+        <w:t>This function finds the user’s past survey results from Firestore. It organizes them from newest to oldest using timestamps and refreshes the list on the screen. After getting the data from the database, the app puts this new information into the list so the user can see it.</w:t>
       </w:r>
     </w:p>
     <w:p>
@@ -4562,23 +3483,7 @@
           <w:sz w:val="28"/>
           <w:szCs w:val="28"/>
         </w:rPr>
-        <w:t xml:space="preserve">Future&lt;User&gt; </w:t>
-      </w:r>
-      <w:proofErr w:type="gramStart"/>
-      <w:r>
-        <w:rPr>
-          <w:sz w:val="28"/>
-          <w:szCs w:val="28"/>
-        </w:rPr>
-        <w:t>register( String</w:t>
-      </w:r>
-      <w:proofErr w:type="gramEnd"/>
-      <w:r>
-        <w:rPr>
-          <w:sz w:val="28"/>
-          <w:szCs w:val="28"/>
-        </w:rPr>
-        <w:t xml:space="preserve"> email, String password, String username):</w:t>
+        <w:t>Future&lt;User&gt; register( String email, String password, String username):</w:t>
       </w:r>
     </w:p>
     <w:p>
@@ -4594,23 +3499,7 @@
           <w:sz w:val="28"/>
           <w:szCs w:val="28"/>
         </w:rPr>
-        <w:t xml:space="preserve">Calls Firebase Auth to create credentials and initializes a user a document in </w:t>
-      </w:r>
-      <w:proofErr w:type="spellStart"/>
-      <w:r>
-        <w:rPr>
-          <w:sz w:val="28"/>
-          <w:szCs w:val="28"/>
-        </w:rPr>
-        <w:t>Firestore</w:t>
-      </w:r>
-      <w:proofErr w:type="spellEnd"/>
-      <w:r>
-        <w:rPr>
-          <w:sz w:val="28"/>
-          <w:szCs w:val="28"/>
-        </w:rPr>
-        <w:t>.</w:t>
+        <w:t>Calls Firebase Auth to create credentials and initializes a user a document in Firestore.</w:t>
       </w:r>
     </w:p>
     <w:p>
@@ -4639,41 +3528,7 @@
           <w:sz w:val="28"/>
           <w:szCs w:val="28"/>
         </w:rPr>
-        <w:t xml:space="preserve"> Future&lt;User&gt; </w:t>
-      </w:r>
-      <w:proofErr w:type="gramStart"/>
-      <w:r>
-        <w:rPr>
-          <w:sz w:val="28"/>
-          <w:szCs w:val="28"/>
-        </w:rPr>
-        <w:t>login( String</w:t>
-      </w:r>
-      <w:proofErr w:type="gramEnd"/>
-      <w:r>
-        <w:rPr>
-          <w:sz w:val="28"/>
-          <w:szCs w:val="28"/>
-        </w:rPr>
-        <w:t xml:space="preserve"> </w:t>
-      </w:r>
-      <w:proofErr w:type="spellStart"/>
-      <w:proofErr w:type="gramStart"/>
-      <w:r>
-        <w:rPr>
-          <w:sz w:val="28"/>
-          <w:szCs w:val="28"/>
-        </w:rPr>
-        <w:t>email,String</w:t>
-      </w:r>
-      <w:proofErr w:type="spellEnd"/>
-      <w:proofErr w:type="gramEnd"/>
-      <w:r>
-        <w:rPr>
-          <w:sz w:val="28"/>
-          <w:szCs w:val="28"/>
-        </w:rPr>
-        <w:t xml:space="preserve"> password):</w:t>
+        <w:t xml:space="preserve"> Future&lt;User&gt; login( String email,String password):</w:t>
       </w:r>
     </w:p>
     <w:p>
@@ -4713,21 +3568,12 @@
           <w:szCs w:val="28"/>
         </w:rPr>
       </w:pPr>
-      <w:proofErr w:type="gramStart"/>
-      <w:r>
-        <w:rPr>
-          <w:sz w:val="28"/>
-          <w:szCs w:val="28"/>
-        </w:rPr>
-        <w:t>logout(</w:t>
-      </w:r>
-      <w:proofErr w:type="gramEnd"/>
-      <w:r>
-        <w:rPr>
-          <w:sz w:val="28"/>
-          <w:szCs w:val="28"/>
-        </w:rPr>
-        <w:t>):</w:t>
+      <w:r>
+        <w:rPr>
+          <w:sz w:val="28"/>
+          <w:szCs w:val="28"/>
+        </w:rPr>
+        <w:t>logout():</w:t>
       </w:r>
     </w:p>
     <w:p>
@@ -4808,27 +3654,7 @@
           <w:szCs w:val="28"/>
         </w:rPr>
         <w:lastRenderedPageBreak/>
-        <w:t xml:space="preserve">3) Cloud Database </w:t>
-      </w:r>
-      <w:proofErr w:type="gramStart"/>
-      <w:r>
-        <w:rPr>
-          <w:b/>
-          <w:bCs/>
-          <w:sz w:val="28"/>
-          <w:szCs w:val="28"/>
-        </w:rPr>
-        <w:t>Layer(</w:t>
-      </w:r>
-      <w:proofErr w:type="gramEnd"/>
-      <w:r>
-        <w:rPr>
-          <w:b/>
-          <w:bCs/>
-          <w:sz w:val="28"/>
-          <w:szCs w:val="28"/>
-        </w:rPr>
-        <w:t>Serverless Backend)</w:t>
+        <w:t>3) Cloud Database Layer(Serverless Backend)</w:t>
       </w:r>
     </w:p>
     <w:p>
@@ -4844,23 +3670,7 @@
           <w:sz w:val="28"/>
           <w:szCs w:val="28"/>
         </w:rPr>
-        <w:t xml:space="preserve">For the database layer, the application utilizes Cloud </w:t>
-      </w:r>
-      <w:proofErr w:type="spellStart"/>
-      <w:r>
-        <w:rPr>
-          <w:sz w:val="28"/>
-          <w:szCs w:val="28"/>
-        </w:rPr>
-        <w:t>Firestore</w:t>
-      </w:r>
-      <w:proofErr w:type="spellEnd"/>
-      <w:r>
-        <w:rPr>
-          <w:sz w:val="28"/>
-          <w:szCs w:val="28"/>
-        </w:rPr>
-        <w:t xml:space="preserve">, a serverless NoSQL database provided by the Google Firebase platform. It helps our system to store user profiles, daily survey results, earned badges, and ranks while enabling real-time updates. </w:t>
+        <w:t xml:space="preserve">For the database layer, the application utilizes Cloud Firestore, a serverless NoSQL database provided by the Google Firebase platform. It helps our system to store user profiles, daily survey results, earned badges, and ranks while enabling real-time updates. </w:t>
       </w:r>
     </w:p>
     <w:p>
@@ -4892,39 +3702,7 @@
           <w:sz w:val="28"/>
           <w:szCs w:val="28"/>
         </w:rPr>
-        <w:t xml:space="preserve">Direct Access: Our Service Layer talks directly to </w:t>
-      </w:r>
-      <w:proofErr w:type="spellStart"/>
-      <w:r>
-        <w:rPr>
-          <w:sz w:val="28"/>
-          <w:szCs w:val="28"/>
-        </w:rPr>
-        <w:t>Firetore</w:t>
-      </w:r>
-      <w:proofErr w:type="spellEnd"/>
-      <w:r>
-        <w:rPr>
-          <w:sz w:val="28"/>
-          <w:szCs w:val="28"/>
-        </w:rPr>
-        <w:t xml:space="preserve"> to save or reach data. We don’t choose </w:t>
-      </w:r>
-      <w:proofErr w:type="gramStart"/>
-      <w:r>
-        <w:rPr>
-          <w:sz w:val="28"/>
-          <w:szCs w:val="28"/>
-        </w:rPr>
-        <w:t>using</w:t>
-      </w:r>
-      <w:proofErr w:type="gramEnd"/>
-      <w:r>
-        <w:rPr>
-          <w:sz w:val="28"/>
-          <w:szCs w:val="28"/>
-        </w:rPr>
-        <w:t xml:space="preserve"> a separate Repository class; instead, we handle database tasks directly in our Service Layer.</w:t>
+        <w:t>Direct Access: Our Service Layer talks directly to Firetore to save or reach data. We don’t choose using a separate Repository class; instead, we handle database tasks directly in our Service Layer.</w:t>
       </w:r>
     </w:p>
     <w:p/>
@@ -5008,7 +3786,7 @@
                     <pic:cNvPicPr preferRelativeResize="0"/>
                   </pic:nvPicPr>
                   <pic:blipFill>
-                    <a:blip r:embed="rId8"/>
+                    <a:blip r:embed="rId9"/>
                     <a:srcRect t="1775"/>
                     <a:stretch>
                       <a:fillRect/>
@@ -5071,7 +3849,7 @@
                     <pic:cNvPicPr preferRelativeResize="0"/>
                   </pic:nvPicPr>
                   <pic:blipFill>
-                    <a:blip r:embed="rId9"/>
+                    <a:blip r:embed="rId10"/>
                     <a:srcRect/>
                     <a:stretch>
                       <a:fillRect/>
@@ -5152,7 +3930,7 @@
                     <pic:cNvPicPr/>
                   </pic:nvPicPr>
                   <pic:blipFill rotWithShape="1">
-                    <a:blip r:embed="rId10">
+                    <a:blip r:embed="rId11">
                       <a:extLst>
                         <a:ext uri="{28A0092B-C50C-407E-A947-70E740481C1C}">
                           <a14:useLocalDpi xmlns:a14="http://schemas.microsoft.com/office/drawing/2010/main" val="0"/>
@@ -5238,7 +4016,7 @@
                     <pic:cNvPicPr preferRelativeResize="0"/>
                   </pic:nvPicPr>
                   <pic:blipFill>
-                    <a:blip r:embed="rId11"/>
+                    <a:blip r:embed="rId12"/>
                     <a:srcRect/>
                     <a:stretch>
                       <a:fillRect/>
@@ -5319,7 +4097,7 @@
                     <pic:cNvPicPr/>
                   </pic:nvPicPr>
                   <pic:blipFill>
-                    <a:blip r:embed="rId12">
+                    <a:blip r:embed="rId13">
                       <a:extLst>
                         <a:ext uri="{28A0092B-C50C-407E-A947-70E740481C1C}">
                           <a14:useLocalDpi xmlns:a14="http://schemas.microsoft.com/office/drawing/2010/main" val="0"/>
@@ -5393,15 +4171,7 @@
         <w:spacing w:line="278" w:lineRule="auto"/>
       </w:pPr>
       <w:r>
-        <w:t xml:space="preserve">UC1 - User </w:t>
-      </w:r>
-      <w:proofErr w:type="gramStart"/>
-      <w:r>
-        <w:t>Registration(</w:t>
-      </w:r>
-      <w:proofErr w:type="gramEnd"/>
-      <w:r>
-        <w:t>Sign Up)</w:t>
+        <w:t>UC1 - User Registration(Sign Up)</w:t>
       </w:r>
     </w:p>
     <w:p>
@@ -5414,15 +4184,7 @@
         <w:spacing w:line="278" w:lineRule="auto"/>
       </w:pPr>
       <w:r>
-        <w:t xml:space="preserve">UC2 - User </w:t>
-      </w:r>
-      <w:proofErr w:type="gramStart"/>
-      <w:r>
-        <w:t>Login(</w:t>
-      </w:r>
-      <w:proofErr w:type="gramEnd"/>
-      <w:r>
-        <w:t>User Authentication)</w:t>
+        <w:t>UC2 - User Login(User Authentication)</w:t>
       </w:r>
     </w:p>
     <w:p>
@@ -5701,64 +4463,27 @@
     </w:p>
     <w:p>
       <w:r>
-        <w:t xml:space="preserve">The interaction pattern is consistent </w:t>
-      </w:r>
-      <w:proofErr w:type="spellStart"/>
-      <w:r>
-        <w:t>through out</w:t>
-      </w:r>
-      <w:proofErr w:type="spellEnd"/>
-      <w:r>
-        <w:t xml:space="preserve"> all the use cases, </w:t>
-      </w:r>
-    </w:p>
-    <w:p>
-      <w:r>
-        <w:t xml:space="preserve">Flutter UI -&gt; </w:t>
-      </w:r>
-      <w:proofErr w:type="gramStart"/>
-      <w:r>
-        <w:t>Provider(</w:t>
-      </w:r>
-      <w:proofErr w:type="gramEnd"/>
+        <w:t xml:space="preserve">The interaction pattern is consistent through out all the use cases, </w:t>
+      </w:r>
+    </w:p>
+    <w:p>
+      <w:r>
+        <w:t>Flutter UI -&gt; Provider(</w:t>
+      </w:r>
       <w:r>
         <w:t>Service Layer</w:t>
       </w:r>
       <w:r>
-        <w:t>) -&gt; Firebase Auth/</w:t>
-      </w:r>
-      <w:proofErr w:type="spellStart"/>
-      <w:r>
-        <w:t>Firestore</w:t>
-      </w:r>
-      <w:proofErr w:type="spellEnd"/>
-      <w:r>
-        <w:t xml:space="preserve"> -&gt; Provider updates state -&gt; UI refreshes</w:t>
-      </w:r>
-    </w:p>
-    <w:p>
-      <w:r>
-        <w:rPr>
-          <w:b/>
-          <w:bCs/>
-        </w:rPr>
-        <w:t xml:space="preserve">UC1 - User </w:t>
-      </w:r>
-      <w:proofErr w:type="gramStart"/>
-      <w:r>
-        <w:rPr>
-          <w:b/>
-          <w:bCs/>
-        </w:rPr>
-        <w:t>Registration(</w:t>
-      </w:r>
-      <w:proofErr w:type="gramEnd"/>
-      <w:r>
-        <w:rPr>
-          <w:b/>
-          <w:bCs/>
-        </w:rPr>
-        <w:t xml:space="preserve">Sign Up): </w:t>
+        <w:t>) -&gt; Firebase Auth/Firestore -&gt; Provider updates state -&gt; UI refreshes</w:t>
+      </w:r>
+    </w:p>
+    <w:p>
+      <w:r>
+        <w:rPr>
+          <w:b/>
+          <w:bCs/>
+        </w:rPr>
+        <w:t xml:space="preserve">UC1 - User Registration(Sign Up): </w:t>
       </w:r>
       <w:r>
         <w:t>Create a new user account</w:t>
@@ -5778,14 +4503,12 @@
         </w:numPr>
         <w:rPr>
           <w:rFonts w:asciiTheme="minorHAnsi" w:hAnsiTheme="minorHAnsi"/>
-          <w:lang w:val="en-US"/>
         </w:rPr>
       </w:pPr>
       <w:r>
         <w:rPr>
           <w:rStyle w:val="Strong"/>
           <w:rFonts w:asciiTheme="minorHAnsi" w:eastAsiaTheme="majorEastAsia" w:hAnsiTheme="minorHAnsi"/>
-          <w:lang w:val="en-US"/>
         </w:rPr>
         <w:t>Flutter UI (Register Screen)</w:t>
       </w:r>
@@ -5793,14 +4516,12 @@
         <w:rPr>
           <w:rStyle w:val="apple-converted-space"/>
           <w:rFonts w:asciiTheme="minorHAnsi" w:eastAsiaTheme="majorEastAsia" w:hAnsiTheme="minorHAnsi"/>
-          <w:lang w:val="en-US"/>
         </w:rPr>
         <w:t> </w:t>
       </w:r>
       <w:r>
         <w:rPr>
           <w:rFonts w:asciiTheme="minorHAnsi" w:hAnsiTheme="minorHAnsi"/>
-          <w:lang w:val="en-US"/>
         </w:rPr>
         <w:t>takes email/username/password.</w:t>
       </w:r>
@@ -5814,14 +4535,12 @@
         </w:numPr>
         <w:rPr>
           <w:rFonts w:asciiTheme="minorHAnsi" w:hAnsiTheme="minorHAnsi"/>
-          <w:lang w:val="en-US"/>
         </w:rPr>
       </w:pPr>
       <w:r>
         <w:rPr>
           <w:rStyle w:val="Strong"/>
           <w:rFonts w:asciiTheme="minorHAnsi" w:eastAsiaTheme="majorEastAsia" w:hAnsiTheme="minorHAnsi"/>
-          <w:lang w:val="en-US"/>
         </w:rPr>
         <w:t>Auth layer (Firebase Auth)</w:t>
       </w:r>
@@ -5829,14 +4548,12 @@
         <w:rPr>
           <w:rStyle w:val="apple-converted-space"/>
           <w:rFonts w:asciiTheme="minorHAnsi" w:eastAsiaTheme="majorEastAsia" w:hAnsiTheme="minorHAnsi"/>
-          <w:lang w:val="en-US"/>
         </w:rPr>
         <w:t> </w:t>
       </w:r>
       <w:r>
         <w:rPr>
           <w:rFonts w:asciiTheme="minorHAnsi" w:hAnsiTheme="minorHAnsi"/>
-          <w:lang w:val="en-US"/>
         </w:rPr>
         <w:t>creates the user credentials.</w:t>
       </w:r>
@@ -5850,79 +4567,39 @@
         </w:numPr>
         <w:rPr>
           <w:rFonts w:asciiTheme="minorHAnsi" w:hAnsiTheme="minorHAnsi"/>
-          <w:lang w:val="en-US"/>
         </w:rPr>
       </w:pPr>
       <w:r>
         <w:rPr>
           <w:rStyle w:val="Strong"/>
           <w:rFonts w:asciiTheme="minorHAnsi" w:eastAsiaTheme="majorEastAsia" w:hAnsiTheme="minorHAnsi"/>
-          <w:lang w:val="en-US"/>
-        </w:rPr>
-        <w:t>Data layer (</w:t>
-      </w:r>
-      <w:proofErr w:type="spellStart"/>
-      <w:r>
-        <w:rPr>
-          <w:rStyle w:val="Strong"/>
-          <w:rFonts w:asciiTheme="minorHAnsi" w:eastAsiaTheme="majorEastAsia" w:hAnsiTheme="minorHAnsi"/>
-          <w:lang w:val="en-US"/>
-        </w:rPr>
-        <w:t>Firestore</w:t>
-      </w:r>
-      <w:proofErr w:type="spellEnd"/>
-      <w:r>
-        <w:rPr>
-          <w:rStyle w:val="Strong"/>
-          <w:rFonts w:asciiTheme="minorHAnsi" w:eastAsiaTheme="majorEastAsia" w:hAnsiTheme="minorHAnsi"/>
-          <w:lang w:val="en-US"/>
-        </w:rPr>
-        <w:t>)</w:t>
+        </w:rPr>
+        <w:t>Data layer (Firestore)</w:t>
       </w:r>
       <w:r>
         <w:rPr>
           <w:rStyle w:val="apple-converted-space"/>
           <w:rFonts w:asciiTheme="minorHAnsi" w:eastAsiaTheme="majorEastAsia" w:hAnsiTheme="minorHAnsi"/>
-          <w:lang w:val="en-US"/>
         </w:rPr>
         <w:t> </w:t>
       </w:r>
       <w:r>
         <w:rPr>
           <w:rFonts w:asciiTheme="minorHAnsi" w:hAnsiTheme="minorHAnsi"/>
-          <w:lang w:val="en-US"/>
-        </w:rPr>
-        <w:t xml:space="preserve">stores user profile document (username, email, </w:t>
-      </w:r>
-      <w:proofErr w:type="spellStart"/>
-      <w:r>
+        </w:rPr>
+        <w:t>stores user profile document (username, email, createdAt).</w:t>
+      </w:r>
+    </w:p>
+    <w:p>
+      <w:pPr>
+        <w:pStyle w:val="NormalWeb"/>
         <w:rPr>
           <w:rFonts w:asciiTheme="minorHAnsi" w:hAnsiTheme="minorHAnsi"/>
-          <w:lang w:val="en-US"/>
-        </w:rPr>
-        <w:t>createdAt</w:t>
-      </w:r>
-      <w:proofErr w:type="spellEnd"/>
+        </w:rPr>
+      </w:pPr>
       <w:r>
         <w:rPr>
           <w:rFonts w:asciiTheme="minorHAnsi" w:hAnsiTheme="minorHAnsi"/>
-          <w:lang w:val="en-US"/>
-        </w:rPr>
-        <w:t>).</w:t>
-      </w:r>
-    </w:p>
-    <w:p>
-      <w:pPr>
-        <w:pStyle w:val="NormalWeb"/>
-        <w:rPr>
-          <w:rFonts w:asciiTheme="minorHAnsi" w:hAnsiTheme="minorHAnsi"/>
-          <w:lang w:val="en-US"/>
-        </w:rPr>
-      </w:pPr>
-      <w:r>
-        <w:rPr>
-          <w:rFonts w:asciiTheme="minorHAnsi" w:hAnsiTheme="minorHAnsi"/>
-          <w:lang w:val="en-US"/>
         </w:rPr>
         <w:t>Data Flow / Interactions:</w:t>
       </w:r>
@@ -5930,7 +4607,6 @@
         <w:rPr>
           <w:rFonts w:asciiTheme="minorHAnsi" w:hAnsiTheme="minorHAnsi"/>
           <w:noProof/>
-          <w:lang w:val="en-US"/>
           <w14:ligatures w14:val="standardContextual"/>
         </w:rPr>
         <w:t xml:space="preserve"> </w:t>
@@ -5939,7 +4615,6 @@
         <w:rPr>
           <w:rFonts w:asciiTheme="minorHAnsi" w:hAnsiTheme="minorHAnsi"/>
           <w:noProof/>
-          <w:lang w:val="en-US"/>
           <w14:ligatures w14:val="standardContextual"/>
         </w:rPr>
         <w:drawing>
@@ -5958,7 +4633,7 @@
                     <pic:cNvPicPr/>
                   </pic:nvPicPr>
                   <pic:blipFill>
-                    <a:blip r:embed="rId13"/>
+                    <a:blip r:embed="rId14"/>
                     <a:stretch>
                       <a:fillRect/>
                     </a:stretch>
@@ -5981,14 +4656,12 @@
       <w:r>
         <w:rPr>
           <w:rFonts w:asciiTheme="minorHAnsi" w:hAnsiTheme="minorHAnsi"/>
-          <w:lang w:val="en-US"/>
         </w:rPr>
         <w:t xml:space="preserve"> </w:t>
       </w:r>
       <w:r>
         <w:rPr>
           <w:rFonts w:asciiTheme="minorHAnsi" w:hAnsiTheme="minorHAnsi"/>
-          <w:lang w:val="en-US"/>
         </w:rPr>
         <w:t>State Changes:</w:t>
       </w:r>
@@ -6002,13 +4675,11 @@
         </w:numPr>
         <w:rPr>
           <w:rFonts w:asciiTheme="minorHAnsi" w:hAnsiTheme="minorHAnsi"/>
-          <w:lang w:val="en-US"/>
         </w:rPr>
       </w:pPr>
       <w:r>
         <w:rPr>
           <w:rFonts w:asciiTheme="minorHAnsi" w:hAnsiTheme="minorHAnsi"/>
-          <w:lang w:val="en-US"/>
         </w:rPr>
         <w:t xml:space="preserve">App State: unauthenticated -&gt; authenticated </w:t>
       </w:r>
@@ -6022,79 +4693,28 @@
         </w:numPr>
         <w:rPr>
           <w:rFonts w:asciiTheme="minorHAnsi" w:hAnsiTheme="minorHAnsi"/>
-          <w:lang w:val="en-US"/>
         </w:rPr>
       </w:pPr>
       <w:r>
         <w:rPr>
           <w:rFonts w:asciiTheme="minorHAnsi" w:hAnsiTheme="minorHAnsi"/>
-          <w:lang w:val="en-US"/>
         </w:rPr>
         <w:t>Database State</w:t>
       </w:r>
       <w:r>
         <w:rPr>
           <w:rFonts w:asciiTheme="minorHAnsi" w:hAnsiTheme="minorHAnsi"/>
-          <w:lang w:val="en-US"/>
-        </w:rPr>
-        <w:t xml:space="preserve">: new document created in </w:t>
-      </w:r>
-      <w:proofErr w:type="gramStart"/>
-      <w:r>
-        <w:rPr>
-          <w:rFonts w:asciiTheme="minorHAnsi" w:hAnsiTheme="minorHAnsi"/>
-          <w:lang w:val="en-US"/>
-        </w:rPr>
-        <w:t>users</w:t>
-      </w:r>
-      <w:proofErr w:type="gramEnd"/>
-      <w:r>
-        <w:rPr>
-          <w:rFonts w:asciiTheme="minorHAnsi" w:hAnsiTheme="minorHAnsi"/>
-          <w:lang w:val="en-US"/>
-        </w:rPr>
-        <w:t xml:space="preserve"> collection for that </w:t>
-      </w:r>
-      <w:proofErr w:type="spellStart"/>
-      <w:r>
-        <w:rPr>
-          <w:rFonts w:asciiTheme="minorHAnsi" w:hAnsiTheme="minorHAnsi"/>
-          <w:lang w:val="en-US"/>
-        </w:rPr>
-        <w:t>uid</w:t>
-      </w:r>
-      <w:proofErr w:type="spellEnd"/>
-      <w:r>
-        <w:rPr>
-          <w:rFonts w:asciiTheme="minorHAnsi" w:hAnsiTheme="minorHAnsi"/>
-          <w:lang w:val="en-US"/>
-        </w:rPr>
-        <w:t>.</w:t>
-      </w:r>
-    </w:p>
-    <w:p>
-      <w:r>
-        <w:rPr>
-          <w:b/>
-          <w:bCs/>
-        </w:rPr>
-        <w:t xml:space="preserve">UC2 - User </w:t>
-      </w:r>
-      <w:proofErr w:type="gramStart"/>
-      <w:r>
-        <w:rPr>
-          <w:b/>
-          <w:bCs/>
-        </w:rPr>
-        <w:t>Login(</w:t>
-      </w:r>
-      <w:proofErr w:type="gramEnd"/>
-      <w:r>
-        <w:rPr>
-          <w:b/>
-          <w:bCs/>
-        </w:rPr>
-        <w:t xml:space="preserve">User Authentication): </w:t>
+        </w:rPr>
+        <w:t>: new document created in users collection for that uid.</w:t>
+      </w:r>
+    </w:p>
+    <w:p>
+      <w:r>
+        <w:rPr>
+          <w:b/>
+          <w:bCs/>
+        </w:rPr>
+        <w:t xml:space="preserve">UC2 - User Login(User Authentication): </w:t>
       </w:r>
       <w:r>
         <w:t>Login with existing credentials</w:t>
@@ -6115,14 +4735,12 @@
         </w:numPr>
         <w:rPr>
           <w:rFonts w:asciiTheme="minorHAnsi" w:hAnsiTheme="minorHAnsi"/>
-          <w:lang w:val="en-US"/>
         </w:rPr>
       </w:pPr>
       <w:r>
         <w:rPr>
           <w:rStyle w:val="Strong"/>
           <w:rFonts w:asciiTheme="minorHAnsi" w:eastAsiaTheme="majorEastAsia" w:hAnsiTheme="minorHAnsi"/>
-          <w:lang w:val="en-US"/>
         </w:rPr>
         <w:t>Flutter UI (Login Screen)</w:t>
       </w:r>
@@ -6130,14 +4748,12 @@
         <w:rPr>
           <w:rStyle w:val="apple-converted-space"/>
           <w:rFonts w:asciiTheme="minorHAnsi" w:eastAsiaTheme="majorEastAsia" w:hAnsiTheme="minorHAnsi"/>
-          <w:lang w:val="en-US"/>
         </w:rPr>
         <w:t> </w:t>
       </w:r>
       <w:r>
         <w:rPr>
           <w:rFonts w:asciiTheme="minorHAnsi" w:hAnsiTheme="minorHAnsi"/>
-          <w:lang w:val="en-US"/>
         </w:rPr>
         <w:t>takes credentials.</w:t>
       </w:r>
@@ -6151,14 +4767,12 @@
         </w:numPr>
         <w:rPr>
           <w:rFonts w:asciiTheme="minorHAnsi" w:hAnsiTheme="minorHAnsi"/>
-          <w:lang w:val="en-US"/>
         </w:rPr>
       </w:pPr>
       <w:r>
         <w:rPr>
           <w:rStyle w:val="Strong"/>
           <w:rFonts w:asciiTheme="minorHAnsi" w:eastAsiaTheme="majorEastAsia" w:hAnsiTheme="minorHAnsi"/>
-          <w:lang w:val="en-US"/>
         </w:rPr>
         <w:t>Firebase Auth</w:t>
       </w:r>
@@ -6166,32 +4780,14 @@
         <w:rPr>
           <w:rStyle w:val="apple-converted-space"/>
           <w:rFonts w:asciiTheme="minorHAnsi" w:eastAsiaTheme="majorEastAsia" w:hAnsiTheme="minorHAnsi"/>
-          <w:lang w:val="en-US"/>
         </w:rPr>
         <w:t> </w:t>
       </w:r>
       <w:r>
         <w:rPr>
           <w:rFonts w:asciiTheme="minorHAnsi" w:hAnsiTheme="minorHAnsi"/>
-          <w:lang w:val="en-US"/>
-        </w:rPr>
-        <w:t xml:space="preserve">verifies username/email and </w:t>
-      </w:r>
-      <w:proofErr w:type="spellStart"/>
-      <w:r>
-        <w:rPr>
-          <w:rFonts w:asciiTheme="minorHAnsi" w:hAnsiTheme="minorHAnsi"/>
-          <w:lang w:val="en-US"/>
-        </w:rPr>
-        <w:t>pasword</w:t>
-      </w:r>
-      <w:proofErr w:type="spellEnd"/>
-      <w:r>
-        <w:rPr>
-          <w:rFonts w:asciiTheme="minorHAnsi" w:hAnsiTheme="minorHAnsi"/>
-          <w:lang w:val="en-US"/>
-        </w:rPr>
-        <w:t>.</w:t>
+        </w:rPr>
+        <w:t>verifies username/email and pasword.</w:t>
       </w:r>
     </w:p>
     <w:p>
@@ -6203,14 +4799,12 @@
         </w:numPr>
         <w:rPr>
           <w:rFonts w:asciiTheme="minorHAnsi" w:hAnsiTheme="minorHAnsi"/>
-          <w:lang w:val="en-US"/>
         </w:rPr>
       </w:pPr>
       <w:r>
         <w:rPr>
           <w:rStyle w:val="Strong"/>
           <w:rFonts w:asciiTheme="minorHAnsi" w:eastAsiaTheme="majorEastAsia" w:hAnsiTheme="minorHAnsi"/>
-          <w:lang w:val="en-US"/>
         </w:rPr>
         <w:t xml:space="preserve">Provider </w:t>
       </w:r>
@@ -6220,7 +4814,6 @@
           <w:rFonts w:asciiTheme="minorHAnsi" w:eastAsiaTheme="majorEastAsia" w:hAnsiTheme="minorHAnsi"/>
           <w:b w:val="0"/>
           <w:bCs w:val="0"/>
-          <w:lang w:val="en-US"/>
         </w:rPr>
         <w:t>updates app authentication state and current user data.</w:t>
       </w:r>
@@ -6230,13 +4823,11 @@
         <w:pStyle w:val="NormalWeb"/>
         <w:rPr>
           <w:rFonts w:asciiTheme="minorHAnsi" w:hAnsiTheme="minorHAnsi"/>
-          <w:lang w:val="en-US"/>
         </w:rPr>
       </w:pPr>
       <w:r>
         <w:rPr>
           <w:rFonts w:asciiTheme="minorHAnsi" w:hAnsiTheme="minorHAnsi"/>
-          <w:lang w:val="en-US"/>
         </w:rPr>
         <w:t>Data Flow / Interactions:</w:t>
       </w:r>
@@ -6244,7 +4835,6 @@
         <w:rPr>
           <w:rFonts w:asciiTheme="minorHAnsi" w:hAnsiTheme="minorHAnsi"/>
           <w:noProof/>
-          <w:lang w:val="en-US"/>
           <w14:ligatures w14:val="standardContextual"/>
         </w:rPr>
         <w:t xml:space="preserve"> </w:t>
@@ -6253,7 +4843,6 @@
         <w:rPr>
           <w:rFonts w:asciiTheme="minorHAnsi" w:hAnsiTheme="minorHAnsi"/>
           <w:noProof/>
-          <w:lang w:val="en-US"/>
           <w14:ligatures w14:val="standardContextual"/>
         </w:rPr>
         <w:drawing>
@@ -6272,7 +4861,7 @@
                     <pic:cNvPicPr/>
                   </pic:nvPicPr>
                   <pic:blipFill>
-                    <a:blip r:embed="rId14"/>
+                    <a:blip r:embed="rId15"/>
                     <a:stretch>
                       <a:fillRect/>
                     </a:stretch>
@@ -6295,14 +4884,12 @@
       <w:r>
         <w:rPr>
           <w:rFonts w:asciiTheme="minorHAnsi" w:hAnsiTheme="minorHAnsi"/>
-          <w:lang w:val="en-US"/>
         </w:rPr>
         <w:t xml:space="preserve"> </w:t>
       </w:r>
       <w:r>
         <w:rPr>
           <w:rFonts w:asciiTheme="minorHAnsi" w:hAnsiTheme="minorHAnsi"/>
-          <w:lang w:val="en-US"/>
         </w:rPr>
         <w:t>State Changes:</w:t>
       </w:r>
@@ -6316,13 +4903,11 @@
         </w:numPr>
         <w:rPr>
           <w:rFonts w:asciiTheme="minorHAnsi" w:hAnsiTheme="minorHAnsi"/>
-          <w:lang w:val="en-US"/>
         </w:rPr>
       </w:pPr>
       <w:r>
         <w:rPr>
           <w:rFonts w:asciiTheme="minorHAnsi" w:hAnsiTheme="minorHAnsi"/>
-          <w:lang w:val="en-US"/>
         </w:rPr>
         <w:t xml:space="preserve">App State: unauthenticated -&gt; authenticated </w:t>
       </w:r>
@@ -6336,46 +4921,32 @@
         </w:numPr>
         <w:rPr>
           <w:rFonts w:asciiTheme="minorHAnsi" w:hAnsiTheme="minorHAnsi"/>
-          <w:lang w:val="en-US"/>
         </w:rPr>
       </w:pPr>
       <w:r>
         <w:rPr>
           <w:rFonts w:asciiTheme="minorHAnsi" w:hAnsiTheme="minorHAnsi"/>
-          <w:lang w:val="en-US"/>
-        </w:rPr>
-        <w:t xml:space="preserve">Local State: Provider stores </w:t>
-      </w:r>
-      <w:proofErr w:type="spellStart"/>
-      <w:r>
-        <w:rPr>
-          <w:rFonts w:asciiTheme="minorHAnsi" w:hAnsiTheme="minorHAnsi"/>
-          <w:lang w:val="en-US"/>
-        </w:rPr>
-        <w:t>c</w:t>
+        </w:rPr>
+        <w:t>Local State: Provider stores c</w:t>
       </w:r>
       <w:r>
         <w:rPr>
           <w:rFonts w:asciiTheme="minorHAnsi" w:hAnsiTheme="minorHAnsi"/>
           <w:i/>
           <w:iCs/>
-          <w:lang w:val="en-US"/>
         </w:rPr>
         <w:t>urrentUser</w:t>
       </w:r>
       <w:r>
         <w:rPr>
           <w:rFonts w:asciiTheme="minorHAnsi" w:hAnsiTheme="minorHAnsi"/>
-          <w:lang w:val="en-US"/>
         </w:rPr>
         <w:t>information</w:t>
       </w:r>
-      <w:proofErr w:type="spellEnd"/>
-      <w:r>
-        <w:rPr>
-          <w:b/>
-          <w:bCs/>
-          <w:lang w:val="en-US"/>
+      <w:r>
+        <w:rPr>
+          <w:b/>
+          <w:bCs/>
         </w:rPr>
         <w:t xml:space="preserve"> </w:t>
       </w:r>
@@ -6386,7 +4957,6 @@
         <w:ind w:left="720"/>
         <w:rPr>
           <w:rFonts w:asciiTheme="minorHAnsi" w:hAnsiTheme="minorHAnsi"/>
-          <w:lang w:val="en-US"/>
         </w:rPr>
       </w:pPr>
     </w:p>
@@ -6395,7 +4965,6 @@
         <w:pStyle w:val="NormalWeb"/>
         <w:rPr>
           <w:rFonts w:asciiTheme="minorHAnsi" w:hAnsiTheme="minorHAnsi"/>
-          <w:lang w:val="en-US"/>
         </w:rPr>
       </w:pPr>
       <w:r>
@@ -6403,14 +4972,12 @@
           <w:rFonts w:asciiTheme="minorHAnsi" w:hAnsiTheme="minorHAnsi"/>
           <w:b/>
           <w:bCs/>
-          <w:lang w:val="en-US"/>
         </w:rPr>
         <w:t xml:space="preserve">UC3 – Daily Survey Submission and Providing Feedback: </w:t>
       </w:r>
       <w:r>
         <w:rPr>
           <w:rFonts w:asciiTheme="minorHAnsi" w:hAnsiTheme="minorHAnsi"/>
-          <w:lang w:val="en-US"/>
         </w:rPr>
         <w:t>Submit answers, compute score, show feedback, store result</w:t>
       </w:r>
@@ -6429,14 +4996,12 @@
         </w:numPr>
         <w:rPr>
           <w:rFonts w:asciiTheme="minorHAnsi" w:hAnsiTheme="minorHAnsi"/>
-          <w:lang w:val="en-US"/>
         </w:rPr>
       </w:pPr>
       <w:r>
         <w:rPr>
           <w:rStyle w:val="Strong"/>
           <w:rFonts w:asciiTheme="minorHAnsi" w:eastAsiaTheme="majorEastAsia" w:hAnsiTheme="minorHAnsi"/>
-          <w:lang w:val="en-US"/>
         </w:rPr>
         <w:t>Flutter UI (Daily Survey Screen)</w:t>
       </w:r>
@@ -6444,14 +5009,12 @@
         <w:rPr>
           <w:rStyle w:val="apple-converted-space"/>
           <w:rFonts w:asciiTheme="minorHAnsi" w:eastAsiaTheme="majorEastAsia" w:hAnsiTheme="minorHAnsi"/>
-          <w:lang w:val="en-US"/>
         </w:rPr>
         <w:t> </w:t>
       </w:r>
       <w:r>
         <w:rPr>
           <w:rFonts w:asciiTheme="minorHAnsi" w:hAnsiTheme="minorHAnsi"/>
-          <w:lang w:val="en-US"/>
         </w:rPr>
         <w:t>collects answers.</w:t>
       </w:r>
@@ -6465,14 +5028,12 @@
         </w:numPr>
         <w:rPr>
           <w:rFonts w:asciiTheme="minorHAnsi" w:hAnsiTheme="minorHAnsi"/>
-          <w:lang w:val="en-US"/>
         </w:rPr>
       </w:pPr>
       <w:r>
         <w:rPr>
           <w:rStyle w:val="Strong"/>
           <w:rFonts w:asciiTheme="minorHAnsi" w:eastAsiaTheme="majorEastAsia" w:hAnsiTheme="minorHAnsi"/>
-          <w:lang w:val="en-US"/>
         </w:rPr>
         <w:t xml:space="preserve">Local Logic </w:t>
       </w:r>
@@ -6482,75 +5043,8 @@
           <w:rFonts w:asciiTheme="minorHAnsi" w:eastAsiaTheme="majorEastAsia" w:hAnsiTheme="minorHAnsi"/>
           <w:b w:val="0"/>
           <w:bCs w:val="0"/>
-          <w:lang w:val="en-US"/>
-        </w:rPr>
-        <w:t xml:space="preserve">computes </w:t>
-      </w:r>
-      <w:proofErr w:type="gramStart"/>
-      <w:r>
-        <w:rPr>
-          <w:rStyle w:val="Strong"/>
-          <w:rFonts w:asciiTheme="minorHAnsi" w:eastAsiaTheme="majorEastAsia" w:hAnsiTheme="minorHAnsi"/>
-          <w:b w:val="0"/>
-          <w:bCs w:val="0"/>
-          <w:lang w:val="en-US"/>
-        </w:rPr>
-        <w:t>score</w:t>
-      </w:r>
-      <w:proofErr w:type="gramEnd"/>
-      <w:r>
-        <w:rPr>
-          <w:rStyle w:val="Strong"/>
-          <w:rFonts w:asciiTheme="minorHAnsi" w:eastAsiaTheme="majorEastAsia" w:hAnsiTheme="minorHAnsi"/>
-          <w:b w:val="0"/>
-          <w:bCs w:val="0"/>
-          <w:lang w:val="en-US"/>
-        </w:rPr>
-        <w:t xml:space="preserve"> and </w:t>
-      </w:r>
-      <w:proofErr w:type="gramStart"/>
-      <w:r>
-        <w:rPr>
-          <w:rStyle w:val="Strong"/>
-          <w:rFonts w:asciiTheme="minorHAnsi" w:eastAsiaTheme="majorEastAsia" w:hAnsiTheme="minorHAnsi"/>
-          <w:b w:val="0"/>
-          <w:bCs w:val="0"/>
-          <w:lang w:val="en-US"/>
-        </w:rPr>
-        <w:t>selects</w:t>
-      </w:r>
-      <w:proofErr w:type="gramEnd"/>
-      <w:r>
-        <w:rPr>
-          <w:rStyle w:val="Strong"/>
-          <w:rFonts w:asciiTheme="minorHAnsi" w:eastAsiaTheme="majorEastAsia" w:hAnsiTheme="minorHAnsi"/>
-          <w:b w:val="0"/>
-          <w:bCs w:val="0"/>
-          <w:lang w:val="en-US"/>
-        </w:rPr>
-        <w:t xml:space="preserve"> feedback </w:t>
-      </w:r>
-      <w:proofErr w:type="gramStart"/>
-      <w:r>
-        <w:rPr>
-          <w:rStyle w:val="Strong"/>
-          <w:rFonts w:asciiTheme="minorHAnsi" w:eastAsiaTheme="majorEastAsia" w:hAnsiTheme="minorHAnsi"/>
-          <w:b w:val="0"/>
-          <w:bCs w:val="0"/>
-          <w:lang w:val="en-US"/>
-        </w:rPr>
-        <w:t>message</w:t>
-      </w:r>
-      <w:proofErr w:type="gramEnd"/>
-      <w:r>
-        <w:rPr>
-          <w:rStyle w:val="Strong"/>
-          <w:rFonts w:asciiTheme="minorHAnsi" w:eastAsiaTheme="majorEastAsia" w:hAnsiTheme="minorHAnsi"/>
-          <w:b w:val="0"/>
-          <w:bCs w:val="0"/>
-          <w:lang w:val="en-US"/>
-        </w:rPr>
-        <w:t xml:space="preserve"> (rule based)</w:t>
+        </w:rPr>
+        <w:t>computes score and selects feedback message (rule based)</w:t>
       </w:r>
     </w:p>
     <w:p>
@@ -6562,26 +5056,14 @@
         </w:numPr>
         <w:rPr>
           <w:rFonts w:asciiTheme="minorHAnsi" w:hAnsiTheme="minorHAnsi"/>
-          <w:lang w:val="en-US"/>
-        </w:rPr>
-      </w:pPr>
-      <w:proofErr w:type="spellStart"/>
+        </w:rPr>
+      </w:pPr>
       <w:r>
         <w:rPr>
           <w:rStyle w:val="Strong"/>
           <w:rFonts w:asciiTheme="minorHAnsi" w:eastAsiaTheme="majorEastAsia" w:hAnsiTheme="minorHAnsi"/>
-          <w:lang w:val="en-US"/>
-        </w:rPr>
-        <w:t>Firestore</w:t>
-      </w:r>
-      <w:proofErr w:type="spellEnd"/>
-      <w:r>
-        <w:rPr>
-          <w:rStyle w:val="Strong"/>
-          <w:rFonts w:asciiTheme="minorHAnsi" w:eastAsiaTheme="majorEastAsia" w:hAnsiTheme="minorHAnsi"/>
-          <w:lang w:val="en-US"/>
-        </w:rPr>
-        <w:t xml:space="preserve"> </w:t>
+        </w:rPr>
+        <w:t xml:space="preserve">Firestore </w:t>
       </w:r>
       <w:r>
         <w:rPr>
@@ -6589,7 +5071,6 @@
           <w:rFonts w:asciiTheme="minorHAnsi" w:eastAsiaTheme="majorEastAsia" w:hAnsiTheme="minorHAnsi"/>
           <w:b w:val="0"/>
           <w:bCs w:val="0"/>
-          <w:lang w:val="en-US"/>
         </w:rPr>
         <w:t>stores survey entry.</w:t>
       </w:r>
@@ -6599,13 +5080,11 @@
         <w:pStyle w:val="NormalWeb"/>
         <w:rPr>
           <w:rFonts w:asciiTheme="minorHAnsi" w:hAnsiTheme="minorHAnsi"/>
-          <w:lang w:val="en-US"/>
         </w:rPr>
       </w:pPr>
       <w:r>
         <w:rPr>
           <w:rFonts w:asciiTheme="minorHAnsi" w:hAnsiTheme="minorHAnsi"/>
-          <w:lang w:val="en-US"/>
         </w:rPr>
         <w:t>Data Flow / Interactions:</w:t>
       </w:r>
@@ -6615,14 +5094,12 @@
         <w:pStyle w:val="NormalWeb"/>
         <w:rPr>
           <w:rFonts w:asciiTheme="minorHAnsi" w:hAnsiTheme="minorHAnsi"/>
-          <w:lang w:val="en-US"/>
         </w:rPr>
       </w:pPr>
       <w:r>
         <w:rPr>
           <w:rFonts w:asciiTheme="minorHAnsi" w:hAnsiTheme="minorHAnsi"/>
           <w:noProof/>
-          <w:lang w:val="en-US"/>
           <w14:ligatures w14:val="standardContextual"/>
         </w:rPr>
         <w:drawing>
@@ -6641,7 +5118,7 @@
                     <pic:cNvPicPr/>
                   </pic:nvPicPr>
                   <pic:blipFill>
-                    <a:blip r:embed="rId15"/>
+                    <a:blip r:embed="rId16"/>
                     <a:stretch>
                       <a:fillRect/>
                     </a:stretch>
@@ -6664,7 +5141,6 @@
       <w:r>
         <w:rPr>
           <w:rFonts w:asciiTheme="minorHAnsi" w:hAnsiTheme="minorHAnsi"/>
-          <w:lang w:val="en-US"/>
         </w:rPr>
         <w:t xml:space="preserve"> </w:t>
       </w:r>
@@ -6674,13 +5150,11 @@
         <w:pStyle w:val="NormalWeb"/>
         <w:rPr>
           <w:rFonts w:asciiTheme="minorHAnsi" w:hAnsiTheme="minorHAnsi"/>
-          <w:lang w:val="en-US"/>
         </w:rPr>
       </w:pPr>
       <w:r>
         <w:rPr>
           <w:rFonts w:asciiTheme="minorHAnsi" w:hAnsiTheme="minorHAnsi"/>
-          <w:lang w:val="en-US"/>
         </w:rPr>
         <w:lastRenderedPageBreak/>
         <w:t>State Changes:</w:t>
@@ -6695,20 +5169,17 @@
         </w:numPr>
         <w:rPr>
           <w:rFonts w:asciiTheme="minorHAnsi" w:hAnsiTheme="minorHAnsi"/>
-          <w:lang w:val="en-US"/>
         </w:rPr>
       </w:pPr>
       <w:r>
         <w:rPr>
           <w:rFonts w:asciiTheme="minorHAnsi" w:hAnsiTheme="minorHAnsi"/>
-          <w:lang w:val="en-US"/>
         </w:rPr>
         <w:t>Database State</w:t>
       </w:r>
       <w:r>
         <w:rPr>
           <w:rFonts w:asciiTheme="minorHAnsi" w:hAnsiTheme="minorHAnsi"/>
-          <w:lang w:val="en-US"/>
         </w:rPr>
         <w:t>: new survey document created under the user</w:t>
       </w:r>
@@ -6722,63 +5193,33 @@
         </w:numPr>
         <w:rPr>
           <w:rFonts w:asciiTheme="minorHAnsi" w:hAnsiTheme="minorHAnsi"/>
-          <w:lang w:val="en-US"/>
         </w:rPr>
       </w:pPr>
       <w:r>
         <w:rPr>
           <w:rFonts w:asciiTheme="minorHAnsi" w:hAnsiTheme="minorHAnsi"/>
-          <w:lang w:val="en-US"/>
-        </w:rPr>
-        <w:t xml:space="preserve">UI State: </w:t>
-      </w:r>
-      <w:proofErr w:type="spellStart"/>
-      <w:r>
+        </w:rPr>
+        <w:t>UI State: surveyNotSubmitted -&gt; surveySubmitted</w:t>
+      </w:r>
+    </w:p>
+    <w:p>
+      <w:pPr>
+        <w:pStyle w:val="NormalWeb"/>
         <w:rPr>
           <w:rFonts w:asciiTheme="minorHAnsi" w:hAnsiTheme="minorHAnsi"/>
-          <w:lang w:val="en-US"/>
-        </w:rPr>
-        <w:t>surveyNotSubmitted</w:t>
-      </w:r>
-      <w:proofErr w:type="spellEnd"/>
+        </w:rPr>
+      </w:pPr>
       <w:r>
         <w:rPr>
           <w:rFonts w:asciiTheme="minorHAnsi" w:hAnsiTheme="minorHAnsi"/>
-          <w:lang w:val="en-US"/>
-        </w:rPr>
-        <w:t xml:space="preserve"> -&gt; </w:t>
-      </w:r>
-      <w:proofErr w:type="spellStart"/>
+          <w:b/>
+          <w:bCs/>
+        </w:rPr>
+        <w:t xml:space="preserve">UC4 – Survey History: </w:t>
+      </w:r>
       <w:r>
         <w:rPr>
           <w:rFonts w:asciiTheme="minorHAnsi" w:hAnsiTheme="minorHAnsi"/>
-          <w:lang w:val="en-US"/>
-        </w:rPr>
-        <w:t>surveySubmitted</w:t>
-      </w:r>
-      <w:proofErr w:type="spellEnd"/>
-    </w:p>
-    <w:p>
-      <w:pPr>
-        <w:pStyle w:val="NormalWeb"/>
-        <w:rPr>
-          <w:rFonts w:asciiTheme="minorHAnsi" w:hAnsiTheme="minorHAnsi"/>
-          <w:lang w:val="en-US"/>
-        </w:rPr>
-      </w:pPr>
-      <w:r>
-        <w:rPr>
-          <w:rFonts w:asciiTheme="minorHAnsi" w:hAnsiTheme="minorHAnsi"/>
-          <w:b/>
-          <w:bCs/>
-          <w:lang w:val="en-US"/>
-        </w:rPr>
-        <w:t xml:space="preserve">UC4 – Survey History: </w:t>
-      </w:r>
-      <w:r>
-        <w:rPr>
-          <w:rFonts w:asciiTheme="minorHAnsi" w:hAnsiTheme="minorHAnsi"/>
-          <w:lang w:val="en-US"/>
         </w:rPr>
         <w:t>Displays previous surveys with date and score</w:t>
       </w:r>
@@ -6797,14 +5238,12 @@
         </w:numPr>
         <w:rPr>
           <w:rFonts w:asciiTheme="minorHAnsi" w:hAnsiTheme="minorHAnsi"/>
-          <w:lang w:val="en-US"/>
         </w:rPr>
       </w:pPr>
       <w:r>
         <w:rPr>
           <w:rStyle w:val="Strong"/>
           <w:rFonts w:asciiTheme="minorHAnsi" w:eastAsiaTheme="majorEastAsia" w:hAnsiTheme="minorHAnsi"/>
-          <w:lang w:val="en-US"/>
         </w:rPr>
         <w:t>History Screen</w:t>
       </w:r>
@@ -6812,14 +5251,12 @@
         <w:rPr>
           <w:rStyle w:val="apple-converted-space"/>
           <w:rFonts w:asciiTheme="minorHAnsi" w:eastAsiaTheme="majorEastAsia" w:hAnsiTheme="minorHAnsi"/>
-          <w:lang w:val="en-US"/>
         </w:rPr>
         <w:t> </w:t>
       </w:r>
       <w:r>
         <w:rPr>
           <w:rFonts w:asciiTheme="minorHAnsi" w:hAnsiTheme="minorHAnsi"/>
-          <w:lang w:val="en-US"/>
         </w:rPr>
         <w:t>requests past survey documents.</w:t>
       </w:r>
@@ -6833,26 +5270,14 @@
         </w:numPr>
         <w:rPr>
           <w:rFonts w:asciiTheme="minorHAnsi" w:hAnsiTheme="minorHAnsi"/>
-          <w:lang w:val="en-US"/>
-        </w:rPr>
-      </w:pPr>
-      <w:proofErr w:type="spellStart"/>
+        </w:rPr>
+      </w:pPr>
       <w:r>
         <w:rPr>
           <w:rStyle w:val="Strong"/>
           <w:rFonts w:asciiTheme="minorHAnsi" w:eastAsiaTheme="majorEastAsia" w:hAnsiTheme="minorHAnsi"/>
-          <w:lang w:val="en-US"/>
-        </w:rPr>
-        <w:t>Firestore</w:t>
-      </w:r>
-      <w:proofErr w:type="spellEnd"/>
-      <w:r>
-        <w:rPr>
-          <w:rStyle w:val="Strong"/>
-          <w:rFonts w:asciiTheme="minorHAnsi" w:eastAsiaTheme="majorEastAsia" w:hAnsiTheme="minorHAnsi"/>
-          <w:lang w:val="en-US"/>
-        </w:rPr>
-        <w:t xml:space="preserve"> query </w:t>
+        </w:rPr>
+        <w:t xml:space="preserve">Firestore query </w:t>
       </w:r>
       <w:r>
         <w:rPr>
@@ -6860,7 +5285,6 @@
           <w:rFonts w:asciiTheme="minorHAnsi" w:eastAsiaTheme="majorEastAsia" w:hAnsiTheme="minorHAnsi"/>
           <w:b w:val="0"/>
           <w:bCs w:val="0"/>
-          <w:lang w:val="en-US"/>
         </w:rPr>
         <w:t>fetches survey entries</w:t>
       </w:r>
@@ -6870,13 +5294,11 @@
         <w:pStyle w:val="NormalWeb"/>
         <w:rPr>
           <w:rFonts w:asciiTheme="minorHAnsi" w:hAnsiTheme="minorHAnsi"/>
-          <w:lang w:val="en-US"/>
         </w:rPr>
       </w:pPr>
       <w:r>
         <w:rPr>
           <w:rFonts w:asciiTheme="minorHAnsi" w:hAnsiTheme="minorHAnsi"/>
-          <w:lang w:val="en-US"/>
         </w:rPr>
         <w:t>Data Flow / Interactions:</w:t>
       </w:r>
@@ -6884,7 +5306,6 @@
         <w:rPr>
           <w:rFonts w:asciiTheme="minorHAnsi" w:hAnsiTheme="minorHAnsi"/>
           <w:noProof/>
-          <w:lang w:val="en-US"/>
           <w14:ligatures w14:val="standardContextual"/>
         </w:rPr>
         <w:t xml:space="preserve"> </w:t>
@@ -6893,7 +5314,6 @@
         <w:rPr>
           <w:rFonts w:asciiTheme="minorHAnsi" w:hAnsiTheme="minorHAnsi"/>
           <w:noProof/>
-          <w:lang w:val="en-US"/>
           <w14:ligatures w14:val="standardContextual"/>
         </w:rPr>
         <w:drawing>
@@ -6912,7 +5332,7 @@
                     <pic:cNvPicPr/>
                   </pic:nvPicPr>
                   <pic:blipFill>
-                    <a:blip r:embed="rId16"/>
+                    <a:blip r:embed="rId17"/>
                     <a:stretch>
                       <a:fillRect/>
                     </a:stretch>
@@ -6935,14 +5355,12 @@
       <w:r>
         <w:rPr>
           <w:rFonts w:asciiTheme="minorHAnsi" w:hAnsiTheme="minorHAnsi"/>
-          <w:lang w:val="en-US"/>
         </w:rPr>
         <w:t xml:space="preserve"> </w:t>
       </w:r>
       <w:r>
         <w:rPr>
           <w:rFonts w:asciiTheme="minorHAnsi" w:hAnsiTheme="minorHAnsi"/>
-          <w:lang w:val="en-US"/>
         </w:rPr>
         <w:t>State Changes:</w:t>
       </w:r>
@@ -6956,20 +5374,17 @@
         </w:numPr>
         <w:rPr>
           <w:rFonts w:asciiTheme="minorHAnsi" w:hAnsiTheme="minorHAnsi"/>
-          <w:lang w:val="en-US"/>
         </w:rPr>
       </w:pPr>
       <w:r>
         <w:rPr>
           <w:rFonts w:asciiTheme="minorHAnsi" w:hAnsiTheme="minorHAnsi"/>
-          <w:lang w:val="en-US"/>
         </w:rPr>
         <w:t xml:space="preserve">Database: </w:t>
       </w:r>
       <w:r>
         <w:rPr>
           <w:rFonts w:asciiTheme="minorHAnsi" w:hAnsiTheme="minorHAnsi"/>
-          <w:lang w:val="en-US"/>
         </w:rPr>
         <w:t>Read Only</w:t>
       </w:r>
@@ -6983,25 +5398,14 @@
         </w:numPr>
         <w:rPr>
           <w:rFonts w:asciiTheme="minorHAnsi" w:hAnsiTheme="minorHAnsi"/>
-          <w:lang w:val="en-US"/>
         </w:rPr>
       </w:pPr>
       <w:r>
         <w:rPr>
           <w:rFonts w:asciiTheme="minorHAnsi" w:hAnsiTheme="minorHAnsi"/>
-          <w:lang w:val="en-US"/>
-        </w:rPr>
-        <w:t xml:space="preserve">Local State: Provider updates </w:t>
-      </w:r>
-      <w:proofErr w:type="spellStart"/>
-      <w:r>
-        <w:rPr>
-          <w:rFonts w:asciiTheme="minorHAnsi" w:hAnsiTheme="minorHAnsi"/>
-          <w:lang w:val="en-US"/>
-        </w:rPr>
-        <w:t>surveyHistoryList</w:t>
-      </w:r>
-      <w:proofErr w:type="spellEnd"/>
+        </w:rPr>
+        <w:t>Local State: Provider updates surveyHistoryList</w:t>
+      </w:r>
     </w:p>
     <w:p>
       <w:pPr>
@@ -7009,13 +5413,11 @@
         <w:ind w:left="360"/>
         <w:rPr>
           <w:rFonts w:asciiTheme="minorHAnsi" w:hAnsiTheme="minorHAnsi"/>
-          <w:lang w:val="en-US"/>
         </w:rPr>
       </w:pPr>
       <w:r>
         <w:rPr>
           <w:rFonts w:asciiTheme="minorHAnsi" w:hAnsiTheme="minorHAnsi"/>
-          <w:lang w:val="en-US"/>
         </w:rPr>
         <w:t>3.4 Demo Requirement:</w:t>
       </w:r>
@@ -9818,13 +8220,8 @@
               <w:ind w:left="0" w:firstLine="0"/>
             </w:pPr>
             <w:r>
-              <w:t xml:space="preserve">Defne </w:t>
+              <w:t>Defne Saracel</w:t>
             </w:r>
-            <w:proofErr w:type="spellStart"/>
-            <w:r>
-              <w:t>Saracel</w:t>
-            </w:r>
-            <w:proofErr w:type="spellEnd"/>
           </w:p>
         </w:tc>
         <w:tc>
@@ -12554,6 +10951,7 @@
   <w:style w:type="character" w:default="1" w:styleId="DefaultParagraphFont">
     <w:name w:val="Default Paragraph Font"/>
     <w:uiPriority w:val="1"/>
+    <w:semiHidden/>
     <w:unhideWhenUsed/>
   </w:style>
   <w:style w:type="table" w:default="1" w:styleId="TableNormal">
@@ -12899,7 +11297,6 @@
       <w:rFonts w:ascii="Times New Roman" w:eastAsia="Times New Roman" w:hAnsi="Times New Roman" w:cs="Times New Roman"/>
       <w:sz w:val="24"/>
       <w:szCs w:val="24"/>
-      <w:lang/>
     </w:rPr>
   </w:style>
   <w:style w:type="character" w:styleId="Strong">
@@ -13214,4 +11611,16 @@
     </a:ext>
   </a:extLst>
 </a:theme>
+</file>
+
+<file path=customXml/item1.xml><?xml version="1.0" encoding="utf-8"?>
+<b:Sources xmlns:b="http://schemas.openxmlformats.org/officeDocument/2006/bibliography" xmlns="http://schemas.openxmlformats.org/officeDocument/2006/bibliography" SelectedStyle="\APASixthEditionOfficeOnline.xsl" StyleName="APA" Version="6"/>
+</file>
+
+<file path=customXml/itemProps1.xml><?xml version="1.0" encoding="utf-8"?>
+<ds:datastoreItem xmlns:ds="http://schemas.openxmlformats.org/officeDocument/2006/customXml" ds:itemID="{F72C5AAC-6791-4F05-B20A-B2DAC4C25F22}">
+  <ds:schemaRefs>
+    <ds:schemaRef ds:uri="http://schemas.openxmlformats.org/officeDocument/2006/bibliography"/>
+  </ds:schemaRefs>
+</ds:datastoreItem>
 </file>
</xml_diff>